<commit_message>
docs: update pool controller docs to match dev branch code
- Version header/footer updated: v2.1.0 → v0.9.0 (main.py), v0.6.0 → v0.8.0 (controller.py)
- Boot sequence diagram: add NTP sync as step 4 (between Network.connect and Controller init)
- Main loop diagram: add daily 03:00 NTP resync line
- Controller loop: remove non-existent _update_runtime() step, renumber steps 1–4
- Software modules table: add ntp.py (NTP with UK DST handling)
- State dict table: remove daily_runtime_sec (never implemented); add last_pump_run,
  last_test_ts, delta_t, time_synced, last_ntp_sync

https://claude.ai/code/session_01Fb4ebYKPrGVaJCvC2aSzs4
</commit_message>
<xml_diff>
--- a/pool controller docs.docx
+++ b/pool controller docs.docx
@@ -48,7 +48,7 @@
         <w:rPr>
           <w:color w:val="555555"/>
         </w:rPr>
-        <w:t>v2.1.0  |</w:t>
+        <w:t>v0.9.0  |</w:t>
       </w:r>
       <w:proofErr w:type="gramEnd"/>
       <w:r>
@@ -139,7 +139,7 @@
                 <w:sz w:val="18"/>
                 <w:szCs w:val="18"/>
               </w:rPr>
-              <w:t xml:space="preserve">main.py </w:t>
+              <w:t>main.py v0.9.0</w:t>
             </w:r>
             <w:r>
               <w:rPr>
@@ -147,7 +147,6 @@
                 <w:sz w:val="16"/>
                 <w:szCs w:val="16"/>
               </w:rPr>
-              <w:t>v2.1.0</w:t>
             </w:r>
           </w:p>
         </w:tc>
@@ -180,7 +179,7 @@
                 <w:sz w:val="18"/>
                 <w:szCs w:val="18"/>
               </w:rPr>
-              <w:t xml:space="preserve">controller.py </w:t>
+              <w:t>controller.py v0.8.0</w:t>
             </w:r>
             <w:r>
               <w:rPr>
@@ -188,7 +187,6 @@
                 <w:sz w:val="16"/>
                 <w:szCs w:val="16"/>
               </w:rPr>
-              <w:t>v0.6.0</w:t>
             </w:r>
           </w:p>
         </w:tc>
@@ -1143,7 +1141,7 @@
               <w:bottom w:val="single" w:sz="1" w:space="0" w:color="CCCCCC"/>
               <w:right w:val="single" w:sz="1" w:space="0" w:color="CCCCCC"/>
             </w:tcBorders>
-            <w:shd w:val="clear" w:color="auto" w:fill="F2F2F2"/>
+            <w:shd w:val="clear" w:color="auto" w:fill="FFFFFF"/>
             <w:tcMar>
               <w:top w:w="80" w:type="dxa"/>
               <w:left w:w="120" w:type="dxa"/>
@@ -1157,7 +1155,7 @@
                 <w:sz w:val="20"/>
                 <w:szCs w:val="20"/>
               </w:rPr>
-              <w:t>state.py</w:t>
+              <w:t xml:space="preserve">ntp.py</w:t>
             </w:r>
           </w:p>
         </w:tc>
@@ -1170,7 +1168,7 @@
               <w:bottom w:val="single" w:sz="1" w:space="0" w:color="CCCCCC"/>
               <w:right w:val="single" w:sz="1" w:space="0" w:color="CCCCCC"/>
             </w:tcBorders>
-            <w:shd w:val="clear" w:color="auto" w:fill="F2F2F2"/>
+            <w:shd w:val="clear" w:color="auto" w:fill="FFFFFF"/>
             <w:tcMar>
               <w:top w:w="80" w:type="dxa"/>
               <w:left w:w="120" w:type="dxa"/>
@@ -1184,23 +1182,7 @@
                 <w:sz w:val="20"/>
                 <w:szCs w:val="20"/>
               </w:rPr>
-              <w:t xml:space="preserve">Single shared </w:t>
-            </w:r>
-            <w:proofErr w:type="spellStart"/>
-            <w:r>
-              <w:rPr>
-                <w:sz w:val="20"/>
-                <w:szCs w:val="20"/>
-              </w:rPr>
-              <w:t>dict</w:t>
-            </w:r>
-            <w:proofErr w:type="spellEnd"/>
-            <w:r>
-              <w:rPr>
-                <w:sz w:val="20"/>
-                <w:szCs w:val="20"/>
-              </w:rPr>
-              <w:t xml:space="preserve"> visible to all modules. Fail-safe defaults.</w:t>
+              <w:t xml:space="preserve">NTP time sync with UK DST handling. Sets the Pico RTC to UK local time at boot and resyncs daily at 03:00.</w:t>
             </w:r>
           </w:p>
         </w:tc>
@@ -1221,7 +1203,7 @@
               <w:bottom w:val="single" w:sz="1" w:space="0" w:color="CCCCCC"/>
               <w:right w:val="single" w:sz="1" w:space="0" w:color="CCCCCC"/>
             </w:tcBorders>
-            <w:shd w:val="clear" w:color="auto" w:fill="FFFFFF"/>
+            <w:shd w:val="clear" w:color="auto" w:fill="F2F2F2"/>
             <w:tcMar>
               <w:top w:w="80" w:type="dxa"/>
               <w:left w:w="120" w:type="dxa"/>
@@ -1235,7 +1217,7 @@
                 <w:sz w:val="20"/>
                 <w:szCs w:val="20"/>
               </w:rPr>
-              <w:t>config.py</w:t>
+              <w:t>state.py</w:t>
             </w:r>
           </w:p>
         </w:tc>
@@ -1248,7 +1230,7 @@
               <w:bottom w:val="single" w:sz="1" w:space="0" w:color="CCCCCC"/>
               <w:right w:val="single" w:sz="1" w:space="0" w:color="CCCCCC"/>
             </w:tcBorders>
-            <w:shd w:val="clear" w:color="auto" w:fill="FFFFFF"/>
+            <w:shd w:val="clear" w:color="auto" w:fill="F2F2F2"/>
             <w:tcMar>
               <w:top w:w="80" w:type="dxa"/>
               <w:left w:w="120" w:type="dxa"/>
@@ -1262,7 +1244,7 @@
                 <w:sz w:val="20"/>
                 <w:szCs w:val="20"/>
               </w:rPr>
-              <w:t xml:space="preserve">All </w:t>
+              <w:t xml:space="preserve">Single shared </w:t>
             </w:r>
             <w:proofErr w:type="spellStart"/>
             <w:r>
@@ -1270,7 +1252,7 @@
                 <w:sz w:val="20"/>
                 <w:szCs w:val="20"/>
               </w:rPr>
-              <w:t>tunable</w:t>
+              <w:t>dict</w:t>
             </w:r>
             <w:proofErr w:type="spellEnd"/>
             <w:r>
@@ -1278,7 +1260,7 @@
                 <w:sz w:val="20"/>
                 <w:szCs w:val="20"/>
               </w:rPr>
-              <w:t xml:space="preserve"> constants and GPIO pin assignments.</w:t>
+              <w:t xml:space="preserve"> visible to all modules. Fail-safe defaults.</w:t>
             </w:r>
           </w:p>
         </w:tc>
@@ -1299,7 +1281,7 @@
               <w:bottom w:val="single" w:sz="1" w:space="0" w:color="CCCCCC"/>
               <w:right w:val="single" w:sz="1" w:space="0" w:color="CCCCCC"/>
             </w:tcBorders>
-            <w:shd w:val="clear" w:color="auto" w:fill="F2F2F2"/>
+            <w:shd w:val="clear" w:color="auto" w:fill="FFFFFF"/>
             <w:tcMar>
               <w:top w:w="80" w:type="dxa"/>
               <w:left w:w="120" w:type="dxa"/>
@@ -1313,7 +1295,7 @@
                 <w:sz w:val="20"/>
                 <w:szCs w:val="20"/>
               </w:rPr>
-              <w:t>controller/controller.py</w:t>
+              <w:t>config.py</w:t>
             </w:r>
           </w:p>
         </w:tc>
@@ -1326,7 +1308,7 @@
               <w:bottom w:val="single" w:sz="1" w:space="0" w:color="CCCCCC"/>
               <w:right w:val="single" w:sz="1" w:space="0" w:color="CCCCCC"/>
             </w:tcBorders>
-            <w:shd w:val="clear" w:color="auto" w:fill="F2F2F2"/>
+            <w:shd w:val="clear" w:color="auto" w:fill="FFFFFF"/>
             <w:tcMar>
               <w:top w:w="80" w:type="dxa"/>
               <w:left w:w="120" w:type="dxa"/>
@@ -1340,7 +1322,23 @@
                 <w:sz w:val="20"/>
                 <w:szCs w:val="20"/>
               </w:rPr>
-              <w:t>Safety chain, solar logic, manual boost, periodic test, MQTT publish.</w:t>
+              <w:t xml:space="preserve">All </w:t>
+            </w:r>
+            <w:proofErr w:type="spellStart"/>
+            <w:r>
+              <w:rPr>
+                <w:sz w:val="20"/>
+                <w:szCs w:val="20"/>
+              </w:rPr>
+              <w:t>tunable</w:t>
+            </w:r>
+            <w:proofErr w:type="spellEnd"/>
+            <w:r>
+              <w:rPr>
+                <w:sz w:val="20"/>
+                <w:szCs w:val="20"/>
+              </w:rPr>
+              <w:t xml:space="preserve"> constants and GPIO pin assignments.</w:t>
             </w:r>
           </w:p>
         </w:tc>
@@ -1361,7 +1359,7 @@
               <w:bottom w:val="single" w:sz="1" w:space="0" w:color="CCCCCC"/>
               <w:right w:val="single" w:sz="1" w:space="0" w:color="CCCCCC"/>
             </w:tcBorders>
-            <w:shd w:val="clear" w:color="auto" w:fill="FFFFFF"/>
+            <w:shd w:val="clear" w:color="auto" w:fill="F2F2F2"/>
             <w:tcMar>
               <w:top w:w="80" w:type="dxa"/>
               <w:left w:w="120" w:type="dxa"/>
@@ -1375,7 +1373,7 @@
                 <w:sz w:val="20"/>
                 <w:szCs w:val="20"/>
               </w:rPr>
-              <w:t>sensors/temperature.py</w:t>
+              <w:t>controller/controller.py</w:t>
             </w:r>
           </w:p>
         </w:tc>
@@ -1388,7 +1386,7 @@
               <w:bottom w:val="single" w:sz="1" w:space="0" w:color="CCCCCC"/>
               <w:right w:val="single" w:sz="1" w:space="0" w:color="CCCCCC"/>
             </w:tcBorders>
-            <w:shd w:val="clear" w:color="auto" w:fill="FFFFFF"/>
+            <w:shd w:val="clear" w:color="auto" w:fill="F2F2F2"/>
             <w:tcMar>
               <w:top w:w="80" w:type="dxa"/>
               <w:left w:w="120" w:type="dxa"/>
@@ -1402,7 +1400,7 @@
                 <w:sz w:val="20"/>
                 <w:szCs w:val="20"/>
               </w:rPr>
-              <w:t>Non-blocking DS18x20 driver. Two-phase convert/read cycle.</w:t>
+              <w:t>Safety chain, solar logic, manual boost, periodic test, MQTT publish.</w:t>
             </w:r>
           </w:p>
         </w:tc>
@@ -1423,7 +1421,7 @@
               <w:bottom w:val="single" w:sz="1" w:space="0" w:color="CCCCCC"/>
               <w:right w:val="single" w:sz="1" w:space="0" w:color="CCCCCC"/>
             </w:tcBorders>
-            <w:shd w:val="clear" w:color="auto" w:fill="F2F2F2"/>
+            <w:shd w:val="clear" w:color="auto" w:fill="FFFFFF"/>
             <w:tcMar>
               <w:top w:w="80" w:type="dxa"/>
               <w:left w:w="120" w:type="dxa"/>
@@ -1437,7 +1435,7 @@
                 <w:sz w:val="20"/>
                 <w:szCs w:val="20"/>
               </w:rPr>
-              <w:t>sensors/water_level.py</w:t>
+              <w:t>sensors/temperature.py</w:t>
             </w:r>
           </w:p>
         </w:tc>
@@ -1450,7 +1448,7 @@
               <w:bottom w:val="single" w:sz="1" w:space="0" w:color="CCCCCC"/>
               <w:right w:val="single" w:sz="1" w:space="0" w:color="CCCCCC"/>
             </w:tcBorders>
-            <w:shd w:val="clear" w:color="auto" w:fill="F2F2F2"/>
+            <w:shd w:val="clear" w:color="auto" w:fill="FFFFFF"/>
             <w:tcMar>
               <w:top w:w="80" w:type="dxa"/>
               <w:left w:w="120" w:type="dxa"/>
@@ -1464,7 +1462,7 @@
                 <w:sz w:val="20"/>
                 <w:szCs w:val="20"/>
               </w:rPr>
-              <w:t>Capacitive sensor with debounce and wet/dry confirmation delays.</w:t>
+              <w:t>Non-blocking DS18x20 driver. Two-phase convert/read cycle.</w:t>
             </w:r>
           </w:p>
         </w:tc>
@@ -1485,7 +1483,7 @@
               <w:bottom w:val="single" w:sz="1" w:space="0" w:color="CCCCCC"/>
               <w:right w:val="single" w:sz="1" w:space="0" w:color="CCCCCC"/>
             </w:tcBorders>
-            <w:shd w:val="clear" w:color="auto" w:fill="FFFFFF"/>
+            <w:shd w:val="clear" w:color="auto" w:fill="F2F2F2"/>
             <w:tcMar>
               <w:top w:w="80" w:type="dxa"/>
               <w:left w:w="120" w:type="dxa"/>
@@ -1499,7 +1497,7 @@
                 <w:sz w:val="20"/>
                 <w:szCs w:val="20"/>
               </w:rPr>
-              <w:t>sensors/button.py</w:t>
+              <w:t>sensors/water_level.py</w:t>
             </w:r>
           </w:p>
         </w:tc>
@@ -1512,7 +1510,7 @@
               <w:bottom w:val="single" w:sz="1" w:space="0" w:color="CCCCCC"/>
               <w:right w:val="single" w:sz="1" w:space="0" w:color="CCCCCC"/>
             </w:tcBorders>
-            <w:shd w:val="clear" w:color="auto" w:fill="FFFFFF"/>
+            <w:shd w:val="clear" w:color="auto" w:fill="F2F2F2"/>
             <w:tcMar>
               <w:top w:w="80" w:type="dxa"/>
               <w:left w:w="120" w:type="dxa"/>
@@ -1526,7 +1524,7 @@
                 <w:sz w:val="20"/>
                 <w:szCs w:val="20"/>
               </w:rPr>
-              <w:t>Debounced edge-detecting button (single-fire per press).</w:t>
+              <w:t>Capacitive sensor with debounce and wet/dry confirmation delays.</w:t>
             </w:r>
           </w:p>
         </w:tc>
@@ -1547,7 +1545,7 @@
               <w:bottom w:val="single" w:sz="1" w:space="0" w:color="CCCCCC"/>
               <w:right w:val="single" w:sz="1" w:space="0" w:color="CCCCCC"/>
             </w:tcBorders>
-            <w:shd w:val="clear" w:color="auto" w:fill="F2F2F2"/>
+            <w:shd w:val="clear" w:color="auto" w:fill="FFFFFF"/>
             <w:tcMar>
               <w:top w:w="80" w:type="dxa"/>
               <w:left w:w="120" w:type="dxa"/>
@@ -1561,7 +1559,7 @@
                 <w:sz w:val="20"/>
                 <w:szCs w:val="20"/>
               </w:rPr>
-              <w:t>network/__init__.py</w:t>
+              <w:t>sensors/button.py</w:t>
             </w:r>
           </w:p>
         </w:tc>
@@ -1574,7 +1572,7 @@
               <w:bottom w:val="single" w:sz="1" w:space="0" w:color="CCCCCC"/>
               <w:right w:val="single" w:sz="1" w:space="0" w:color="CCCCCC"/>
             </w:tcBorders>
-            <w:shd w:val="clear" w:color="auto" w:fill="F2F2F2"/>
+            <w:shd w:val="clear" w:color="auto" w:fill="FFFFFF"/>
             <w:tcMar>
               <w:top w:w="80" w:type="dxa"/>
               <w:left w:w="120" w:type="dxa"/>
@@ -1588,23 +1586,7 @@
                 <w:sz w:val="20"/>
                 <w:szCs w:val="20"/>
               </w:rPr>
-              <w:t xml:space="preserve">Aggregates </w:t>
-            </w:r>
-            <w:proofErr w:type="spellStart"/>
-            <w:r>
-              <w:rPr>
-                <w:sz w:val="20"/>
-                <w:szCs w:val="20"/>
-              </w:rPr>
-              <w:t>WiFi</w:t>
-            </w:r>
-            <w:proofErr w:type="spellEnd"/>
-            <w:r>
-              <w:rPr>
-                <w:sz w:val="20"/>
-                <w:szCs w:val="20"/>
-              </w:rPr>
-              <w:t xml:space="preserve"> + MQTT. Owns watchdog restart callback.</w:t>
+              <w:t>Debounced edge-detecting button (single-fire per press).</w:t>
             </w:r>
           </w:p>
         </w:tc>
@@ -1625,7 +1607,7 @@
               <w:bottom w:val="single" w:sz="1" w:space="0" w:color="CCCCCC"/>
               <w:right w:val="single" w:sz="1" w:space="0" w:color="CCCCCC"/>
             </w:tcBorders>
-            <w:shd w:val="clear" w:color="auto" w:fill="FFFFFF"/>
+            <w:shd w:val="clear" w:color="auto" w:fill="F2F2F2"/>
             <w:tcMar>
               <w:top w:w="80" w:type="dxa"/>
               <w:left w:w="120" w:type="dxa"/>
@@ -1639,7 +1621,7 @@
                 <w:sz w:val="20"/>
                 <w:szCs w:val="20"/>
               </w:rPr>
-              <w:t>network/wifi.py</w:t>
+              <w:t>network/__init__.py</w:t>
             </w:r>
           </w:p>
         </w:tc>
@@ -1652,7 +1634,7 @@
               <w:bottom w:val="single" w:sz="1" w:space="0" w:color="CCCCCC"/>
               <w:right w:val="single" w:sz="1" w:space="0" w:color="CCCCCC"/>
             </w:tcBorders>
-            <w:shd w:val="clear" w:color="auto" w:fill="FFFFFF"/>
+            <w:shd w:val="clear" w:color="auto" w:fill="F2F2F2"/>
             <w:tcMar>
               <w:top w:w="80" w:type="dxa"/>
               <w:left w:w="120" w:type="dxa"/>
@@ -1666,7 +1648,7 @@
                 <w:sz w:val="20"/>
                 <w:szCs w:val="20"/>
               </w:rPr>
-              <w:t xml:space="preserve">Non-blocking </w:t>
+              <w:t xml:space="preserve">Aggregates </w:t>
             </w:r>
             <w:proofErr w:type="spellStart"/>
             <w:r>
@@ -1682,23 +1664,7 @@
                 <w:sz w:val="20"/>
                 <w:szCs w:val="20"/>
               </w:rPr>
-              <w:t xml:space="preserve"> keepalive. Blocking </w:t>
-            </w:r>
-            <w:proofErr w:type="gramStart"/>
-            <w:r>
-              <w:rPr>
-                <w:sz w:val="20"/>
-                <w:szCs w:val="20"/>
-              </w:rPr>
-              <w:t>connect</w:t>
-            </w:r>
-            <w:proofErr w:type="gramEnd"/>
-            <w:r>
-              <w:rPr>
-                <w:sz w:val="20"/>
-                <w:szCs w:val="20"/>
-              </w:rPr>
-              <w:t xml:space="preserve"> at boot only.</w:t>
+              <w:t xml:space="preserve"> + MQTT. Owns watchdog restart callback.</w:t>
             </w:r>
           </w:p>
         </w:tc>
@@ -1719,7 +1685,7 @@
               <w:bottom w:val="single" w:sz="1" w:space="0" w:color="CCCCCC"/>
               <w:right w:val="single" w:sz="1" w:space="0" w:color="CCCCCC"/>
             </w:tcBorders>
-            <w:shd w:val="clear" w:color="auto" w:fill="F2F2F2"/>
+            <w:shd w:val="clear" w:color="auto" w:fill="FFFFFF"/>
             <w:tcMar>
               <w:top w:w="80" w:type="dxa"/>
               <w:left w:w="120" w:type="dxa"/>
@@ -1733,8 +1699,7 @@
                 <w:sz w:val="20"/>
                 <w:szCs w:val="20"/>
               </w:rPr>
-              <w:lastRenderedPageBreak/>
-              <w:t>network/mqtt.py</w:t>
+              <w:t>network/wifi.py</w:t>
             </w:r>
           </w:p>
         </w:tc>
@@ -1747,7 +1712,7 @@
               <w:bottom w:val="single" w:sz="1" w:space="0" w:color="CCCCCC"/>
               <w:right w:val="single" w:sz="1" w:space="0" w:color="CCCCCC"/>
             </w:tcBorders>
-            <w:shd w:val="clear" w:color="auto" w:fill="F2F2F2"/>
+            <w:shd w:val="clear" w:color="auto" w:fill="FFFFFF"/>
             <w:tcMar>
               <w:top w:w="80" w:type="dxa"/>
               <w:left w:w="120" w:type="dxa"/>
@@ -1761,7 +1726,39 @@
                 <w:sz w:val="20"/>
                 <w:szCs w:val="20"/>
               </w:rPr>
-              <w:t>Publish/subscribe with rate limiting, bounded queue, watchdog.</w:t>
+              <w:t xml:space="preserve">Non-blocking </w:t>
+            </w:r>
+            <w:proofErr w:type="spellStart"/>
+            <w:r>
+              <w:rPr>
+                <w:sz w:val="20"/>
+                <w:szCs w:val="20"/>
+              </w:rPr>
+              <w:t>WiFi</w:t>
+            </w:r>
+            <w:proofErr w:type="spellEnd"/>
+            <w:r>
+              <w:rPr>
+                <w:sz w:val="20"/>
+                <w:szCs w:val="20"/>
+              </w:rPr>
+              <w:t xml:space="preserve"> keepalive. Blocking </w:t>
+            </w:r>
+            <w:proofErr w:type="gramStart"/>
+            <w:r>
+              <w:rPr>
+                <w:sz w:val="20"/>
+                <w:szCs w:val="20"/>
+              </w:rPr>
+              <w:t>connect</w:t>
+            </w:r>
+            <w:proofErr w:type="gramEnd"/>
+            <w:r>
+              <w:rPr>
+                <w:sz w:val="20"/>
+                <w:szCs w:val="20"/>
+              </w:rPr>
+              <w:t xml:space="preserve"> at boot only.</w:t>
             </w:r>
           </w:p>
         </w:tc>
@@ -1782,7 +1779,7 @@
               <w:bottom w:val="single" w:sz="1" w:space="0" w:color="CCCCCC"/>
               <w:right w:val="single" w:sz="1" w:space="0" w:color="CCCCCC"/>
             </w:tcBorders>
-            <w:shd w:val="clear" w:color="auto" w:fill="FFFFFF"/>
+            <w:shd w:val="clear" w:color="auto" w:fill="F2F2F2"/>
             <w:tcMar>
               <w:top w:w="80" w:type="dxa"/>
               <w:left w:w="120" w:type="dxa"/>
@@ -1796,7 +1793,8 @@
                 <w:sz w:val="20"/>
                 <w:szCs w:val="20"/>
               </w:rPr>
-              <w:t>network/feeds.py</w:t>
+              <w:lastRenderedPageBreak/>
+              <w:t>network/mqtt.py</w:t>
             </w:r>
           </w:p>
         </w:tc>
@@ -1809,7 +1807,7 @@
               <w:bottom w:val="single" w:sz="1" w:space="0" w:color="CCCCCC"/>
               <w:right w:val="single" w:sz="1" w:space="0" w:color="CCCCCC"/>
             </w:tcBorders>
-            <w:shd w:val="clear" w:color="auto" w:fill="FFFFFF"/>
+            <w:shd w:val="clear" w:color="auto" w:fill="F2F2F2"/>
             <w:tcMar>
               <w:top w:w="80" w:type="dxa"/>
               <w:left w:w="120" w:type="dxa"/>
@@ -1823,7 +1821,7 @@
                 <w:sz w:val="20"/>
                 <w:szCs w:val="20"/>
               </w:rPr>
-              <w:t>Single source of truth for all Adafruit IO topic strings.</w:t>
+              <w:t>Publish/subscribe with rate limiting, bounded queue, watchdog.</w:t>
             </w:r>
           </w:p>
         </w:tc>
@@ -1844,7 +1842,7 @@
               <w:bottom w:val="single" w:sz="1" w:space="0" w:color="CCCCCC"/>
               <w:right w:val="single" w:sz="1" w:space="0" w:color="CCCCCC"/>
             </w:tcBorders>
-            <w:shd w:val="clear" w:color="auto" w:fill="F2F2F2"/>
+            <w:shd w:val="clear" w:color="auto" w:fill="FFFFFF"/>
             <w:tcMar>
               <w:top w:w="80" w:type="dxa"/>
               <w:left w:w="120" w:type="dxa"/>
@@ -1858,7 +1856,7 @@
                 <w:sz w:val="20"/>
                 <w:szCs w:val="20"/>
               </w:rPr>
-              <w:t>status_led.py</w:t>
+              <w:t>network/feeds.py</w:t>
             </w:r>
           </w:p>
         </w:tc>
@@ -1871,7 +1869,7 @@
               <w:bottom w:val="single" w:sz="1" w:space="0" w:color="CCCCCC"/>
               <w:right w:val="single" w:sz="1" w:space="0" w:color="CCCCCC"/>
             </w:tcBorders>
-            <w:shd w:val="clear" w:color="auto" w:fill="F2F2F2"/>
+            <w:shd w:val="clear" w:color="auto" w:fill="FFFFFF"/>
             <w:tcMar>
               <w:top w:w="80" w:type="dxa"/>
               <w:left w:w="120" w:type="dxa"/>
@@ -1885,7 +1883,7 @@
                 <w:sz w:val="20"/>
                 <w:szCs w:val="20"/>
               </w:rPr>
-              <w:t>Non-blocking LED pattern driver. Priority-based pattern selection.</w:t>
+              <w:t>Single source of truth for all Adafruit IO topic strings.</w:t>
             </w:r>
           </w:p>
         </w:tc>
@@ -1906,7 +1904,7 @@
               <w:bottom w:val="single" w:sz="1" w:space="0" w:color="CCCCCC"/>
               <w:right w:val="single" w:sz="1" w:space="0" w:color="CCCCCC"/>
             </w:tcBorders>
-            <w:shd w:val="clear" w:color="auto" w:fill="FFFFFF"/>
+            <w:shd w:val="clear" w:color="auto" w:fill="F2F2F2"/>
             <w:tcMar>
               <w:top w:w="80" w:type="dxa"/>
               <w:left w:w="120" w:type="dxa"/>
@@ -1920,7 +1918,7 @@
                 <w:sz w:val="20"/>
                 <w:szCs w:val="20"/>
               </w:rPr>
-              <w:t>ota.py</w:t>
+              <w:t>status_led.py</w:t>
             </w:r>
           </w:p>
         </w:tc>
@@ -1933,7 +1931,7 @@
               <w:bottom w:val="single" w:sz="1" w:space="0" w:color="CCCCCC"/>
               <w:right w:val="single" w:sz="1" w:space="0" w:color="CCCCCC"/>
             </w:tcBorders>
-            <w:shd w:val="clear" w:color="auto" w:fill="FFFFFF"/>
+            <w:shd w:val="clear" w:color="auto" w:fill="F2F2F2"/>
             <w:tcMar>
               <w:top w:w="80" w:type="dxa"/>
               <w:left w:w="120" w:type="dxa"/>
@@ -1947,7 +1945,7 @@
                 <w:sz w:val="20"/>
                 <w:szCs w:val="20"/>
               </w:rPr>
-              <w:t>OTA update manager. All-or-nothing apply with boot-time rollback.</w:t>
+              <w:t>Non-blocking LED pattern driver. Priority-based pattern selection.</w:t>
             </w:r>
           </w:p>
         </w:tc>
@@ -1968,6 +1966,68 @@
               <w:bottom w:val="single" w:sz="1" w:space="0" w:color="CCCCCC"/>
               <w:right w:val="single" w:sz="1" w:space="0" w:color="CCCCCC"/>
             </w:tcBorders>
+            <w:shd w:val="clear" w:color="auto" w:fill="FFFFFF"/>
+            <w:tcMar>
+              <w:top w:w="80" w:type="dxa"/>
+              <w:left w:w="120" w:type="dxa"/>
+              <w:bottom w:w="80" w:type="dxa"/>
+              <w:right w:w="120" w:type="dxa"/>
+            </w:tcMar>
+          </w:tcPr>
+          <w:p>
+            <w:r>
+              <w:rPr>
+                <w:sz w:val="20"/>
+                <w:szCs w:val="20"/>
+              </w:rPr>
+              <w:t>ota.py</w:t>
+            </w:r>
+          </w:p>
+        </w:tc>
+        <w:tc>
+          <w:tcPr>
+            <w:tcW w:w="6240" w:type="dxa"/>
+            <w:tcBorders>
+              <w:top w:val="single" w:sz="1" w:space="0" w:color="CCCCCC"/>
+              <w:left w:val="single" w:sz="1" w:space="0" w:color="CCCCCC"/>
+              <w:bottom w:val="single" w:sz="1" w:space="0" w:color="CCCCCC"/>
+              <w:right w:val="single" w:sz="1" w:space="0" w:color="CCCCCC"/>
+            </w:tcBorders>
+            <w:shd w:val="clear" w:color="auto" w:fill="FFFFFF"/>
+            <w:tcMar>
+              <w:top w:w="80" w:type="dxa"/>
+              <w:left w:w="120" w:type="dxa"/>
+              <w:bottom w:w="80" w:type="dxa"/>
+              <w:right w:w="120" w:type="dxa"/>
+            </w:tcMar>
+          </w:tcPr>
+          <w:p>
+            <w:r>
+              <w:rPr>
+                <w:sz w:val="20"/>
+                <w:szCs w:val="20"/>
+              </w:rPr>
+              <w:t>OTA update manager. All-or-nothing apply with boot-time rollback.</w:t>
+            </w:r>
+          </w:p>
+        </w:tc>
+      </w:tr>
+      <w:tr>
+        <w:tblPrEx>
+          <w:tblCellMar>
+            <w:top w:w="0" w:type="dxa"/>
+            <w:bottom w:w="0" w:type="dxa"/>
+          </w:tblCellMar>
+        </w:tblPrEx>
+        <w:tc>
+          <w:tcPr>
+            <w:tcW w:w="3120" w:type="dxa"/>
+            <w:tcBorders>
+              <w:top w:val="single" w:sz="1" w:space="0" w:color="CCCCCC"/>
+              <w:left w:val="single" w:sz="1" w:space="0" w:color="CCCCCC"/>
+              <w:bottom w:val="single" w:sz="1" w:space="0" w:color="CCCCCC"/>
+              <w:right w:val="single" w:sz="1" w:space="0" w:color="CCCCCC"/>
+            </w:tcBorders>
             <w:shd w:val="clear" w:color="auto" w:fill="F2F2F2"/>
             <w:tcMar>
               <w:top w:w="80" w:type="dxa"/>
@@ -2359,7 +2419,7 @@
           <w:sz w:val="18"/>
           <w:szCs w:val="18"/>
         </w:rPr>
-        <w:t xml:space="preserve">  </w:t>
+        <w:t xml:space="preserve">  │  4. NTP sync  (after WiFi, sets UK local time)       │</w:t>
       </w:r>
       <w:proofErr w:type="gramStart"/>
       <w:r>
@@ -2369,7 +2429,7 @@
           <w:sz w:val="18"/>
           <w:szCs w:val="18"/>
         </w:rPr>
-        <w:t>│  4</w:t>
+        <w:t/>
       </w:r>
       <w:proofErr w:type="gramEnd"/>
       <w:r>
@@ -2379,7 +2439,7 @@
           <w:sz w:val="18"/>
           <w:szCs w:val="18"/>
         </w:rPr>
-        <w:t xml:space="preserve">. Controller </w:t>
+        <w:t xml:space="preserve"/>
       </w:r>
       <w:proofErr w:type="spellStart"/>
       <w:r>
@@ -2389,17 +2449,48 @@
           <w:sz w:val="18"/>
           <w:szCs w:val="18"/>
         </w:rPr>
-        <w:t>init</w:t>
+        <w:t/>
       </w:r>
       <w:proofErr w:type="spellEnd"/>
-      <w:r>
-        <w:rPr>
-          <w:rFonts w:ascii="Courier New" w:eastAsia="Courier New" w:hAnsi="Courier New" w:cs="Courier New"/>
-          <w:color w:val="333333"/>
-          <w:sz w:val="18"/>
-          <w:szCs w:val="18"/>
-        </w:rPr>
-        <w:t xml:space="preserve">                                 │</w:t>
+      <w:proofErr w:type="gramStart"/>
+      <w:r>
+        <w:rPr>
+          <w:rFonts w:ascii="Courier New" w:eastAsia="Courier New" w:hAnsi="Courier New" w:cs="Courier New"/>
+          <w:color w:val="333333"/>
+          <w:sz w:val="18"/>
+          <w:szCs w:val="18"/>
+        </w:rPr>
+        <w:t/>
+      </w:r>
+      <w:proofErr w:type="gramEnd"/>
+      <w:r>
+        <w:rPr>
+          <w:rFonts w:ascii="Courier New" w:eastAsia="Courier New" w:hAnsi="Courier New" w:cs="Courier New"/>
+          <w:color w:val="333333"/>
+          <w:sz w:val="18"/>
+          <w:szCs w:val="18"/>
+        </w:rPr>
+        <w:t xml:space="preserve"/>
+      </w:r>
+      <w:proofErr w:type="gramStart"/>
+      <w:r>
+        <w:rPr>
+          <w:rFonts w:ascii="Courier New" w:eastAsia="Courier New" w:hAnsi="Courier New" w:cs="Courier New"/>
+          <w:color w:val="333333"/>
+          <w:sz w:val="18"/>
+          <w:szCs w:val="18"/>
+        </w:rPr>
+        <w:t xml:space="preserve"/>
+      </w:r>
+      <w:proofErr w:type="gramEnd"/>
+      <w:r>
+        <w:rPr>
+          <w:rFonts w:ascii="Courier New" w:eastAsia="Courier New" w:hAnsi="Courier New" w:cs="Courier New"/>
+          <w:color w:val="333333"/>
+          <w:sz w:val="18"/>
+          <w:szCs w:val="18"/>
+        </w:rPr>
+        <w:t xml:space="preserve"/>
       </w:r>
     </w:p>
     <w:p>
@@ -2415,7 +2506,43 @@
           <w:sz w:val="18"/>
           <w:szCs w:val="18"/>
         </w:rPr>
-        <w:t xml:space="preserve">  └──────────────────────┬──────────────────────────────┘</w:t>
+        <w:t xml:space="preserve">  │  5. Controller init                                 │</w:t>
+      </w:r>
+      <w:proofErr w:type="gramStart"/>
+      <w:r>
+        <w:rPr>
+          <w:rFonts w:ascii="Courier New" w:eastAsia="Courier New" w:hAnsi="Courier New" w:cs="Courier New"/>
+          <w:color w:val="333333"/>
+          <w:sz w:val="18"/>
+          <w:szCs w:val="18"/>
+        </w:rPr>
+      </w:r>
+      <w:proofErr w:type="gramEnd"/>
+      <w:r>
+        <w:rPr>
+          <w:rFonts w:ascii="Courier New" w:eastAsia="Courier New" w:hAnsi="Courier New" w:cs="Courier New"/>
+          <w:color w:val="333333"/>
+          <w:sz w:val="18"/>
+          <w:szCs w:val="18"/>
+        </w:rPr>
+      </w:r>
+      <w:proofErr w:type="spellStart"/>
+      <w:r>
+        <w:rPr>
+          <w:rFonts w:ascii="Courier New" w:eastAsia="Courier New" w:hAnsi="Courier New" w:cs="Courier New"/>
+          <w:color w:val="333333"/>
+          <w:sz w:val="18"/>
+          <w:szCs w:val="18"/>
+        </w:rPr>
+      </w:r>
+      <w:proofErr w:type="spellEnd"/>
+      <w:r>
+        <w:rPr>
+          <w:rFonts w:ascii="Courier New" w:eastAsia="Courier New" w:hAnsi="Courier New" w:cs="Courier New"/>
+          <w:color w:val="333333"/>
+          <w:sz w:val="18"/>
+          <w:szCs w:val="18"/>
+        </w:rPr>
       </w:r>
     </w:p>
     <w:p>
@@ -2431,7 +2558,7 @@
           <w:sz w:val="18"/>
           <w:szCs w:val="18"/>
         </w:rPr>
-        <w:t xml:space="preserve">                         │</w:t>
+        <w:t xml:space="preserve">  └──────────────────────┬──────────────────────────────┘</w:t>
       </w:r>
     </w:p>
     <w:p>
@@ -2447,7 +2574,7 @@
           <w:sz w:val="18"/>
           <w:szCs w:val="18"/>
         </w:rPr>
-        <w:t xml:space="preserve">  ┌──────────────────────▼──────────────────────────────┐</w:t>
+        <w:t xml:space="preserve">                         │</w:t>
       </w:r>
     </w:p>
     <w:p>
@@ -2463,27 +2590,7 @@
           <w:sz w:val="18"/>
           <w:szCs w:val="18"/>
         </w:rPr>
-        <w:t xml:space="preserve">  │                  MAIN LOOP (while </w:t>
-      </w:r>
-      <w:proofErr w:type="gramStart"/>
-      <w:r>
-        <w:rPr>
-          <w:rFonts w:ascii="Courier New" w:eastAsia="Courier New" w:hAnsi="Courier New" w:cs="Courier New"/>
-          <w:color w:val="333333"/>
-          <w:sz w:val="18"/>
-          <w:szCs w:val="18"/>
-        </w:rPr>
-        <w:t xml:space="preserve">True)   </w:t>
-      </w:r>
-      <w:proofErr w:type="gramEnd"/>
-      <w:r>
-        <w:rPr>
-          <w:rFonts w:ascii="Courier New" w:eastAsia="Courier New" w:hAnsi="Courier New" w:cs="Courier New"/>
-          <w:color w:val="333333"/>
-          <w:sz w:val="18"/>
-          <w:szCs w:val="18"/>
-        </w:rPr>
-        <w:t xml:space="preserve">          │</w:t>
+        <w:t xml:space="preserve">  ┌──────────────────────▼──────────────────────────────┐</w:t>
       </w:r>
     </w:p>
     <w:p>
@@ -2499,7 +2606,27 @@
           <w:sz w:val="18"/>
           <w:szCs w:val="18"/>
         </w:rPr>
-        <w:t xml:space="preserve">  │                                                     │</w:t>
+        <w:t xml:space="preserve">  │                  MAIN LOOP (while </w:t>
+      </w:r>
+      <w:proofErr w:type="gramStart"/>
+      <w:r>
+        <w:rPr>
+          <w:rFonts w:ascii="Courier New" w:eastAsia="Courier New" w:hAnsi="Courier New" w:cs="Courier New"/>
+          <w:color w:val="333333"/>
+          <w:sz w:val="18"/>
+          <w:szCs w:val="18"/>
+        </w:rPr>
+        <w:t xml:space="preserve">True)   </w:t>
+      </w:r>
+      <w:proofErr w:type="gramEnd"/>
+      <w:r>
+        <w:rPr>
+          <w:rFonts w:ascii="Courier New" w:eastAsia="Courier New" w:hAnsi="Courier New" w:cs="Courier New"/>
+          <w:color w:val="333333"/>
+          <w:sz w:val="18"/>
+          <w:szCs w:val="18"/>
+        </w:rPr>
+        <w:t xml:space="preserve">          │</w:t>
       </w:r>
     </w:p>
     <w:p>
@@ -2515,27 +2642,7 @@
           <w:sz w:val="18"/>
           <w:szCs w:val="18"/>
         </w:rPr>
-        <w:t xml:space="preserve">  </w:t>
-      </w:r>
-      <w:proofErr w:type="gramStart"/>
-      <w:r>
-        <w:rPr>
-          <w:rFonts w:ascii="Courier New" w:eastAsia="Courier New" w:hAnsi="Courier New" w:cs="Courier New"/>
-          <w:color w:val="333333"/>
-          <w:sz w:val="18"/>
-          <w:szCs w:val="18"/>
-        </w:rPr>
-        <w:t>│  Every</w:t>
-      </w:r>
-      <w:proofErr w:type="gramEnd"/>
-      <w:r>
-        <w:rPr>
-          <w:rFonts w:ascii="Courier New" w:eastAsia="Courier New" w:hAnsi="Courier New" w:cs="Courier New"/>
-          <w:color w:val="333333"/>
-          <w:sz w:val="18"/>
-          <w:szCs w:val="18"/>
-        </w:rPr>
-        <w:t xml:space="preserve"> 2 s ──► Read temperature sensors             │</w:t>
+        <w:t xml:space="preserve">  │                                                     │</w:t>
       </w:r>
     </w:p>
     <w:p>
@@ -2551,7 +2658,27 @@
           <w:sz w:val="18"/>
           <w:szCs w:val="18"/>
         </w:rPr>
-        <w:t xml:space="preserve">  │            ──► Read water level sensor              │</w:t>
+        <w:t xml:space="preserve">  </w:t>
+      </w:r>
+      <w:proofErr w:type="gramStart"/>
+      <w:r>
+        <w:rPr>
+          <w:rFonts w:ascii="Courier New" w:eastAsia="Courier New" w:hAnsi="Courier New" w:cs="Courier New"/>
+          <w:color w:val="333333"/>
+          <w:sz w:val="18"/>
+          <w:szCs w:val="18"/>
+        </w:rPr>
+        <w:t>│  Every</w:t>
+      </w:r>
+      <w:proofErr w:type="gramEnd"/>
+      <w:r>
+        <w:rPr>
+          <w:rFonts w:ascii="Courier New" w:eastAsia="Courier New" w:hAnsi="Courier New" w:cs="Courier New"/>
+          <w:color w:val="333333"/>
+          <w:sz w:val="18"/>
+          <w:szCs w:val="18"/>
+        </w:rPr>
+        <w:t xml:space="preserve"> 2 s ──► Read temperature sensors             │</w:t>
       </w:r>
     </w:p>
     <w:p>
@@ -2567,7 +2694,55 @@
           <w:sz w:val="18"/>
           <w:szCs w:val="18"/>
         </w:rPr>
+        <w:t xml:space="preserve">  │            ──► Read water level sensor              │</w:t>
+      </w:r>
+    </w:p>
+    <w:p>
+      <w:pPr>
+        <w:shd w:val="clear" w:color="auto" w:fill="F5F5F5"/>
+        <w:spacing w:before="40" w:after="40"/>
+        <w:ind w:left="360"/>
+      </w:pPr>
+      <w:r>
+        <w:rPr>
+          <w:rFonts w:ascii="Courier New" w:eastAsia="Courier New" w:hAnsi="Courier New" w:cs="Courier New"/>
+          <w:color w:val="333333"/>
+          <w:sz w:val="18"/>
+          <w:szCs w:val="18"/>
+        </w:rPr>
         <w:t xml:space="preserve">  │                                                     │</w:t>
+      </w:r>
+    </w:p>
+    <w:p>
+      <w:pPr>
+        <w:shd w:val="clear" w:color="auto" w:fill="F5F5F5"/>
+        <w:spacing w:before="40" w:after="40"/>
+        <w:ind w:left="360"/>
+      </w:pPr>
+      <w:r>
+        <w:rPr>
+          <w:rFonts w:ascii="Courier New" w:eastAsia="Courier New" w:hAnsi="Courier New" w:cs="Courier New"/>
+          <w:color w:val="333333"/>
+          <w:sz w:val="18"/>
+          <w:szCs w:val="18"/>
+        </w:rPr>
+        <w:t xml:space="preserve">  │                                                     │</w:t>
+      </w:r>
+    </w:p>
+    <w:p>
+      <w:pPr>
+        <w:shd w:val="clear" w:color="auto" w:fill="F5F5F5"/>
+        <w:spacing w:before="40" w:after="40"/>
+        <w:ind w:left="360"/>
+      </w:pPr>
+      <w:r>
+        <w:rPr>
+          <w:rFonts w:ascii="Courier New" w:eastAsia="Courier New" w:hAnsi="Courier New" w:cs="Courier New"/>
+          <w:color w:val="333333"/>
+          <w:sz w:val="18"/>
+          <w:szCs w:val="18"/>
+        </w:rPr>
+        <w:t xml:space="preserve">  │  Daily 03:00 ► NTP resync  (keeps RTC accurate)     │</w:t>
       </w:r>
     </w:p>
     <w:p>
@@ -3182,47 +3357,7 @@
           <w:sz w:val="18"/>
           <w:szCs w:val="18"/>
         </w:rPr>
-        <w:t xml:space="preserve">  ├─1─ _</w:t>
-      </w:r>
-      <w:proofErr w:type="spellStart"/>
-      <w:r>
-        <w:rPr>
-          <w:rFonts w:ascii="Courier New" w:eastAsia="Courier New" w:hAnsi="Courier New" w:cs="Courier New"/>
-          <w:color w:val="333333"/>
-          <w:sz w:val="18"/>
-          <w:szCs w:val="18"/>
-        </w:rPr>
-        <w:t>update_</w:t>
-      </w:r>
-      <w:proofErr w:type="gramStart"/>
-      <w:r>
-        <w:rPr>
-          <w:rFonts w:ascii="Courier New" w:eastAsia="Courier New" w:hAnsi="Courier New" w:cs="Courier New"/>
-          <w:color w:val="333333"/>
-          <w:sz w:val="18"/>
-          <w:szCs w:val="18"/>
-        </w:rPr>
-        <w:t>runtime</w:t>
-      </w:r>
-      <w:proofErr w:type="spellEnd"/>
-      <w:r>
-        <w:rPr>
-          <w:rFonts w:ascii="Courier New" w:eastAsia="Courier New" w:hAnsi="Courier New" w:cs="Courier New"/>
-          <w:color w:val="333333"/>
-          <w:sz w:val="18"/>
-          <w:szCs w:val="18"/>
-        </w:rPr>
-        <w:t>(</w:t>
-      </w:r>
-      <w:proofErr w:type="gramEnd"/>
-      <w:r>
-        <w:rPr>
-          <w:rFonts w:ascii="Courier New" w:eastAsia="Courier New" w:hAnsi="Courier New" w:cs="Courier New"/>
-          <w:color w:val="333333"/>
-          <w:sz w:val="18"/>
-          <w:szCs w:val="18"/>
-        </w:rPr>
-        <w:t>)        ← always runs, even on safety stop</w:t>
+        <w:t xml:space="preserve">  │</w:t>
       </w:r>
     </w:p>
     <w:p>
@@ -3238,7 +3373,43 @@
           <w:sz w:val="18"/>
           <w:szCs w:val="18"/>
         </w:rPr>
-        <w:t xml:space="preserve">  │     Accumulate pump-on seconds</w:t>
+        <w:t xml:space="preserve">  ├─1─ _check_local_button()    ← poll physical button</w:t>
+      </w:r>
+      <w:proofErr w:type="spellStart"/>
+      <w:r>
+        <w:rPr>
+          <w:rFonts w:ascii="Courier New" w:eastAsia="Courier New" w:hAnsi="Courier New" w:cs="Courier New"/>
+          <w:color w:val="333333"/>
+          <w:sz w:val="18"/>
+          <w:szCs w:val="18"/>
+        </w:rPr>
+      </w:r>
+      <w:proofErr w:type="gramStart"/>
+      <w:r>
+        <w:rPr>
+          <w:rFonts w:ascii="Courier New" w:eastAsia="Courier New" w:hAnsi="Courier New" w:cs="Courier New"/>
+          <w:color w:val="333333"/>
+          <w:sz w:val="18"/>
+          <w:szCs w:val="18"/>
+        </w:rPr>
+      </w:r>
+      <w:proofErr w:type="spellEnd"/>
+      <w:r>
+        <w:rPr>
+          <w:rFonts w:ascii="Courier New" w:eastAsia="Courier New" w:hAnsi="Courier New" w:cs="Courier New"/>
+          <w:color w:val="333333"/>
+          <w:sz w:val="18"/>
+          <w:szCs w:val="18"/>
+        </w:rPr>
+      </w:r>
+      <w:proofErr w:type="gramEnd"/>
+      <w:r>
+        <w:rPr>
+          <w:rFonts w:ascii="Courier New" w:eastAsia="Courier New" w:hAnsi="Courier New" w:cs="Courier New"/>
+          <w:color w:val="333333"/>
+          <w:sz w:val="18"/>
+          <w:szCs w:val="18"/>
+        </w:rPr>
       </w:r>
     </w:p>
     <w:p>
@@ -3254,7 +3425,27 @@
           <w:sz w:val="18"/>
           <w:szCs w:val="18"/>
         </w:rPr>
-        <w:t xml:space="preserve">  │     Reset daily counter at midnight</w:t>
+        <w:t xml:space="preserve">  │     Pressed? → set </w:t>
+      </w:r>
+      <w:proofErr w:type="spellStart"/>
+      <w:r>
+        <w:rPr>
+          <w:rFonts w:ascii="Courier New" w:eastAsia="Courier New" w:hAnsi="Courier New" w:cs="Courier New"/>
+          <w:color w:val="333333"/>
+          <w:sz w:val="18"/>
+          <w:szCs w:val="18"/>
+        </w:rPr>
+        <w:t>manual_override</w:t>
+      </w:r>
+      <w:proofErr w:type="spellEnd"/>
+      <w:r>
+        <w:rPr>
+          <w:rFonts w:ascii="Courier New" w:eastAsia="Courier New" w:hAnsi="Courier New" w:cs="Courier New"/>
+          <w:color w:val="333333"/>
+          <w:sz w:val="18"/>
+          <w:szCs w:val="18"/>
+        </w:rPr>
+        <w:t xml:space="preserve"> = True</w:t>
       </w:r>
     </w:p>
     <w:p>
@@ -3286,7 +3477,7 @@
           <w:sz w:val="18"/>
           <w:szCs w:val="18"/>
         </w:rPr>
-        <w:t xml:space="preserve">  ├─2─ _</w:t>
+        <w:t xml:space="preserve">  ├─2─ _run_safety_chain()      ← HIGHEST PRIORITY</w:t>
       </w:r>
       <w:proofErr w:type="spellStart"/>
       <w:r>
@@ -3296,7 +3487,6 @@
           <w:sz w:val="18"/>
           <w:szCs w:val="18"/>
         </w:rPr>
-        <w:t>check_local_</w:t>
       </w:r>
       <w:proofErr w:type="gramStart"/>
       <w:r>
@@ -3306,7 +3496,6 @@
           <w:sz w:val="18"/>
           <w:szCs w:val="18"/>
         </w:rPr>
-        <w:t>button</w:t>
       </w:r>
       <w:proofErr w:type="spellEnd"/>
       <w:r>
@@ -3316,7 +3505,6 @@
           <w:sz w:val="18"/>
           <w:szCs w:val="18"/>
         </w:rPr>
-        <w:t>(</w:t>
       </w:r>
       <w:proofErr w:type="gramEnd"/>
       <w:r>
@@ -3326,7 +3514,6 @@
           <w:sz w:val="18"/>
           <w:szCs w:val="18"/>
         </w:rPr>
-        <w:t>)    ← poll physical button</w:t>
       </w:r>
     </w:p>
     <w:p>
@@ -3342,27 +3529,7 @@
           <w:sz w:val="18"/>
           <w:szCs w:val="18"/>
         </w:rPr>
-        <w:t xml:space="preserve">  │     Pressed? → set </w:t>
-      </w:r>
-      <w:proofErr w:type="spellStart"/>
-      <w:r>
-        <w:rPr>
-          <w:rFonts w:ascii="Courier New" w:eastAsia="Courier New" w:hAnsi="Courier New" w:cs="Courier New"/>
-          <w:color w:val="333333"/>
-          <w:sz w:val="18"/>
-          <w:szCs w:val="18"/>
-        </w:rPr>
-        <w:t>manual_override</w:t>
-      </w:r>
-      <w:proofErr w:type="spellEnd"/>
-      <w:r>
-        <w:rPr>
-          <w:rFonts w:ascii="Courier New" w:eastAsia="Courier New" w:hAnsi="Courier New" w:cs="Courier New"/>
-          <w:color w:val="333333"/>
-          <w:sz w:val="18"/>
-          <w:szCs w:val="18"/>
-        </w:rPr>
-        <w:t xml:space="preserve"> = True</w:t>
+        <w:t xml:space="preserve">  │     │</w:t>
       </w:r>
     </w:p>
     <w:p>
@@ -3378,7 +3545,47 @@
           <w:sz w:val="18"/>
           <w:szCs w:val="18"/>
         </w:rPr>
-        <w:t xml:space="preserve">  │</w:t>
+        <w:t xml:space="preserve">  │     ├─P1─ </w:t>
+      </w:r>
+      <w:proofErr w:type="spellStart"/>
+      <w:r>
+        <w:rPr>
+          <w:rFonts w:ascii="Courier New" w:eastAsia="Courier New" w:hAnsi="Courier New" w:cs="Courier New"/>
+          <w:color w:val="333333"/>
+          <w:sz w:val="18"/>
+          <w:szCs w:val="18"/>
+        </w:rPr>
+        <w:t>water_level_ok</w:t>
+      </w:r>
+      <w:proofErr w:type="spellEnd"/>
+      <w:r>
+        <w:rPr>
+          <w:rFonts w:ascii="Courier New" w:eastAsia="Courier New" w:hAnsi="Courier New" w:cs="Courier New"/>
+          <w:color w:val="333333"/>
+          <w:sz w:val="18"/>
+          <w:szCs w:val="18"/>
+        </w:rPr>
+        <w:t xml:space="preserve">?      </w:t>
+      </w:r>
+      <w:proofErr w:type="gramStart"/>
+      <w:r>
+        <w:rPr>
+          <w:rFonts w:ascii="Courier New" w:eastAsia="Courier New" w:hAnsi="Courier New" w:cs="Courier New"/>
+          <w:color w:val="333333"/>
+          <w:sz w:val="18"/>
+          <w:szCs w:val="18"/>
+        </w:rPr>
+        <w:t>NO  →</w:t>
+      </w:r>
+      <w:proofErr w:type="gramEnd"/>
+      <w:r>
+        <w:rPr>
+          <w:rFonts w:ascii="Courier New" w:eastAsia="Courier New" w:hAnsi="Courier New" w:cs="Courier New"/>
+          <w:color w:val="333333"/>
+          <w:sz w:val="18"/>
+          <w:szCs w:val="18"/>
+        </w:rPr>
+        <w:t xml:space="preserve"> pump OFF (dry run protect)</w:t>
       </w:r>
     </w:p>
     <w:p>
@@ -3394,7 +3601,7 @@
           <w:sz w:val="18"/>
           <w:szCs w:val="18"/>
         </w:rPr>
-        <w:t xml:space="preserve">  ├─3─ _</w:t>
+        <w:t xml:space="preserve">  │     │                               </w:t>
       </w:r>
       <w:proofErr w:type="spellStart"/>
       <w:r>
@@ -3404,17 +3611,7 @@
           <w:sz w:val="18"/>
           <w:szCs w:val="18"/>
         </w:rPr>
-        <w:t>run_safety_</w:t>
-      </w:r>
-      <w:proofErr w:type="gramStart"/>
-      <w:r>
-        <w:rPr>
-          <w:rFonts w:ascii="Courier New" w:eastAsia="Courier New" w:hAnsi="Courier New" w:cs="Courier New"/>
-          <w:color w:val="333333"/>
-          <w:sz w:val="18"/>
-          <w:szCs w:val="18"/>
-        </w:rPr>
-        <w:t>chain</w:t>
+        <w:t>manual_override</w:t>
       </w:r>
       <w:proofErr w:type="spellEnd"/>
       <w:r>
@@ -3424,17 +3621,7 @@
           <w:sz w:val="18"/>
           <w:szCs w:val="18"/>
         </w:rPr>
-        <w:t>(</w:t>
-      </w:r>
-      <w:proofErr w:type="gramEnd"/>
-      <w:r>
-        <w:rPr>
-          <w:rFonts w:ascii="Courier New" w:eastAsia="Courier New" w:hAnsi="Courier New" w:cs="Courier New"/>
-          <w:color w:val="333333"/>
-          <w:sz w:val="18"/>
-          <w:szCs w:val="18"/>
-        </w:rPr>
-        <w:t>)      ← HIGHEST PRIORITY</w:t>
+        <w:t xml:space="preserve"> cleared</w:t>
       </w:r>
     </w:p>
     <w:p>
@@ -3450,7 +3637,7 @@
           <w:sz w:val="18"/>
           <w:szCs w:val="18"/>
         </w:rPr>
-        <w:t xml:space="preserve">  │     │</w:t>
+        <w:t xml:space="preserve">  │     │                               RETURN (skip all logic)</w:t>
       </w:r>
     </w:p>
     <w:p>
@@ -3466,47 +3653,7 @@
           <w:sz w:val="18"/>
           <w:szCs w:val="18"/>
         </w:rPr>
-        <w:t xml:space="preserve">  │     ├─P1─ </w:t>
-      </w:r>
-      <w:proofErr w:type="spellStart"/>
-      <w:r>
-        <w:rPr>
-          <w:rFonts w:ascii="Courier New" w:eastAsia="Courier New" w:hAnsi="Courier New" w:cs="Courier New"/>
-          <w:color w:val="333333"/>
-          <w:sz w:val="18"/>
-          <w:szCs w:val="18"/>
-        </w:rPr>
-        <w:t>water_level_ok</w:t>
-      </w:r>
-      <w:proofErr w:type="spellEnd"/>
-      <w:r>
-        <w:rPr>
-          <w:rFonts w:ascii="Courier New" w:eastAsia="Courier New" w:hAnsi="Courier New" w:cs="Courier New"/>
-          <w:color w:val="333333"/>
-          <w:sz w:val="18"/>
-          <w:szCs w:val="18"/>
-        </w:rPr>
-        <w:t xml:space="preserve">?      </w:t>
-      </w:r>
-      <w:proofErr w:type="gramStart"/>
-      <w:r>
-        <w:rPr>
-          <w:rFonts w:ascii="Courier New" w:eastAsia="Courier New" w:hAnsi="Courier New" w:cs="Courier New"/>
-          <w:color w:val="333333"/>
-          <w:sz w:val="18"/>
-          <w:szCs w:val="18"/>
-        </w:rPr>
-        <w:t>NO  →</w:t>
-      </w:r>
-      <w:proofErr w:type="gramEnd"/>
-      <w:r>
-        <w:rPr>
-          <w:rFonts w:ascii="Courier New" w:eastAsia="Courier New" w:hAnsi="Courier New" w:cs="Courier New"/>
-          <w:color w:val="333333"/>
-          <w:sz w:val="18"/>
-          <w:szCs w:val="18"/>
-        </w:rPr>
-        <w:t xml:space="preserve"> pump OFF (dry run protect)</w:t>
+        <w:t xml:space="preserve">  │     │</w:t>
       </w:r>
     </w:p>
     <w:p>
@@ -3522,7 +3669,7 @@
           <w:sz w:val="18"/>
           <w:szCs w:val="18"/>
         </w:rPr>
-        <w:t xml:space="preserve">  │     │                               </w:t>
+        <w:t xml:space="preserve">  │     ├─P2a─ </w:t>
       </w:r>
       <w:proofErr w:type="spellStart"/>
       <w:r>
@@ -3532,7 +3679,7 @@
           <w:sz w:val="18"/>
           <w:szCs w:val="18"/>
         </w:rPr>
-        <w:t>manual_override</w:t>
+        <w:t>tEnclosure</w:t>
       </w:r>
       <w:proofErr w:type="spellEnd"/>
       <w:r>
@@ -3542,7 +3689,27 @@
           <w:sz w:val="18"/>
           <w:szCs w:val="18"/>
         </w:rPr>
-        <w:t xml:space="preserve"> cleared</w:t>
+        <w:t xml:space="preserve"> present? </w:t>
+      </w:r>
+      <w:proofErr w:type="gramStart"/>
+      <w:r>
+        <w:rPr>
+          <w:rFonts w:ascii="Courier New" w:eastAsia="Courier New" w:hAnsi="Courier New" w:cs="Courier New"/>
+          <w:color w:val="333333"/>
+          <w:sz w:val="18"/>
+          <w:szCs w:val="18"/>
+        </w:rPr>
+        <w:t>NO  →</w:t>
+      </w:r>
+      <w:proofErr w:type="gramEnd"/>
+      <w:r>
+        <w:rPr>
+          <w:rFonts w:ascii="Courier New" w:eastAsia="Courier New" w:hAnsi="Courier New" w:cs="Courier New"/>
+          <w:color w:val="333333"/>
+          <w:sz w:val="18"/>
+          <w:szCs w:val="18"/>
+        </w:rPr>
+        <w:t xml:space="preserve"> pump OFF (sensor missing)</w:t>
       </w:r>
     </w:p>
     <w:p>
@@ -3558,7 +3725,7 @@
           <w:sz w:val="18"/>
           <w:szCs w:val="18"/>
         </w:rPr>
-        <w:t xml:space="preserve">  │     │                               RETURN (skip all logic)</w:t>
+        <w:t xml:space="preserve">  │     │                               RETURN</w:t>
       </w:r>
     </w:p>
     <w:p>
@@ -3590,7 +3757,7 @@
           <w:sz w:val="18"/>
           <w:szCs w:val="18"/>
         </w:rPr>
-        <w:t xml:space="preserve">  │     ├─P2a─ </w:t>
+        <w:t xml:space="preserve">  │     ├─P2b─ </w:t>
       </w:r>
       <w:proofErr w:type="spellStart"/>
       <w:r>
@@ -3610,27 +3777,27 @@
           <w:sz w:val="18"/>
           <w:szCs w:val="18"/>
         </w:rPr>
-        <w:t xml:space="preserve"> present? </w:t>
-      </w:r>
-      <w:proofErr w:type="gramStart"/>
-      <w:r>
-        <w:rPr>
-          <w:rFonts w:ascii="Courier New" w:eastAsia="Courier New" w:hAnsi="Courier New" w:cs="Courier New"/>
-          <w:color w:val="333333"/>
-          <w:sz w:val="18"/>
-          <w:szCs w:val="18"/>
-        </w:rPr>
-        <w:t>NO  →</w:t>
-      </w:r>
-      <w:proofErr w:type="gramEnd"/>
-      <w:r>
-        <w:rPr>
-          <w:rFonts w:ascii="Courier New" w:eastAsia="Courier New" w:hAnsi="Courier New" w:cs="Courier New"/>
-          <w:color w:val="333333"/>
-          <w:sz w:val="18"/>
-          <w:szCs w:val="18"/>
-        </w:rPr>
-        <w:t xml:space="preserve"> pump OFF (sensor missing)</w:t>
+        <w:t xml:space="preserve"> &gt; 55°C?  YES → pump OFF (</w:t>
+      </w:r>
+      <w:proofErr w:type="spellStart"/>
+      <w:r>
+        <w:rPr>
+          <w:rFonts w:ascii="Courier New" w:eastAsia="Courier New" w:hAnsi="Courier New" w:cs="Courier New"/>
+          <w:color w:val="333333"/>
+          <w:sz w:val="18"/>
+          <w:szCs w:val="18"/>
+        </w:rPr>
+        <w:t>overtemp</w:t>
+      </w:r>
+      <w:proofErr w:type="spellEnd"/>
+      <w:r>
+        <w:rPr>
+          <w:rFonts w:ascii="Courier New" w:eastAsia="Courier New" w:hAnsi="Courier New" w:cs="Courier New"/>
+          <w:color w:val="333333"/>
+          <w:sz w:val="18"/>
+          <w:szCs w:val="18"/>
+        </w:rPr>
+        <w:t>)</w:t>
       </w:r>
     </w:p>
     <w:p>
@@ -3646,7 +3813,27 @@
           <w:sz w:val="18"/>
           <w:szCs w:val="18"/>
         </w:rPr>
-        <w:t xml:space="preserve">  │     │                               RETURN</w:t>
+        <w:t xml:space="preserve">  │     │                               </w:t>
+      </w:r>
+      <w:proofErr w:type="spellStart"/>
+      <w:r>
+        <w:rPr>
+          <w:rFonts w:ascii="Courier New" w:eastAsia="Courier New" w:hAnsi="Courier New" w:cs="Courier New"/>
+          <w:color w:val="333333"/>
+          <w:sz w:val="18"/>
+          <w:szCs w:val="18"/>
+        </w:rPr>
+        <w:t>manual_override</w:t>
+      </w:r>
+      <w:proofErr w:type="spellEnd"/>
+      <w:r>
+        <w:rPr>
+          <w:rFonts w:ascii="Courier New" w:eastAsia="Courier New" w:hAnsi="Courier New" w:cs="Courier New"/>
+          <w:color w:val="333333"/>
+          <w:sz w:val="18"/>
+          <w:szCs w:val="18"/>
+        </w:rPr>
+        <w:t xml:space="preserve"> cleared</w:t>
       </w:r>
     </w:p>
     <w:p>
@@ -3662,7 +3849,7 @@
           <w:sz w:val="18"/>
           <w:szCs w:val="18"/>
         </w:rPr>
-        <w:t xml:space="preserve">  │     │</w:t>
+        <w:t xml:space="preserve">  │     │                               RETURN</w:t>
       </w:r>
     </w:p>
     <w:p>
@@ -3678,47 +3865,7 @@
           <w:sz w:val="18"/>
           <w:szCs w:val="18"/>
         </w:rPr>
-        <w:t xml:space="preserve">  │     ├─P2b─ </w:t>
-      </w:r>
-      <w:proofErr w:type="spellStart"/>
-      <w:r>
-        <w:rPr>
-          <w:rFonts w:ascii="Courier New" w:eastAsia="Courier New" w:hAnsi="Courier New" w:cs="Courier New"/>
-          <w:color w:val="333333"/>
-          <w:sz w:val="18"/>
-          <w:szCs w:val="18"/>
-        </w:rPr>
-        <w:t>tEnclosure</w:t>
-      </w:r>
-      <w:proofErr w:type="spellEnd"/>
-      <w:r>
-        <w:rPr>
-          <w:rFonts w:ascii="Courier New" w:eastAsia="Courier New" w:hAnsi="Courier New" w:cs="Courier New"/>
-          <w:color w:val="333333"/>
-          <w:sz w:val="18"/>
-          <w:szCs w:val="18"/>
-        </w:rPr>
-        <w:t xml:space="preserve"> &gt; 55°C?  YES → pump OFF (</w:t>
-      </w:r>
-      <w:proofErr w:type="spellStart"/>
-      <w:r>
-        <w:rPr>
-          <w:rFonts w:ascii="Courier New" w:eastAsia="Courier New" w:hAnsi="Courier New" w:cs="Courier New"/>
-          <w:color w:val="333333"/>
-          <w:sz w:val="18"/>
-          <w:szCs w:val="18"/>
-        </w:rPr>
-        <w:t>overtemp</w:t>
-      </w:r>
-      <w:proofErr w:type="spellEnd"/>
-      <w:r>
-        <w:rPr>
-          <w:rFonts w:ascii="Courier New" w:eastAsia="Courier New" w:hAnsi="Courier New" w:cs="Courier New"/>
-          <w:color w:val="333333"/>
-          <w:sz w:val="18"/>
-          <w:szCs w:val="18"/>
-        </w:rPr>
-        <w:t>)</w:t>
+        <w:t xml:space="preserve">  │     │</w:t>
       </w:r>
     </w:p>
     <w:p>
@@ -3734,7 +3881,7 @@
           <w:sz w:val="18"/>
           <w:szCs w:val="18"/>
         </w:rPr>
-        <w:t xml:space="preserve">  │     │                               </w:t>
+        <w:t xml:space="preserve">  │     └─P3─ </w:t>
       </w:r>
       <w:proofErr w:type="spellStart"/>
       <w:r>
@@ -3744,7 +3891,7 @@
           <w:sz w:val="18"/>
           <w:szCs w:val="18"/>
         </w:rPr>
-        <w:t>manual_override</w:t>
+        <w:t>tFlow</w:t>
       </w:r>
       <w:proofErr w:type="spellEnd"/>
       <w:r>
@@ -3754,7 +3901,27 @@
           <w:sz w:val="18"/>
           <w:szCs w:val="18"/>
         </w:rPr>
-        <w:t xml:space="preserve"> cleared</w:t>
+        <w:t>/</w:t>
+      </w:r>
+      <w:proofErr w:type="spellStart"/>
+      <w:r>
+        <w:rPr>
+          <w:rFonts w:ascii="Courier New" w:eastAsia="Courier New" w:hAnsi="Courier New" w:cs="Courier New"/>
+          <w:color w:val="333333"/>
+          <w:sz w:val="18"/>
+          <w:szCs w:val="18"/>
+        </w:rPr>
+        <w:t>tReturn</w:t>
+      </w:r>
+      <w:proofErr w:type="spellEnd"/>
+      <w:r>
+        <w:rPr>
+          <w:rFonts w:ascii="Courier New" w:eastAsia="Courier New" w:hAnsi="Courier New" w:cs="Courier New"/>
+          <w:color w:val="333333"/>
+          <w:sz w:val="18"/>
+          <w:szCs w:val="18"/>
+        </w:rPr>
+        <w:t xml:space="preserve"> present? NO → pump OFF</w:t>
       </w:r>
     </w:p>
     <w:p>
@@ -3770,7 +3937,7 @@
           <w:sz w:val="18"/>
           <w:szCs w:val="18"/>
         </w:rPr>
-        <w:t xml:space="preserve">  │     │                               RETURN</w:t>
+        <w:t xml:space="preserve">  │                                       RETURN</w:t>
       </w:r>
     </w:p>
     <w:p>
@@ -3786,7 +3953,7 @@
           <w:sz w:val="18"/>
           <w:szCs w:val="18"/>
         </w:rPr>
-        <w:t xml:space="preserve">  │     │</w:t>
+        <w:t xml:space="preserve">  │</w:t>
       </w:r>
     </w:p>
     <w:p>
@@ -3802,7 +3969,7 @@
           <w:sz w:val="18"/>
           <w:szCs w:val="18"/>
         </w:rPr>
-        <w:t xml:space="preserve">  │     └─P3─ </w:t>
+        <w:t xml:space="preserve">  ├─3─ _run_control_logic()     ← only if safety chain passed</w:t>
       </w:r>
       <w:proofErr w:type="spellStart"/>
       <w:r>
@@ -3812,7 +3979,15 @@
           <w:sz w:val="18"/>
           <w:szCs w:val="18"/>
         </w:rPr>
-        <w:t>tFlow</w:t>
+      </w:r>
+      <w:proofErr w:type="gramStart"/>
+      <w:r>
+        <w:rPr>
+          <w:rFonts w:ascii="Courier New" w:eastAsia="Courier New" w:hAnsi="Courier New" w:cs="Courier New"/>
+          <w:color w:val="333333"/>
+          <w:sz w:val="18"/>
+          <w:szCs w:val="18"/>
+        </w:rPr>
       </w:r>
       <w:proofErr w:type="spellEnd"/>
       <w:r>
@@ -3822,27 +3997,15 @@
           <w:sz w:val="18"/>
           <w:szCs w:val="18"/>
         </w:rPr>
-        <w:t>/</w:t>
-      </w:r>
-      <w:proofErr w:type="spellStart"/>
-      <w:r>
-        <w:rPr>
-          <w:rFonts w:ascii="Courier New" w:eastAsia="Courier New" w:hAnsi="Courier New" w:cs="Courier New"/>
-          <w:color w:val="333333"/>
-          <w:sz w:val="18"/>
-          <w:szCs w:val="18"/>
-        </w:rPr>
-        <w:t>tReturn</w:t>
-      </w:r>
-      <w:proofErr w:type="spellEnd"/>
-      <w:r>
-        <w:rPr>
-          <w:rFonts w:ascii="Courier New" w:eastAsia="Courier New" w:hAnsi="Courier New" w:cs="Courier New"/>
-          <w:color w:val="333333"/>
-          <w:sz w:val="18"/>
-          <w:szCs w:val="18"/>
-        </w:rPr>
-        <w:t xml:space="preserve"> present? NO → pump OFF</w:t>
+      </w:r>
+      <w:proofErr w:type="gramEnd"/>
+      <w:r>
+        <w:rPr>
+          <w:rFonts w:ascii="Courier New" w:eastAsia="Courier New" w:hAnsi="Courier New" w:cs="Courier New"/>
+          <w:color w:val="333333"/>
+          <w:sz w:val="18"/>
+          <w:szCs w:val="18"/>
+        </w:rPr>
       </w:r>
     </w:p>
     <w:p>
@@ -3858,7 +4021,7 @@
           <w:sz w:val="18"/>
           <w:szCs w:val="18"/>
         </w:rPr>
-        <w:t xml:space="preserve">  │                                       RETURN</w:t>
+        <w:t xml:space="preserve">  │     │</w:t>
       </w:r>
     </w:p>
     <w:p>
@@ -3874,7 +4037,27 @@
           <w:sz w:val="18"/>
           <w:szCs w:val="18"/>
         </w:rPr>
-        <w:t xml:space="preserve">  │</w:t>
+        <w:t xml:space="preserve">  │     ├─ </w:t>
+      </w:r>
+      <w:proofErr w:type="spellStart"/>
+      <w:r>
+        <w:rPr>
+          <w:rFonts w:ascii="Courier New" w:eastAsia="Courier New" w:hAnsi="Courier New" w:cs="Courier New"/>
+          <w:color w:val="333333"/>
+          <w:sz w:val="18"/>
+          <w:szCs w:val="18"/>
+        </w:rPr>
+        <w:t>manual_override</w:t>
+      </w:r>
+      <w:proofErr w:type="spellEnd"/>
+      <w:r>
+        <w:rPr>
+          <w:rFonts w:ascii="Courier New" w:eastAsia="Courier New" w:hAnsi="Courier New" w:cs="Courier New"/>
+          <w:color w:val="333333"/>
+          <w:sz w:val="18"/>
+          <w:szCs w:val="18"/>
+        </w:rPr>
+        <w:t>?     YES → run timed boost (90 s)</w:t>
       </w:r>
     </w:p>
     <w:p>
@@ -3890,47 +4073,7 @@
           <w:sz w:val="18"/>
           <w:szCs w:val="18"/>
         </w:rPr>
-        <w:t xml:space="preserve">  ├─4─ _</w:t>
-      </w:r>
-      <w:proofErr w:type="spellStart"/>
-      <w:r>
-        <w:rPr>
-          <w:rFonts w:ascii="Courier New" w:eastAsia="Courier New" w:hAnsi="Courier New" w:cs="Courier New"/>
-          <w:color w:val="333333"/>
-          <w:sz w:val="18"/>
-          <w:szCs w:val="18"/>
-        </w:rPr>
-        <w:t>run_control_</w:t>
-      </w:r>
-      <w:proofErr w:type="gramStart"/>
-      <w:r>
-        <w:rPr>
-          <w:rFonts w:ascii="Courier New" w:eastAsia="Courier New" w:hAnsi="Courier New" w:cs="Courier New"/>
-          <w:color w:val="333333"/>
-          <w:sz w:val="18"/>
-          <w:szCs w:val="18"/>
-        </w:rPr>
-        <w:t>logic</w:t>
-      </w:r>
-      <w:proofErr w:type="spellEnd"/>
-      <w:r>
-        <w:rPr>
-          <w:rFonts w:ascii="Courier New" w:eastAsia="Courier New" w:hAnsi="Courier New" w:cs="Courier New"/>
-          <w:color w:val="333333"/>
-          <w:sz w:val="18"/>
-          <w:szCs w:val="18"/>
-        </w:rPr>
-        <w:t>(</w:t>
-      </w:r>
-      <w:proofErr w:type="gramEnd"/>
-      <w:r>
-        <w:rPr>
-          <w:rFonts w:ascii="Courier New" w:eastAsia="Courier New" w:hAnsi="Courier New" w:cs="Courier New"/>
-          <w:color w:val="333333"/>
-          <w:sz w:val="18"/>
-          <w:szCs w:val="18"/>
-        </w:rPr>
-        <w:t>)     ← only if safety chain passed</w:t>
+        <w:t xml:space="preserve">  │     │                            RETURN when active</w:t>
       </w:r>
     </w:p>
     <w:p>
@@ -3962,27 +4105,27 @@
           <w:sz w:val="18"/>
           <w:szCs w:val="18"/>
         </w:rPr>
-        <w:t xml:space="preserve">  │     ├─ </w:t>
-      </w:r>
-      <w:proofErr w:type="spellStart"/>
-      <w:r>
-        <w:rPr>
-          <w:rFonts w:ascii="Courier New" w:eastAsia="Courier New" w:hAnsi="Courier New" w:cs="Courier New"/>
-          <w:color w:val="333333"/>
-          <w:sz w:val="18"/>
-          <w:szCs w:val="18"/>
-        </w:rPr>
-        <w:t>manual_override</w:t>
-      </w:r>
-      <w:proofErr w:type="spellEnd"/>
-      <w:r>
-        <w:rPr>
-          <w:rFonts w:ascii="Courier New" w:eastAsia="Courier New" w:hAnsi="Courier New" w:cs="Courier New"/>
-          <w:color w:val="333333"/>
-          <w:sz w:val="18"/>
-          <w:szCs w:val="18"/>
-        </w:rPr>
-        <w:t>?     YES → run timed boost (90 s)</w:t>
+        <w:t xml:space="preserve">  │     ├─ core hours? (8–18)   </w:t>
+      </w:r>
+      <w:proofErr w:type="gramStart"/>
+      <w:r>
+        <w:rPr>
+          <w:rFonts w:ascii="Courier New" w:eastAsia="Courier New" w:hAnsi="Courier New" w:cs="Courier New"/>
+          <w:color w:val="333333"/>
+          <w:sz w:val="18"/>
+          <w:szCs w:val="18"/>
+        </w:rPr>
+        <w:t>NO  →</w:t>
+      </w:r>
+      <w:proofErr w:type="gramEnd"/>
+      <w:r>
+        <w:rPr>
+          <w:rFonts w:ascii="Courier New" w:eastAsia="Courier New" w:hAnsi="Courier New" w:cs="Courier New"/>
+          <w:color w:val="333333"/>
+          <w:sz w:val="18"/>
+          <w:szCs w:val="18"/>
+        </w:rPr>
+        <w:t xml:space="preserve"> pump OFF (sleep/holiday)</w:t>
       </w:r>
     </w:p>
     <w:p>
@@ -3998,7 +4141,27 @@
           <w:sz w:val="18"/>
           <w:szCs w:val="18"/>
         </w:rPr>
-        <w:t xml:space="preserve">  │     │                            RETURN when active</w:t>
+        <w:t xml:space="preserve">  │     </w:t>
+      </w:r>
+      <w:proofErr w:type="gramStart"/>
+      <w:r>
+        <w:rPr>
+          <w:rFonts w:ascii="Courier New" w:eastAsia="Courier New" w:hAnsi="Courier New" w:cs="Courier New"/>
+          <w:color w:val="333333"/>
+          <w:sz w:val="18"/>
+          <w:szCs w:val="18"/>
+        </w:rPr>
+        <w:t>│  holiday</w:t>
+      </w:r>
+      <w:proofErr w:type="gramEnd"/>
+      <w:r>
+        <w:rPr>
+          <w:rFonts w:ascii="Courier New" w:eastAsia="Courier New" w:hAnsi="Courier New" w:cs="Courier New"/>
+          <w:color w:val="333333"/>
+          <w:sz w:val="18"/>
+          <w:szCs w:val="18"/>
+        </w:rPr>
+        <w:t xml:space="preserve"> mode?             RETURN</w:t>
       </w:r>
     </w:p>
     <w:p>
@@ -4030,27 +4193,7 @@
           <w:sz w:val="18"/>
           <w:szCs w:val="18"/>
         </w:rPr>
-        <w:t xml:space="preserve">  │     ├─ core hours? (8–18)   </w:t>
-      </w:r>
-      <w:proofErr w:type="gramStart"/>
-      <w:r>
-        <w:rPr>
-          <w:rFonts w:ascii="Courier New" w:eastAsia="Courier New" w:hAnsi="Courier New" w:cs="Courier New"/>
-          <w:color w:val="333333"/>
-          <w:sz w:val="18"/>
-          <w:szCs w:val="18"/>
-        </w:rPr>
-        <w:t>NO  →</w:t>
-      </w:r>
-      <w:proofErr w:type="gramEnd"/>
-      <w:r>
-        <w:rPr>
-          <w:rFonts w:ascii="Courier New" w:eastAsia="Courier New" w:hAnsi="Courier New" w:cs="Courier New"/>
-          <w:color w:val="333333"/>
-          <w:sz w:val="18"/>
-          <w:szCs w:val="18"/>
-        </w:rPr>
-        <w:t xml:space="preserve"> pump OFF (sleep/holiday)</w:t>
+        <w:t xml:space="preserve">  │     ├─ Solar delta logic</w:t>
       </w:r>
     </w:p>
     <w:p>
@@ -4066,28 +4209,39 @@
           <w:sz w:val="18"/>
           <w:szCs w:val="18"/>
         </w:rPr>
-        <w:t xml:space="preserve">  │     </w:t>
-      </w:r>
-      <w:proofErr w:type="gramStart"/>
-      <w:r>
-        <w:rPr>
-          <w:rFonts w:ascii="Courier New" w:eastAsia="Courier New" w:hAnsi="Courier New" w:cs="Courier New"/>
-          <w:color w:val="333333"/>
-          <w:sz w:val="18"/>
-          <w:szCs w:val="18"/>
-        </w:rPr>
-        <w:t>│  holiday</w:t>
-      </w:r>
-      <w:proofErr w:type="gramEnd"/>
-      <w:r>
-        <w:rPr>
-          <w:rFonts w:ascii="Courier New" w:eastAsia="Courier New" w:hAnsi="Courier New" w:cs="Courier New"/>
-          <w:color w:val="333333"/>
-          <w:sz w:val="18"/>
-          <w:szCs w:val="18"/>
-        </w:rPr>
-        <w:t xml:space="preserve"> mode?             RETURN</w:t>
-      </w:r>
+        <w:t xml:space="preserve">  │     │   delta = </w:t>
+      </w:r>
+      <w:proofErr w:type="spellStart"/>
+      <w:r>
+        <w:rPr>
+          <w:rFonts w:ascii="Courier New" w:eastAsia="Courier New" w:hAnsi="Courier New" w:cs="Courier New"/>
+          <w:color w:val="333333"/>
+          <w:sz w:val="18"/>
+          <w:szCs w:val="18"/>
+        </w:rPr>
+        <w:t>tReturn</w:t>
+      </w:r>
+      <w:proofErr w:type="spellEnd"/>
+      <w:r>
+        <w:rPr>
+          <w:rFonts w:ascii="Courier New" w:eastAsia="Courier New" w:hAnsi="Courier New" w:cs="Courier New"/>
+          <w:color w:val="333333"/>
+          <w:sz w:val="18"/>
+          <w:szCs w:val="18"/>
+        </w:rPr>
+        <w:t xml:space="preserve"> – </w:t>
+      </w:r>
+      <w:proofErr w:type="spellStart"/>
+      <w:r>
+        <w:rPr>
+          <w:rFonts w:ascii="Courier New" w:eastAsia="Courier New" w:hAnsi="Courier New" w:cs="Courier New"/>
+          <w:color w:val="333333"/>
+          <w:sz w:val="18"/>
+          <w:szCs w:val="18"/>
+        </w:rPr>
+        <w:t>tFlow</w:t>
+      </w:r>
+      <w:proofErr w:type="spellEnd"/>
     </w:p>
     <w:p>
       <w:pPr>
@@ -4102,7 +4256,7 @@
           <w:sz w:val="18"/>
           <w:szCs w:val="18"/>
         </w:rPr>
-        <w:t xml:space="preserve">  │     │</w:t>
+        <w:t xml:space="preserve">  │     │   delta &gt;= 0.5°C AND pump off → pump ON</w:t>
       </w:r>
     </w:p>
     <w:p>
@@ -4118,7 +4272,47 @@
           <w:sz w:val="18"/>
           <w:szCs w:val="18"/>
         </w:rPr>
-        <w:t xml:space="preserve">  │     ├─ Solar delta logic</w:t>
+        <w:t xml:space="preserve">  │     │   delta </w:t>
+      </w:r>
+      <w:proofErr w:type="gramStart"/>
+      <w:r>
+        <w:rPr>
+          <w:rFonts w:ascii="Courier New" w:eastAsia="Courier New" w:hAnsi="Courier New" w:cs="Courier New"/>
+          <w:color w:val="333333"/>
+          <w:sz w:val="18"/>
+          <w:szCs w:val="18"/>
+        </w:rPr>
+        <w:t>&lt;  0</w:t>
+      </w:r>
+      <w:proofErr w:type="gramEnd"/>
+      <w:r>
+        <w:rPr>
+          <w:rFonts w:ascii="Courier New" w:eastAsia="Courier New" w:hAnsi="Courier New" w:cs="Courier New"/>
+          <w:color w:val="333333"/>
+          <w:sz w:val="18"/>
+          <w:szCs w:val="18"/>
+        </w:rPr>
+        <w:t xml:space="preserve">.1°C AND pump </w:t>
+      </w:r>
+      <w:proofErr w:type="gramStart"/>
+      <w:r>
+        <w:rPr>
+          <w:rFonts w:ascii="Courier New" w:eastAsia="Courier New" w:hAnsi="Courier New" w:cs="Courier New"/>
+          <w:color w:val="333333"/>
+          <w:sz w:val="18"/>
+          <w:szCs w:val="18"/>
+        </w:rPr>
+        <w:t>on  →</w:t>
+      </w:r>
+      <w:proofErr w:type="gramEnd"/>
+      <w:r>
+        <w:rPr>
+          <w:rFonts w:ascii="Courier New" w:eastAsia="Courier New" w:hAnsi="Courier New" w:cs="Courier New"/>
+          <w:color w:val="333333"/>
+          <w:sz w:val="18"/>
+          <w:szCs w:val="18"/>
+        </w:rPr>
+        <w:t xml:space="preserve"> pump OFF</w:t>
       </w:r>
     </w:p>
     <w:p>
@@ -4134,39 +4328,8 @@
           <w:sz w:val="18"/>
           <w:szCs w:val="18"/>
         </w:rPr>
-        <w:t xml:space="preserve">  │     │   delta = </w:t>
-      </w:r>
-      <w:proofErr w:type="spellStart"/>
-      <w:r>
-        <w:rPr>
-          <w:rFonts w:ascii="Courier New" w:eastAsia="Courier New" w:hAnsi="Courier New" w:cs="Courier New"/>
-          <w:color w:val="333333"/>
-          <w:sz w:val="18"/>
-          <w:szCs w:val="18"/>
-        </w:rPr>
-        <w:t>tReturn</w:t>
-      </w:r>
-      <w:proofErr w:type="spellEnd"/>
-      <w:r>
-        <w:rPr>
-          <w:rFonts w:ascii="Courier New" w:eastAsia="Courier New" w:hAnsi="Courier New" w:cs="Courier New"/>
-          <w:color w:val="333333"/>
-          <w:sz w:val="18"/>
-          <w:szCs w:val="18"/>
-        </w:rPr>
-        <w:t xml:space="preserve"> – </w:t>
-      </w:r>
-      <w:proofErr w:type="spellStart"/>
-      <w:r>
-        <w:rPr>
-          <w:rFonts w:ascii="Courier New" w:eastAsia="Courier New" w:hAnsi="Courier New" w:cs="Courier New"/>
-          <w:color w:val="333333"/>
-          <w:sz w:val="18"/>
-          <w:szCs w:val="18"/>
-        </w:rPr>
-        <w:t>tFlow</w:t>
-      </w:r>
-      <w:proofErr w:type="spellEnd"/>
+        <w:t xml:space="preserve">  │     │   between thresholds          → no change (hysteresis)</w:t>
+      </w:r>
     </w:p>
     <w:p>
       <w:pPr>
@@ -4181,7 +4344,7 @@
           <w:sz w:val="18"/>
           <w:szCs w:val="18"/>
         </w:rPr>
-        <w:t xml:space="preserve">  │     │   delta &gt;= 0.5°C AND pump off → pump ON</w:t>
+        <w:t xml:space="preserve">  │     │</w:t>
       </w:r>
     </w:p>
     <w:p>
@@ -4197,47 +4360,7 @@
           <w:sz w:val="18"/>
           <w:szCs w:val="18"/>
         </w:rPr>
-        <w:t xml:space="preserve">  │     │   delta </w:t>
-      </w:r>
-      <w:proofErr w:type="gramStart"/>
-      <w:r>
-        <w:rPr>
-          <w:rFonts w:ascii="Courier New" w:eastAsia="Courier New" w:hAnsi="Courier New" w:cs="Courier New"/>
-          <w:color w:val="333333"/>
-          <w:sz w:val="18"/>
-          <w:szCs w:val="18"/>
-        </w:rPr>
-        <w:t>&lt;  0</w:t>
-      </w:r>
-      <w:proofErr w:type="gramEnd"/>
-      <w:r>
-        <w:rPr>
-          <w:rFonts w:ascii="Courier New" w:eastAsia="Courier New" w:hAnsi="Courier New" w:cs="Courier New"/>
-          <w:color w:val="333333"/>
-          <w:sz w:val="18"/>
-          <w:szCs w:val="18"/>
-        </w:rPr>
-        <w:t xml:space="preserve">.1°C AND pump </w:t>
-      </w:r>
-      <w:proofErr w:type="gramStart"/>
-      <w:r>
-        <w:rPr>
-          <w:rFonts w:ascii="Courier New" w:eastAsia="Courier New" w:hAnsi="Courier New" w:cs="Courier New"/>
-          <w:color w:val="333333"/>
-          <w:sz w:val="18"/>
-          <w:szCs w:val="18"/>
-        </w:rPr>
-        <w:t>on  →</w:t>
-      </w:r>
-      <w:proofErr w:type="gramEnd"/>
-      <w:r>
-        <w:rPr>
-          <w:rFonts w:ascii="Courier New" w:eastAsia="Courier New" w:hAnsi="Courier New" w:cs="Courier New"/>
-          <w:color w:val="333333"/>
-          <w:sz w:val="18"/>
-          <w:szCs w:val="18"/>
-        </w:rPr>
-        <w:t xml:space="preserve"> pump OFF</w:t>
+        <w:t xml:space="preserve">  │     └─ Periodic test</w:t>
       </w:r>
     </w:p>
     <w:p>
@@ -4253,7 +4376,7 @@
           <w:sz w:val="18"/>
           <w:szCs w:val="18"/>
         </w:rPr>
-        <w:t xml:space="preserve">  │     │   between thresholds          → no change (hysteresis)</w:t>
+        <w:t xml:space="preserve">  │         Every 600 s → run pump for 90 s to circulate water</w:t>
       </w:r>
     </w:p>
     <w:p>
@@ -4269,7 +4392,47 @@
           <w:sz w:val="18"/>
           <w:szCs w:val="18"/>
         </w:rPr>
-        <w:t xml:space="preserve">  │     │</w:t>
+        <w:t xml:space="preserve">  │         so </w:t>
+      </w:r>
+      <w:proofErr w:type="spellStart"/>
+      <w:r>
+        <w:rPr>
+          <w:rFonts w:ascii="Courier New" w:eastAsia="Courier New" w:hAnsi="Courier New" w:cs="Courier New"/>
+          <w:color w:val="333333"/>
+          <w:sz w:val="18"/>
+          <w:szCs w:val="18"/>
+        </w:rPr>
+        <w:t>tFlow</w:t>
+      </w:r>
+      <w:proofErr w:type="spellEnd"/>
+      <w:r>
+        <w:rPr>
+          <w:rFonts w:ascii="Courier New" w:eastAsia="Courier New" w:hAnsi="Courier New" w:cs="Courier New"/>
+          <w:color w:val="333333"/>
+          <w:sz w:val="18"/>
+          <w:szCs w:val="18"/>
+        </w:rPr>
+        <w:t>/</w:t>
+      </w:r>
+      <w:proofErr w:type="spellStart"/>
+      <w:r>
+        <w:rPr>
+          <w:rFonts w:ascii="Courier New" w:eastAsia="Courier New" w:hAnsi="Courier New" w:cs="Courier New"/>
+          <w:color w:val="333333"/>
+          <w:sz w:val="18"/>
+          <w:szCs w:val="18"/>
+        </w:rPr>
+        <w:t>tReturn</w:t>
+      </w:r>
+      <w:proofErr w:type="spellEnd"/>
+      <w:r>
+        <w:rPr>
+          <w:rFonts w:ascii="Courier New" w:eastAsia="Courier New" w:hAnsi="Courier New" w:cs="Courier New"/>
+          <w:color w:val="333333"/>
+          <w:sz w:val="18"/>
+          <w:szCs w:val="18"/>
+        </w:rPr>
+        <w:t xml:space="preserve"> readings reflect actual roof temp</w:t>
       </w:r>
     </w:p>
     <w:p>
@@ -4285,7 +4448,7 @@
           <w:sz w:val="18"/>
           <w:szCs w:val="18"/>
         </w:rPr>
-        <w:t xml:space="preserve">  │     └─ Periodic test</w:t>
+        <w:t xml:space="preserve">  │</w:t>
       </w:r>
     </w:p>
     <w:p>
@@ -4301,23 +4464,7 @@
           <w:sz w:val="18"/>
           <w:szCs w:val="18"/>
         </w:rPr>
-        <w:t xml:space="preserve">  │         Every 600 s → run pump for 90 s to circulate water</w:t>
-      </w:r>
-    </w:p>
-    <w:p>
-      <w:pPr>
-        <w:shd w:val="clear" w:color="auto" w:fill="F5F5F5"/>
-        <w:spacing w:before="40" w:after="40"/>
-        <w:ind w:left="360"/>
-      </w:pPr>
-      <w:r>
-        <w:rPr>
-          <w:rFonts w:ascii="Courier New" w:eastAsia="Courier New" w:hAnsi="Courier New" w:cs="Courier New"/>
-          <w:color w:val="333333"/>
-          <w:sz w:val="18"/>
-          <w:szCs w:val="18"/>
-        </w:rPr>
-        <w:t xml:space="preserve">  │         so </w:t>
+        <w:t xml:space="preserve">  └─4─ _check_publish()         ← publish full state every 30 s</w:t>
       </w:r>
       <w:proofErr w:type="spellStart"/>
       <w:r>
@@ -4327,7 +4474,15 @@
           <w:sz w:val="18"/>
           <w:szCs w:val="18"/>
         </w:rPr>
-        <w:t>tFlow</w:t>
+      </w:r>
+      <w:proofErr w:type="gramStart"/>
+      <w:r>
+        <w:rPr>
+          <w:rFonts w:ascii="Courier New" w:eastAsia="Courier New" w:hAnsi="Courier New" w:cs="Courier New"/>
+          <w:color w:val="333333"/>
+          <w:sz w:val="18"/>
+          <w:szCs w:val="18"/>
+        </w:rPr>
       </w:r>
       <w:proofErr w:type="spellEnd"/>
       <w:r>
@@ -4337,89 +4492,6 @@
           <w:sz w:val="18"/>
           <w:szCs w:val="18"/>
         </w:rPr>
-        <w:t>/</w:t>
-      </w:r>
-      <w:proofErr w:type="spellStart"/>
-      <w:r>
-        <w:rPr>
-          <w:rFonts w:ascii="Courier New" w:eastAsia="Courier New" w:hAnsi="Courier New" w:cs="Courier New"/>
-          <w:color w:val="333333"/>
-          <w:sz w:val="18"/>
-          <w:szCs w:val="18"/>
-        </w:rPr>
-        <w:t>tReturn</w:t>
-      </w:r>
-      <w:proofErr w:type="spellEnd"/>
-      <w:r>
-        <w:rPr>
-          <w:rFonts w:ascii="Courier New" w:eastAsia="Courier New" w:hAnsi="Courier New" w:cs="Courier New"/>
-          <w:color w:val="333333"/>
-          <w:sz w:val="18"/>
-          <w:szCs w:val="18"/>
-        </w:rPr>
-        <w:t xml:space="preserve"> readings reflect actual roof temp</w:t>
-      </w:r>
-    </w:p>
-    <w:p>
-      <w:pPr>
-        <w:shd w:val="clear" w:color="auto" w:fill="F5F5F5"/>
-        <w:spacing w:before="40" w:after="40"/>
-        <w:ind w:left="360"/>
-      </w:pPr>
-      <w:r>
-        <w:rPr>
-          <w:rFonts w:ascii="Courier New" w:eastAsia="Courier New" w:hAnsi="Courier New" w:cs="Courier New"/>
-          <w:color w:val="333333"/>
-          <w:sz w:val="18"/>
-          <w:szCs w:val="18"/>
-        </w:rPr>
-        <w:t xml:space="preserve">  │</w:t>
-      </w:r>
-    </w:p>
-    <w:p>
-      <w:pPr>
-        <w:shd w:val="clear" w:color="auto" w:fill="F5F5F5"/>
-        <w:spacing w:before="40" w:after="40"/>
-        <w:ind w:left="360"/>
-      </w:pPr>
-      <w:r>
-        <w:rPr>
-          <w:rFonts w:ascii="Courier New" w:eastAsia="Courier New" w:hAnsi="Courier New" w:cs="Courier New"/>
-          <w:color w:val="333333"/>
-          <w:sz w:val="18"/>
-          <w:szCs w:val="18"/>
-        </w:rPr>
-        <w:t xml:space="preserve">  └─5─ _</w:t>
-      </w:r>
-      <w:proofErr w:type="spellStart"/>
-      <w:r>
-        <w:rPr>
-          <w:rFonts w:ascii="Courier New" w:eastAsia="Courier New" w:hAnsi="Courier New" w:cs="Courier New"/>
-          <w:color w:val="333333"/>
-          <w:sz w:val="18"/>
-          <w:szCs w:val="18"/>
-        </w:rPr>
-        <w:t>check_</w:t>
-      </w:r>
-      <w:proofErr w:type="gramStart"/>
-      <w:r>
-        <w:rPr>
-          <w:rFonts w:ascii="Courier New" w:eastAsia="Courier New" w:hAnsi="Courier New" w:cs="Courier New"/>
-          <w:color w:val="333333"/>
-          <w:sz w:val="18"/>
-          <w:szCs w:val="18"/>
-        </w:rPr>
-        <w:t>publish</w:t>
-      </w:r>
-      <w:proofErr w:type="spellEnd"/>
-      <w:r>
-        <w:rPr>
-          <w:rFonts w:ascii="Courier New" w:eastAsia="Courier New" w:hAnsi="Courier New" w:cs="Courier New"/>
-          <w:color w:val="333333"/>
-          <w:sz w:val="18"/>
-          <w:szCs w:val="18"/>
-        </w:rPr>
-        <w:t>(</w:t>
       </w:r>
       <w:proofErr w:type="gramEnd"/>
       <w:r>
@@ -4429,7 +4501,6 @@
           <w:sz w:val="18"/>
           <w:szCs w:val="18"/>
         </w:rPr>
-        <w:t>)         ← publish full state every 30 s</w:t>
       </w:r>
     </w:p>
     <w:p>
@@ -10155,7 +10226,7 @@
               <w:bottom w:val="single" w:sz="1" w:space="0" w:color="CCCCCC"/>
               <w:right w:val="single" w:sz="1" w:space="0" w:color="CCCCCC"/>
             </w:tcBorders>
-            <w:shd w:val="clear" w:color="auto" w:fill="F2F2F2"/>
+            <w:shd w:val="clear" w:color="auto" w:fill="FFFFFF"/>
             <w:tcMar>
               <w:top w:w="80" w:type="dxa"/>
               <w:left w:w="120" w:type="dxa"/>
@@ -10171,7 +10242,7 @@
                 <w:sz w:val="18"/>
                 <w:szCs w:val="18"/>
               </w:rPr>
-              <w:t>daily_runtime_sec</w:t>
+              <w:t>time_to_next_test</w:t>
             </w:r>
             <w:proofErr w:type="spellEnd"/>
           </w:p>
@@ -10185,7 +10256,7 @@
               <w:bottom w:val="single" w:sz="1" w:space="0" w:color="CCCCCC"/>
               <w:right w:val="single" w:sz="1" w:space="0" w:color="CCCCCC"/>
             </w:tcBorders>
-            <w:shd w:val="clear" w:color="auto" w:fill="F2F2F2"/>
+            <w:shd w:val="clear" w:color="auto" w:fill="FFFFFF"/>
             <w:tcMar>
               <w:top w:w="80" w:type="dxa"/>
               <w:left w:w="120" w:type="dxa"/>
@@ -10212,21 +10283,21 @@
               <w:bottom w:val="single" w:sz="1" w:space="0" w:color="CCCCCC"/>
               <w:right w:val="single" w:sz="1" w:space="0" w:color="CCCCCC"/>
             </w:tcBorders>
-            <w:shd w:val="clear" w:color="auto" w:fill="F2F2F2"/>
-            <w:tcMar>
-              <w:top w:w="80" w:type="dxa"/>
-              <w:left w:w="120" w:type="dxa"/>
-              <w:bottom w:w="80" w:type="dxa"/>
-              <w:right w:w="120" w:type="dxa"/>
-            </w:tcMar>
-          </w:tcPr>
-          <w:p>
-            <w:r>
-              <w:rPr>
-                <w:sz w:val="18"/>
-                <w:szCs w:val="18"/>
-              </w:rPr>
-              <w:t>Pump-on seconds today (resets at midnight)</w:t>
+            <w:shd w:val="clear" w:color="auto" w:fill="FFFFFF"/>
+            <w:tcMar>
+              <w:top w:w="80" w:type="dxa"/>
+              <w:left w:w="120" w:type="dxa"/>
+              <w:bottom w:w="80" w:type="dxa"/>
+              <w:right w:w="120" w:type="dxa"/>
+            </w:tcMar>
+          </w:tcPr>
+          <w:p>
+            <w:r>
+              <w:rPr>
+                <w:sz w:val="18"/>
+                <w:szCs w:val="18"/>
+              </w:rPr>
+              <w:t>Seconds until next periodic test (computed)</w:t>
             </w:r>
           </w:p>
         </w:tc>
@@ -10247,7 +10318,62 @@
               <w:bottom w:val="single" w:sz="1" w:space="0" w:color="CCCCCC"/>
               <w:right w:val="single" w:sz="1" w:space="0" w:color="CCCCCC"/>
             </w:tcBorders>
-            <w:shd w:val="clear" w:color="auto" w:fill="FFFFFF"/>
+            <w:shd w:val="clear" w:color="auto" w:fill="F2F2F2"/>
+            <w:tcMar>
+              <w:top w:w="80" w:type="dxa"/>
+              <w:left w:w="120" w:type="dxa"/>
+              <w:bottom w:w="80" w:type="dxa"/>
+              <w:right w:w="120" w:type="dxa"/>
+            </w:tcMar>
+          </w:tcPr>
+          <w:p>
+            <w:r>
+              <w:rPr>
+                <w:rFonts w:ascii="Courier New" w:eastAsia="Courier New" w:hAnsi="Courier New" w:cs="Courier New"/>
+                <w:sz w:val="18"/>
+                <w:szCs w:val="18"/>
+              </w:rPr>
+              <w:t>temps</w:t>
+            </w:r>
+          </w:p>
+        </w:tc>
+        <w:tc>
+          <w:tcPr>
+            <w:tcW w:w="1440" w:type="dxa"/>
+            <w:tcBorders>
+              <w:top w:val="single" w:sz="1" w:space="0" w:color="CCCCCC"/>
+              <w:left w:val="single" w:sz="1" w:space="0" w:color="CCCCCC"/>
+              <w:bottom w:val="single" w:sz="1" w:space="0" w:color="CCCCCC"/>
+              <w:right w:val="single" w:sz="1" w:space="0" w:color="CCCCCC"/>
+            </w:tcBorders>
+            <w:shd w:val="clear" w:color="auto" w:fill="F2F2F2"/>
+            <w:tcMar>
+              <w:top w:w="80" w:type="dxa"/>
+              <w:left w:w="120" w:type="dxa"/>
+              <w:bottom w:w="80" w:type="dxa"/>
+              <w:right w:w="120" w:type="dxa"/>
+            </w:tcMar>
+          </w:tcPr>
+          <w:p>
+            <w:r>
+              <w:rPr>
+                <w:sz w:val="18"/>
+                <w:szCs w:val="18"/>
+              </w:rPr>
+              <w:t>{}</w:t>
+            </w:r>
+          </w:p>
+        </w:tc>
+        <w:tc>
+          <w:tcPr>
+            <w:tcW w:w="5220" w:type="dxa"/>
+            <w:tcBorders>
+              <w:top w:val="single" w:sz="1" w:space="0" w:color="CCCCCC"/>
+              <w:left w:val="single" w:sz="1" w:space="0" w:color="CCCCCC"/>
+              <w:bottom w:val="single" w:sz="1" w:space="0" w:color="CCCCCC"/>
+              <w:right w:val="single" w:sz="1" w:space="0" w:color="CCCCCC"/>
+            </w:tcBorders>
+            <w:shd w:val="clear" w:color="auto" w:fill="F2F2F2"/>
             <w:tcMar>
               <w:top w:w="80" w:type="dxa"/>
               <w:left w:w="120" w:type="dxa"/>
@@ -10259,66 +10385,18 @@
             <w:proofErr w:type="spellStart"/>
             <w:r>
               <w:rPr>
-                <w:rFonts w:ascii="Courier New" w:eastAsia="Courier New" w:hAnsi="Courier New" w:cs="Courier New"/>
-                <w:sz w:val="18"/>
-                <w:szCs w:val="18"/>
-              </w:rPr>
-              <w:t>time_to_next_test</w:t>
+                <w:sz w:val="18"/>
+                <w:szCs w:val="18"/>
+              </w:rPr>
+              <w:t>Dict</w:t>
             </w:r>
             <w:proofErr w:type="spellEnd"/>
-          </w:p>
-        </w:tc>
-        <w:tc>
-          <w:tcPr>
-            <w:tcW w:w="1440" w:type="dxa"/>
-            <w:tcBorders>
-              <w:top w:val="single" w:sz="1" w:space="0" w:color="CCCCCC"/>
-              <w:left w:val="single" w:sz="1" w:space="0" w:color="CCCCCC"/>
-              <w:bottom w:val="single" w:sz="1" w:space="0" w:color="CCCCCC"/>
-              <w:right w:val="single" w:sz="1" w:space="0" w:color="CCCCCC"/>
-            </w:tcBorders>
-            <w:shd w:val="clear" w:color="auto" w:fill="FFFFFF"/>
-            <w:tcMar>
-              <w:top w:w="80" w:type="dxa"/>
-              <w:left w:w="120" w:type="dxa"/>
-              <w:bottom w:w="80" w:type="dxa"/>
-              <w:right w:w="120" w:type="dxa"/>
-            </w:tcMar>
-          </w:tcPr>
-          <w:p>
-            <w:r>
-              <w:rPr>
-                <w:sz w:val="18"/>
-                <w:szCs w:val="18"/>
-              </w:rPr>
-              <w:t>0</w:t>
-            </w:r>
-          </w:p>
-        </w:tc>
-        <w:tc>
-          <w:tcPr>
-            <w:tcW w:w="5220" w:type="dxa"/>
-            <w:tcBorders>
-              <w:top w:val="single" w:sz="1" w:space="0" w:color="CCCCCC"/>
-              <w:left w:val="single" w:sz="1" w:space="0" w:color="CCCCCC"/>
-              <w:bottom w:val="single" w:sz="1" w:space="0" w:color="CCCCCC"/>
-              <w:right w:val="single" w:sz="1" w:space="0" w:color="CCCCCC"/>
-            </w:tcBorders>
-            <w:shd w:val="clear" w:color="auto" w:fill="FFFFFF"/>
-            <w:tcMar>
-              <w:top w:w="80" w:type="dxa"/>
-              <w:left w:w="120" w:type="dxa"/>
-              <w:bottom w:w="80" w:type="dxa"/>
-              <w:right w:w="120" w:type="dxa"/>
-            </w:tcMar>
-          </w:tcPr>
-          <w:p>
-            <w:r>
-              <w:rPr>
-                <w:sz w:val="18"/>
-                <w:szCs w:val="18"/>
-              </w:rPr>
-              <w:t>Seconds until next periodic test (computed)</w:t>
+            <w:r>
+              <w:rPr>
+                <w:sz w:val="18"/>
+                <w:szCs w:val="18"/>
+              </w:rPr>
+              <w:t xml:space="preserve"> of label → temperature °C</w:t>
             </w:r>
           </w:p>
         </w:tc>
@@ -10339,23 +10417,25 @@
               <w:bottom w:val="single" w:sz="1" w:space="0" w:color="CCCCCC"/>
               <w:right w:val="single" w:sz="1" w:space="0" w:color="CCCCCC"/>
             </w:tcBorders>
-            <w:shd w:val="clear" w:color="auto" w:fill="F2F2F2"/>
-            <w:tcMar>
-              <w:top w:w="80" w:type="dxa"/>
-              <w:left w:w="120" w:type="dxa"/>
-              <w:bottom w:w="80" w:type="dxa"/>
-              <w:right w:w="120" w:type="dxa"/>
-            </w:tcMar>
-          </w:tcPr>
-          <w:p>
+            <w:shd w:val="clear" w:color="auto" w:fill="FFFFFF"/>
+            <w:tcMar>
+              <w:top w:w="80" w:type="dxa"/>
+              <w:left w:w="120" w:type="dxa"/>
+              <w:bottom w:w="80" w:type="dxa"/>
+              <w:right w:w="120" w:type="dxa"/>
+            </w:tcMar>
+          </w:tcPr>
+          <w:p>
+            <w:proofErr w:type="spellStart"/>
             <w:r>
               <w:rPr>
                 <w:rFonts w:ascii="Courier New" w:eastAsia="Courier New" w:hAnsi="Courier New" w:cs="Courier New"/>
                 <w:sz w:val="18"/>
                 <w:szCs w:val="18"/>
               </w:rPr>
-              <w:t>temps</w:t>
-            </w:r>
+              <w:t>water_level_ok</w:t>
+            </w:r>
+            <w:proofErr w:type="spellEnd"/>
           </w:p>
         </w:tc>
         <w:tc>
@@ -10367,21 +10447,21 @@
               <w:bottom w:val="single" w:sz="1" w:space="0" w:color="CCCCCC"/>
               <w:right w:val="single" w:sz="1" w:space="0" w:color="CCCCCC"/>
             </w:tcBorders>
-            <w:shd w:val="clear" w:color="auto" w:fill="F2F2F2"/>
-            <w:tcMar>
-              <w:top w:w="80" w:type="dxa"/>
-              <w:left w:w="120" w:type="dxa"/>
-              <w:bottom w:w="80" w:type="dxa"/>
-              <w:right w:w="120" w:type="dxa"/>
-            </w:tcMar>
-          </w:tcPr>
-          <w:p>
-            <w:r>
-              <w:rPr>
-                <w:sz w:val="18"/>
-                <w:szCs w:val="18"/>
-              </w:rPr>
-              <w:t>{}</w:t>
+            <w:shd w:val="clear" w:color="auto" w:fill="FFFFFF"/>
+            <w:tcMar>
+              <w:top w:w="80" w:type="dxa"/>
+              <w:left w:w="120" w:type="dxa"/>
+              <w:bottom w:w="80" w:type="dxa"/>
+              <w:right w:w="120" w:type="dxa"/>
+            </w:tcMar>
+          </w:tcPr>
+          <w:p>
+            <w:r>
+              <w:rPr>
+                <w:sz w:val="18"/>
+                <w:szCs w:val="18"/>
+              </w:rPr>
+              <w:t>False</w:t>
             </w:r>
           </w:p>
         </w:tc>
@@ -10394,30 +10474,21 @@
               <w:bottom w:val="single" w:sz="1" w:space="0" w:color="CCCCCC"/>
               <w:right w:val="single" w:sz="1" w:space="0" w:color="CCCCCC"/>
             </w:tcBorders>
-            <w:shd w:val="clear" w:color="auto" w:fill="F2F2F2"/>
-            <w:tcMar>
-              <w:top w:w="80" w:type="dxa"/>
-              <w:left w:w="120" w:type="dxa"/>
-              <w:bottom w:w="80" w:type="dxa"/>
-              <w:right w:w="120" w:type="dxa"/>
-            </w:tcMar>
-          </w:tcPr>
-          <w:p>
-            <w:proofErr w:type="spellStart"/>
-            <w:r>
-              <w:rPr>
-                <w:sz w:val="18"/>
-                <w:szCs w:val="18"/>
-              </w:rPr>
-              <w:t>Dict</w:t>
-            </w:r>
-            <w:proofErr w:type="spellEnd"/>
-            <w:r>
-              <w:rPr>
-                <w:sz w:val="18"/>
-                <w:szCs w:val="18"/>
-              </w:rPr>
-              <w:t xml:space="preserve"> of label → temperature °C</w:t>
+            <w:shd w:val="clear" w:color="auto" w:fill="FFFFFF"/>
+            <w:tcMar>
+              <w:top w:w="80" w:type="dxa"/>
+              <w:left w:w="120" w:type="dxa"/>
+              <w:bottom w:w="80" w:type="dxa"/>
+              <w:right w:w="120" w:type="dxa"/>
+            </w:tcMar>
+          </w:tcPr>
+          <w:p>
+            <w:r>
+              <w:rPr>
+                <w:sz w:val="18"/>
+                <w:szCs w:val="18"/>
+              </w:rPr>
+              <w:t>FAIL-SAFE: False until sensor confirms wet</w:t>
             </w:r>
           </w:p>
         </w:tc>
@@ -10438,7 +10509,7 @@
               <w:bottom w:val="single" w:sz="1" w:space="0" w:color="CCCCCC"/>
               <w:right w:val="single" w:sz="1" w:space="0" w:color="CCCCCC"/>
             </w:tcBorders>
-            <w:shd w:val="clear" w:color="auto" w:fill="FFFFFF"/>
+            <w:shd w:val="clear" w:color="auto" w:fill="F2F2F2"/>
             <w:tcMar>
               <w:top w:w="80" w:type="dxa"/>
               <w:left w:w="120" w:type="dxa"/>
@@ -10454,7 +10525,7 @@
                 <w:sz w:val="18"/>
                 <w:szCs w:val="18"/>
               </w:rPr>
-              <w:t>water_level_ok</w:t>
+              <w:t>sensors_ok</w:t>
             </w:r>
             <w:proofErr w:type="spellEnd"/>
           </w:p>
@@ -10468,7 +10539,7 @@
               <w:bottom w:val="single" w:sz="1" w:space="0" w:color="CCCCCC"/>
               <w:right w:val="single" w:sz="1" w:space="0" w:color="CCCCCC"/>
             </w:tcBorders>
-            <w:shd w:val="clear" w:color="auto" w:fill="FFFFFF"/>
+            <w:shd w:val="clear" w:color="auto" w:fill="F2F2F2"/>
             <w:tcMar>
               <w:top w:w="80" w:type="dxa"/>
               <w:left w:w="120" w:type="dxa"/>
@@ -10495,21 +10566,21 @@
               <w:bottom w:val="single" w:sz="1" w:space="0" w:color="CCCCCC"/>
               <w:right w:val="single" w:sz="1" w:space="0" w:color="CCCCCC"/>
             </w:tcBorders>
-            <w:shd w:val="clear" w:color="auto" w:fill="FFFFFF"/>
-            <w:tcMar>
-              <w:top w:w="80" w:type="dxa"/>
-              <w:left w:w="120" w:type="dxa"/>
-              <w:bottom w:w="80" w:type="dxa"/>
-              <w:right w:w="120" w:type="dxa"/>
-            </w:tcMar>
-          </w:tcPr>
-          <w:p>
-            <w:r>
-              <w:rPr>
-                <w:sz w:val="18"/>
-                <w:szCs w:val="18"/>
-              </w:rPr>
-              <w:t>FAIL-SAFE: False until sensor confirms wet</w:t>
+            <w:shd w:val="clear" w:color="auto" w:fill="F2F2F2"/>
+            <w:tcMar>
+              <w:top w:w="80" w:type="dxa"/>
+              <w:left w:w="120" w:type="dxa"/>
+              <w:bottom w:w="80" w:type="dxa"/>
+              <w:right w:w="120" w:type="dxa"/>
+            </w:tcMar>
+          </w:tcPr>
+          <w:p>
+            <w:r>
+              <w:rPr>
+                <w:sz w:val="18"/>
+                <w:szCs w:val="18"/>
+              </w:rPr>
+              <w:t>FAIL-SAFE: False until all sensors report</w:t>
             </w:r>
           </w:p>
         </w:tc>
@@ -10530,7 +10601,7 @@
               <w:bottom w:val="single" w:sz="1" w:space="0" w:color="CCCCCC"/>
               <w:right w:val="single" w:sz="1" w:space="0" w:color="CCCCCC"/>
             </w:tcBorders>
-            <w:shd w:val="clear" w:color="auto" w:fill="F2F2F2"/>
+            <w:shd w:val="clear" w:color="auto" w:fill="FFFFFF"/>
             <w:tcMar>
               <w:top w:w="80" w:type="dxa"/>
               <w:left w:w="120" w:type="dxa"/>
@@ -10546,7 +10617,7 @@
                 <w:sz w:val="18"/>
                 <w:szCs w:val="18"/>
               </w:rPr>
-              <w:t>sensors_ok</w:t>
+              <w:t>disconnected_sensors</w:t>
             </w:r>
             <w:proofErr w:type="spellEnd"/>
           </w:p>
@@ -10560,21 +10631,21 @@
               <w:bottom w:val="single" w:sz="1" w:space="0" w:color="CCCCCC"/>
               <w:right w:val="single" w:sz="1" w:space="0" w:color="CCCCCC"/>
             </w:tcBorders>
-            <w:shd w:val="clear" w:color="auto" w:fill="F2F2F2"/>
-            <w:tcMar>
-              <w:top w:w="80" w:type="dxa"/>
-              <w:left w:w="120" w:type="dxa"/>
-              <w:bottom w:w="80" w:type="dxa"/>
-              <w:right w:w="120" w:type="dxa"/>
-            </w:tcMar>
-          </w:tcPr>
-          <w:p>
-            <w:r>
-              <w:rPr>
-                <w:sz w:val="18"/>
-                <w:szCs w:val="18"/>
-              </w:rPr>
-              <w:t>False</w:t>
+            <w:shd w:val="clear" w:color="auto" w:fill="FFFFFF"/>
+            <w:tcMar>
+              <w:top w:w="80" w:type="dxa"/>
+              <w:left w:w="120" w:type="dxa"/>
+              <w:bottom w:w="80" w:type="dxa"/>
+              <w:right w:w="120" w:type="dxa"/>
+            </w:tcMar>
+          </w:tcPr>
+          <w:p>
+            <w:r>
+              <w:rPr>
+                <w:sz w:val="18"/>
+                <w:szCs w:val="18"/>
+              </w:rPr>
+              <w:t>[]</w:t>
             </w:r>
           </w:p>
         </w:tc>
@@ -10587,21 +10658,21 @@
               <w:bottom w:val="single" w:sz="1" w:space="0" w:color="CCCCCC"/>
               <w:right w:val="single" w:sz="1" w:space="0" w:color="CCCCCC"/>
             </w:tcBorders>
-            <w:shd w:val="clear" w:color="auto" w:fill="F2F2F2"/>
-            <w:tcMar>
-              <w:top w:w="80" w:type="dxa"/>
-              <w:left w:w="120" w:type="dxa"/>
-              <w:bottom w:w="80" w:type="dxa"/>
-              <w:right w:w="120" w:type="dxa"/>
-            </w:tcMar>
-          </w:tcPr>
-          <w:p>
-            <w:r>
-              <w:rPr>
-                <w:sz w:val="18"/>
-                <w:szCs w:val="18"/>
-              </w:rPr>
-              <w:t>FAIL-SAFE: False until all sensors report</w:t>
+            <w:shd w:val="clear" w:color="auto" w:fill="FFFFFF"/>
+            <w:tcMar>
+              <w:top w:w="80" w:type="dxa"/>
+              <w:left w:w="120" w:type="dxa"/>
+              <w:bottom w:w="80" w:type="dxa"/>
+              <w:right w:w="120" w:type="dxa"/>
+            </w:tcMar>
+          </w:tcPr>
+          <w:p>
+            <w:r>
+              <w:rPr>
+                <w:sz w:val="18"/>
+                <w:szCs w:val="18"/>
+              </w:rPr>
+              <w:t>Labels of sensors that failed last read</w:t>
             </w:r>
           </w:p>
         </w:tc>
@@ -10622,7 +10693,7 @@
               <w:bottom w:val="single" w:sz="1" w:space="0" w:color="CCCCCC"/>
               <w:right w:val="single" w:sz="1" w:space="0" w:color="CCCCCC"/>
             </w:tcBorders>
-            <w:shd w:val="clear" w:color="auto" w:fill="FFFFFF"/>
+            <w:shd w:val="clear" w:color="auto" w:fill="F2F2F2"/>
             <w:tcMar>
               <w:top w:w="80" w:type="dxa"/>
               <w:left w:w="120" w:type="dxa"/>
@@ -10638,7 +10709,7 @@
                 <w:sz w:val="18"/>
                 <w:szCs w:val="18"/>
               </w:rPr>
-              <w:t>disconnected_sensors</w:t>
+              <w:t>wifi_connected</w:t>
             </w:r>
             <w:proofErr w:type="spellEnd"/>
           </w:p>
@@ -10652,21 +10723,21 @@
               <w:bottom w:val="single" w:sz="1" w:space="0" w:color="CCCCCC"/>
               <w:right w:val="single" w:sz="1" w:space="0" w:color="CCCCCC"/>
             </w:tcBorders>
-            <w:shd w:val="clear" w:color="auto" w:fill="FFFFFF"/>
-            <w:tcMar>
-              <w:top w:w="80" w:type="dxa"/>
-              <w:left w:w="120" w:type="dxa"/>
-              <w:bottom w:w="80" w:type="dxa"/>
-              <w:right w:w="120" w:type="dxa"/>
-            </w:tcMar>
-          </w:tcPr>
-          <w:p>
-            <w:r>
-              <w:rPr>
-                <w:sz w:val="18"/>
-                <w:szCs w:val="18"/>
-              </w:rPr>
-              <w:t>[]</w:t>
+            <w:shd w:val="clear" w:color="auto" w:fill="F2F2F2"/>
+            <w:tcMar>
+              <w:top w:w="80" w:type="dxa"/>
+              <w:left w:w="120" w:type="dxa"/>
+              <w:bottom w:w="80" w:type="dxa"/>
+              <w:right w:w="120" w:type="dxa"/>
+            </w:tcMar>
+          </w:tcPr>
+          <w:p>
+            <w:r>
+              <w:rPr>
+                <w:sz w:val="18"/>
+                <w:szCs w:val="18"/>
+              </w:rPr>
+              <w:t>False</w:t>
             </w:r>
           </w:p>
         </w:tc>
@@ -10679,21 +10750,30 @@
               <w:bottom w:val="single" w:sz="1" w:space="0" w:color="CCCCCC"/>
               <w:right w:val="single" w:sz="1" w:space="0" w:color="CCCCCC"/>
             </w:tcBorders>
-            <w:shd w:val="clear" w:color="auto" w:fill="FFFFFF"/>
-            <w:tcMar>
-              <w:top w:w="80" w:type="dxa"/>
-              <w:left w:w="120" w:type="dxa"/>
-              <w:bottom w:w="80" w:type="dxa"/>
-              <w:right w:w="120" w:type="dxa"/>
-            </w:tcMar>
-          </w:tcPr>
-          <w:p>
-            <w:r>
-              <w:rPr>
-                <w:sz w:val="18"/>
-                <w:szCs w:val="18"/>
-              </w:rPr>
-              <w:t>Labels of sensors that failed last read</w:t>
+            <w:shd w:val="clear" w:color="auto" w:fill="F2F2F2"/>
+            <w:tcMar>
+              <w:top w:w="80" w:type="dxa"/>
+              <w:left w:w="120" w:type="dxa"/>
+              <w:bottom w:w="80" w:type="dxa"/>
+              <w:right w:w="120" w:type="dxa"/>
+            </w:tcMar>
+          </w:tcPr>
+          <w:p>
+            <w:proofErr w:type="spellStart"/>
+            <w:r>
+              <w:rPr>
+                <w:sz w:val="18"/>
+                <w:szCs w:val="18"/>
+              </w:rPr>
+              <w:t>WiFi</w:t>
+            </w:r>
+            <w:proofErr w:type="spellEnd"/>
+            <w:r>
+              <w:rPr>
+                <w:sz w:val="18"/>
+                <w:szCs w:val="18"/>
+              </w:rPr>
+              <w:t xml:space="preserve"> connection state</w:t>
             </w:r>
           </w:p>
         </w:tc>
@@ -10714,7 +10794,7 @@
               <w:bottom w:val="single" w:sz="1" w:space="0" w:color="CCCCCC"/>
               <w:right w:val="single" w:sz="1" w:space="0" w:color="CCCCCC"/>
             </w:tcBorders>
-            <w:shd w:val="clear" w:color="auto" w:fill="F2F2F2"/>
+            <w:shd w:val="clear" w:color="auto" w:fill="FFFFFF"/>
             <w:tcMar>
               <w:top w:w="80" w:type="dxa"/>
               <w:left w:w="120" w:type="dxa"/>
@@ -10730,7 +10810,7 @@
                 <w:sz w:val="18"/>
                 <w:szCs w:val="18"/>
               </w:rPr>
-              <w:t>wifi_connected</w:t>
+              <w:t>mqtt_connected</w:t>
             </w:r>
             <w:proofErr w:type="spellEnd"/>
           </w:p>
@@ -10744,7 +10824,7 @@
               <w:bottom w:val="single" w:sz="1" w:space="0" w:color="CCCCCC"/>
               <w:right w:val="single" w:sz="1" w:space="0" w:color="CCCCCC"/>
             </w:tcBorders>
-            <w:shd w:val="clear" w:color="auto" w:fill="F2F2F2"/>
+            <w:shd w:val="clear" w:color="auto" w:fill="FFFFFF"/>
             <w:tcMar>
               <w:top w:w="80" w:type="dxa"/>
               <w:left w:w="120" w:type="dxa"/>
@@ -10771,30 +10851,21 @@
               <w:bottom w:val="single" w:sz="1" w:space="0" w:color="CCCCCC"/>
               <w:right w:val="single" w:sz="1" w:space="0" w:color="CCCCCC"/>
             </w:tcBorders>
-            <w:shd w:val="clear" w:color="auto" w:fill="F2F2F2"/>
-            <w:tcMar>
-              <w:top w:w="80" w:type="dxa"/>
-              <w:left w:w="120" w:type="dxa"/>
-              <w:bottom w:w="80" w:type="dxa"/>
-              <w:right w:w="120" w:type="dxa"/>
-            </w:tcMar>
-          </w:tcPr>
-          <w:p>
-            <w:proofErr w:type="spellStart"/>
-            <w:r>
-              <w:rPr>
-                <w:sz w:val="18"/>
-                <w:szCs w:val="18"/>
-              </w:rPr>
-              <w:t>WiFi</w:t>
-            </w:r>
-            <w:proofErr w:type="spellEnd"/>
-            <w:r>
-              <w:rPr>
-                <w:sz w:val="18"/>
-                <w:szCs w:val="18"/>
-              </w:rPr>
-              <w:t xml:space="preserve"> connection state</w:t>
+            <w:shd w:val="clear" w:color="auto" w:fill="FFFFFF"/>
+            <w:tcMar>
+              <w:top w:w="80" w:type="dxa"/>
+              <w:left w:w="120" w:type="dxa"/>
+              <w:bottom w:w="80" w:type="dxa"/>
+              <w:right w:w="120" w:type="dxa"/>
+            </w:tcMar>
+          </w:tcPr>
+          <w:p>
+            <w:r>
+              <w:rPr>
+                <w:sz w:val="18"/>
+                <w:szCs w:val="18"/>
+              </w:rPr>
+              <w:t>MQTT connection state</w:t>
             </w:r>
           </w:p>
         </w:tc>
@@ -10815,7 +10886,7 @@
               <w:bottom w:val="single" w:sz="1" w:space="0" w:color="CCCCCC"/>
               <w:right w:val="single" w:sz="1" w:space="0" w:color="CCCCCC"/>
             </w:tcBorders>
-            <w:shd w:val="clear" w:color="auto" w:fill="FFFFFF"/>
+            <w:shd w:val="clear" w:color="auto" w:fill="F2F2F2"/>
             <w:tcMar>
               <w:top w:w="80" w:type="dxa"/>
               <w:left w:w="120" w:type="dxa"/>
@@ -10831,7 +10902,7 @@
                 <w:sz w:val="18"/>
                 <w:szCs w:val="18"/>
               </w:rPr>
-              <w:t>mqtt_connected</w:t>
+              <w:t>overtemp_shutdown</w:t>
             </w:r>
             <w:proofErr w:type="spellEnd"/>
           </w:p>
@@ -10845,7 +10916,7 @@
               <w:bottom w:val="single" w:sz="1" w:space="0" w:color="CCCCCC"/>
               <w:right w:val="single" w:sz="1" w:space="0" w:color="CCCCCC"/>
             </w:tcBorders>
-            <w:shd w:val="clear" w:color="auto" w:fill="FFFFFF"/>
+            <w:shd w:val="clear" w:color="auto" w:fill="F2F2F2"/>
             <w:tcMar>
               <w:top w:w="80" w:type="dxa"/>
               <w:left w:w="120" w:type="dxa"/>
@@ -10872,21 +10943,21 @@
               <w:bottom w:val="single" w:sz="1" w:space="0" w:color="CCCCCC"/>
               <w:right w:val="single" w:sz="1" w:space="0" w:color="CCCCCC"/>
             </w:tcBorders>
-            <w:shd w:val="clear" w:color="auto" w:fill="FFFFFF"/>
-            <w:tcMar>
-              <w:top w:w="80" w:type="dxa"/>
-              <w:left w:w="120" w:type="dxa"/>
-              <w:bottom w:w="80" w:type="dxa"/>
-              <w:right w:w="120" w:type="dxa"/>
-            </w:tcMar>
-          </w:tcPr>
-          <w:p>
-            <w:r>
-              <w:rPr>
-                <w:sz w:val="18"/>
-                <w:szCs w:val="18"/>
-              </w:rPr>
-              <w:t>MQTT connection state</w:t>
+            <w:shd w:val="clear" w:color="auto" w:fill="F2F2F2"/>
+            <w:tcMar>
+              <w:top w:w="80" w:type="dxa"/>
+              <w:left w:w="120" w:type="dxa"/>
+              <w:bottom w:w="80" w:type="dxa"/>
+              <w:right w:w="120" w:type="dxa"/>
+            </w:tcMar>
+          </w:tcPr>
+          <w:p>
+            <w:r>
+              <w:rPr>
+                <w:sz w:val="18"/>
+                <w:szCs w:val="18"/>
+              </w:rPr>
+              <w:t>Enclosure temperature exceeded limit</w:t>
             </w:r>
           </w:p>
         </w:tc>
@@ -10907,7 +10978,7 @@
               <w:bottom w:val="single" w:sz="1" w:space="0" w:color="CCCCCC"/>
               <w:right w:val="single" w:sz="1" w:space="0" w:color="CCCCCC"/>
             </w:tcBorders>
-            <w:shd w:val="clear" w:color="auto" w:fill="F2F2F2"/>
+            <w:shd w:val="clear" w:color="auto" w:fill="FFFFFF"/>
             <w:tcMar>
               <w:top w:w="80" w:type="dxa"/>
               <w:left w:w="120" w:type="dxa"/>
@@ -10923,7 +10994,7 @@
                 <w:sz w:val="18"/>
                 <w:szCs w:val="18"/>
               </w:rPr>
-              <w:t>overtemp_shutdown</w:t>
+              <w:t>dry_run_protect</w:t>
             </w:r>
             <w:proofErr w:type="spellEnd"/>
           </w:p>
@@ -10937,7 +11008,7 @@
               <w:bottom w:val="single" w:sz="1" w:space="0" w:color="CCCCCC"/>
               <w:right w:val="single" w:sz="1" w:space="0" w:color="CCCCCC"/>
             </w:tcBorders>
-            <w:shd w:val="clear" w:color="auto" w:fill="F2F2F2"/>
+            <w:shd w:val="clear" w:color="auto" w:fill="FFFFFF"/>
             <w:tcMar>
               <w:top w:w="80" w:type="dxa"/>
               <w:left w:w="120" w:type="dxa"/>
@@ -10964,21 +11035,21 @@
               <w:bottom w:val="single" w:sz="1" w:space="0" w:color="CCCCCC"/>
               <w:right w:val="single" w:sz="1" w:space="0" w:color="CCCCCC"/>
             </w:tcBorders>
-            <w:shd w:val="clear" w:color="auto" w:fill="F2F2F2"/>
-            <w:tcMar>
-              <w:top w:w="80" w:type="dxa"/>
-              <w:left w:w="120" w:type="dxa"/>
-              <w:bottom w:w="80" w:type="dxa"/>
-              <w:right w:w="120" w:type="dxa"/>
-            </w:tcMar>
-          </w:tcPr>
-          <w:p>
-            <w:r>
-              <w:rPr>
-                <w:sz w:val="18"/>
-                <w:szCs w:val="18"/>
-              </w:rPr>
-              <w:t>Enclosure temperature exceeded limit</w:t>
+            <w:shd w:val="clear" w:color="auto" w:fill="FFFFFF"/>
+            <w:tcMar>
+              <w:top w:w="80" w:type="dxa"/>
+              <w:left w:w="120" w:type="dxa"/>
+              <w:bottom w:w="80" w:type="dxa"/>
+              <w:right w:w="120" w:type="dxa"/>
+            </w:tcMar>
+          </w:tcPr>
+          <w:p>
+            <w:r>
+              <w:rPr>
+                <w:sz w:val="18"/>
+                <w:szCs w:val="18"/>
+              </w:rPr>
+              <w:t>Pump stopped due to low water level</w:t>
             </w:r>
           </w:p>
         </w:tc>
@@ -10999,7 +11070,7 @@
               <w:bottom w:val="single" w:sz="1" w:space="0" w:color="CCCCCC"/>
               <w:right w:val="single" w:sz="1" w:space="0" w:color="CCCCCC"/>
             </w:tcBorders>
-            <w:shd w:val="clear" w:color="auto" w:fill="FFFFFF"/>
+            <w:shd w:val="clear" w:color="auto" w:fill="F2F2F2"/>
             <w:tcMar>
               <w:top w:w="80" w:type="dxa"/>
               <w:left w:w="120" w:type="dxa"/>
@@ -11015,7 +11086,7 @@
                 <w:sz w:val="18"/>
                 <w:szCs w:val="18"/>
               </w:rPr>
-              <w:t>dry_run_protect</w:t>
+              <w:t>enclosure_sensor_missing</w:t>
             </w:r>
             <w:proofErr w:type="spellEnd"/>
           </w:p>
@@ -11029,7 +11100,7 @@
               <w:bottom w:val="single" w:sz="1" w:space="0" w:color="CCCCCC"/>
               <w:right w:val="single" w:sz="1" w:space="0" w:color="CCCCCC"/>
             </w:tcBorders>
-            <w:shd w:val="clear" w:color="auto" w:fill="FFFFFF"/>
+            <w:shd w:val="clear" w:color="auto" w:fill="F2F2F2"/>
             <w:tcMar>
               <w:top w:w="80" w:type="dxa"/>
               <w:left w:w="120" w:type="dxa"/>
@@ -11056,21 +11127,37 @@
               <w:bottom w:val="single" w:sz="1" w:space="0" w:color="CCCCCC"/>
               <w:right w:val="single" w:sz="1" w:space="0" w:color="CCCCCC"/>
             </w:tcBorders>
-            <w:shd w:val="clear" w:color="auto" w:fill="FFFFFF"/>
-            <w:tcMar>
-              <w:top w:w="80" w:type="dxa"/>
-              <w:left w:w="120" w:type="dxa"/>
-              <w:bottom w:w="80" w:type="dxa"/>
-              <w:right w:w="120" w:type="dxa"/>
-            </w:tcMar>
-          </w:tcPr>
-          <w:p>
-            <w:r>
-              <w:rPr>
-                <w:sz w:val="18"/>
-                <w:szCs w:val="18"/>
-              </w:rPr>
-              <w:t>Pump stopped due to low water level</w:t>
+            <w:shd w:val="clear" w:color="auto" w:fill="F2F2F2"/>
+            <w:tcMar>
+              <w:top w:w="80" w:type="dxa"/>
+              <w:left w:w="120" w:type="dxa"/>
+              <w:bottom w:w="80" w:type="dxa"/>
+              <w:right w:w="120" w:type="dxa"/>
+            </w:tcMar>
+          </w:tcPr>
+          <w:p>
+            <w:r>
+              <w:rPr>
+                <w:sz w:val="18"/>
+                <w:szCs w:val="18"/>
+              </w:rPr>
+              <w:t xml:space="preserve">Enclosure sensor absent (distinct from </w:t>
+            </w:r>
+            <w:proofErr w:type="spellStart"/>
+            <w:r>
+              <w:rPr>
+                <w:sz w:val="18"/>
+                <w:szCs w:val="18"/>
+              </w:rPr>
+              <w:t>overtemp</w:t>
+            </w:r>
+            <w:proofErr w:type="spellEnd"/>
+            <w:r>
+              <w:rPr>
+                <w:sz w:val="18"/>
+                <w:szCs w:val="18"/>
+              </w:rPr>
+              <w:t>)</w:t>
             </w:r>
           </w:p>
         </w:tc>
@@ -11091,7 +11178,7 @@
               <w:bottom w:val="single" w:sz="1" w:space="0" w:color="CCCCCC"/>
               <w:right w:val="single" w:sz="1" w:space="0" w:color="CCCCCC"/>
             </w:tcBorders>
-            <w:shd w:val="clear" w:color="auto" w:fill="F2F2F2"/>
+            <w:shd w:val="clear" w:color="auto" w:fill="FFFFFF"/>
             <w:tcMar>
               <w:top w:w="80" w:type="dxa"/>
               <w:left w:w="120" w:type="dxa"/>
@@ -11107,7 +11194,7 @@
                 <w:sz w:val="18"/>
                 <w:szCs w:val="18"/>
               </w:rPr>
-              <w:t>enclosure_sensor_missing</w:t>
+              <w:t>critical_error</w:t>
             </w:r>
             <w:proofErr w:type="spellEnd"/>
           </w:p>
@@ -11121,7 +11208,7 @@
               <w:bottom w:val="single" w:sz="1" w:space="0" w:color="CCCCCC"/>
               <w:right w:val="single" w:sz="1" w:space="0" w:color="CCCCCC"/>
             </w:tcBorders>
-            <w:shd w:val="clear" w:color="auto" w:fill="F2F2F2"/>
+            <w:shd w:val="clear" w:color="auto" w:fill="FFFFFF"/>
             <w:tcMar>
               <w:top w:w="80" w:type="dxa"/>
               <w:left w:w="120" w:type="dxa"/>
@@ -11148,37 +11235,21 @@
               <w:bottom w:val="single" w:sz="1" w:space="0" w:color="CCCCCC"/>
               <w:right w:val="single" w:sz="1" w:space="0" w:color="CCCCCC"/>
             </w:tcBorders>
-            <w:shd w:val="clear" w:color="auto" w:fill="F2F2F2"/>
-            <w:tcMar>
-              <w:top w:w="80" w:type="dxa"/>
-              <w:left w:w="120" w:type="dxa"/>
-              <w:bottom w:w="80" w:type="dxa"/>
-              <w:right w:w="120" w:type="dxa"/>
-            </w:tcMar>
-          </w:tcPr>
-          <w:p>
-            <w:r>
-              <w:rPr>
-                <w:sz w:val="18"/>
-                <w:szCs w:val="18"/>
-              </w:rPr>
-              <w:t xml:space="preserve">Enclosure sensor absent (distinct from </w:t>
-            </w:r>
-            <w:proofErr w:type="spellStart"/>
-            <w:r>
-              <w:rPr>
-                <w:sz w:val="18"/>
-                <w:szCs w:val="18"/>
-              </w:rPr>
-              <w:t>overtemp</w:t>
-            </w:r>
-            <w:proofErr w:type="spellEnd"/>
-            <w:r>
-              <w:rPr>
-                <w:sz w:val="18"/>
-                <w:szCs w:val="18"/>
-              </w:rPr>
-              <w:t>)</w:t>
+            <w:shd w:val="clear" w:color="auto" w:fill="FFFFFF"/>
+            <w:tcMar>
+              <w:top w:w="80" w:type="dxa"/>
+              <w:left w:w="120" w:type="dxa"/>
+              <w:bottom w:w="80" w:type="dxa"/>
+              <w:right w:w="120" w:type="dxa"/>
+            </w:tcMar>
+          </w:tcPr>
+          <w:p>
+            <w:r>
+              <w:rPr>
+                <w:sz w:val="18"/>
+                <w:szCs w:val="18"/>
+              </w:rPr>
+              <w:t>Unrecoverable software error → LED critical pattern</w:t>
             </w:r>
           </w:p>
         </w:tc>
@@ -11199,7 +11270,7 @@
               <w:bottom w:val="single" w:sz="1" w:space="0" w:color="CCCCCC"/>
               <w:right w:val="single" w:sz="1" w:space="0" w:color="CCCCCC"/>
             </w:tcBorders>
-            <w:shd w:val="clear" w:color="auto" w:fill="FFFFFF"/>
+            <w:shd w:val="clear" w:color="auto" w:fill="F2F2F2"/>
             <w:tcMar>
               <w:top w:w="80" w:type="dxa"/>
               <w:left w:w="120" w:type="dxa"/>
@@ -11215,7 +11286,7 @@
                 <w:sz w:val="18"/>
                 <w:szCs w:val="18"/>
               </w:rPr>
-              <w:t>critical_error</w:t>
+              <w:t>ota_pending</w:t>
             </w:r>
             <w:proofErr w:type="spellEnd"/>
           </w:p>
@@ -11229,7 +11300,7 @@
               <w:bottom w:val="single" w:sz="1" w:space="0" w:color="CCCCCC"/>
               <w:right w:val="single" w:sz="1" w:space="0" w:color="CCCCCC"/>
             </w:tcBorders>
-            <w:shd w:val="clear" w:color="auto" w:fill="FFFFFF"/>
+            <w:shd w:val="clear" w:color="auto" w:fill="F2F2F2"/>
             <w:tcMar>
               <w:top w:w="80" w:type="dxa"/>
               <w:left w:w="120" w:type="dxa"/>
@@ -11256,21 +11327,21 @@
               <w:bottom w:val="single" w:sz="1" w:space="0" w:color="CCCCCC"/>
               <w:right w:val="single" w:sz="1" w:space="0" w:color="CCCCCC"/>
             </w:tcBorders>
-            <w:shd w:val="clear" w:color="auto" w:fill="FFFFFF"/>
-            <w:tcMar>
-              <w:top w:w="80" w:type="dxa"/>
-              <w:left w:w="120" w:type="dxa"/>
-              <w:bottom w:w="80" w:type="dxa"/>
-              <w:right w:w="120" w:type="dxa"/>
-            </w:tcMar>
-          </w:tcPr>
-          <w:p>
-            <w:r>
-              <w:rPr>
-                <w:sz w:val="18"/>
-                <w:szCs w:val="18"/>
-              </w:rPr>
-              <w:t>Unrecoverable software error → LED critical pattern</w:t>
+            <w:shd w:val="clear" w:color="auto" w:fill="F2F2F2"/>
+            <w:tcMar>
+              <w:top w:w="80" w:type="dxa"/>
+              <w:left w:w="120" w:type="dxa"/>
+              <w:bottom w:w="80" w:type="dxa"/>
+              <w:right w:w="120" w:type="dxa"/>
+            </w:tcMar>
+          </w:tcPr>
+          <w:p>
+            <w:r>
+              <w:rPr>
+                <w:sz w:val="18"/>
+                <w:szCs w:val="18"/>
+              </w:rPr>
+              <w:t>Set True by MQTT to trigger OTA check</w:t>
             </w:r>
           </w:p>
         </w:tc>
@@ -11291,7 +11362,7 @@
               <w:bottom w:val="single" w:sz="1" w:space="0" w:color="CCCCCC"/>
               <w:right w:val="single" w:sz="1" w:space="0" w:color="CCCCCC"/>
             </w:tcBorders>
-            <w:shd w:val="clear" w:color="auto" w:fill="F2F2F2"/>
+            <w:shd w:val="clear" w:color="auto" w:fill="FFFFFF"/>
             <w:tcMar>
               <w:top w:w="80" w:type="dxa"/>
               <w:left w:w="120" w:type="dxa"/>
@@ -11307,7 +11378,7 @@
                 <w:sz w:val="18"/>
                 <w:szCs w:val="18"/>
               </w:rPr>
-              <w:t>ota_pending</w:t>
+              <w:t>last_error</w:t>
             </w:r>
             <w:proofErr w:type="spellEnd"/>
           </w:p>
@@ -11321,21 +11392,21 @@
               <w:bottom w:val="single" w:sz="1" w:space="0" w:color="CCCCCC"/>
               <w:right w:val="single" w:sz="1" w:space="0" w:color="CCCCCC"/>
             </w:tcBorders>
-            <w:shd w:val="clear" w:color="auto" w:fill="F2F2F2"/>
-            <w:tcMar>
-              <w:top w:w="80" w:type="dxa"/>
-              <w:left w:w="120" w:type="dxa"/>
-              <w:bottom w:w="80" w:type="dxa"/>
-              <w:right w:w="120" w:type="dxa"/>
-            </w:tcMar>
-          </w:tcPr>
-          <w:p>
-            <w:r>
-              <w:rPr>
-                <w:sz w:val="18"/>
-                <w:szCs w:val="18"/>
-              </w:rPr>
-              <w:t>False</w:t>
+            <w:shd w:val="clear" w:color="auto" w:fill="FFFFFF"/>
+            <w:tcMar>
+              <w:top w:w="80" w:type="dxa"/>
+              <w:left w:w="120" w:type="dxa"/>
+              <w:bottom w:w="80" w:type="dxa"/>
+              <w:right w:w="120" w:type="dxa"/>
+            </w:tcMar>
+          </w:tcPr>
+          <w:p>
+            <w:r>
+              <w:rPr>
+                <w:sz w:val="18"/>
+                <w:szCs w:val="18"/>
+              </w:rPr>
+              <w:t>None</w:t>
             </w:r>
           </w:p>
         </w:tc>
@@ -11348,21 +11419,21 @@
               <w:bottom w:val="single" w:sz="1" w:space="0" w:color="CCCCCC"/>
               <w:right w:val="single" w:sz="1" w:space="0" w:color="CCCCCC"/>
             </w:tcBorders>
-            <w:shd w:val="clear" w:color="auto" w:fill="F2F2F2"/>
-            <w:tcMar>
-              <w:top w:w="80" w:type="dxa"/>
-              <w:left w:w="120" w:type="dxa"/>
-              <w:bottom w:w="80" w:type="dxa"/>
-              <w:right w:w="120" w:type="dxa"/>
-            </w:tcMar>
-          </w:tcPr>
-          <w:p>
-            <w:r>
-              <w:rPr>
-                <w:sz w:val="18"/>
-                <w:szCs w:val="18"/>
-              </w:rPr>
-              <w:t>Set True by MQTT to trigger OTA check</w:t>
+            <w:shd w:val="clear" w:color="auto" w:fill="FFFFFF"/>
+            <w:tcMar>
+              <w:top w:w="80" w:type="dxa"/>
+              <w:left w:w="120" w:type="dxa"/>
+              <w:bottom w:w="80" w:type="dxa"/>
+              <w:right w:w="120" w:type="dxa"/>
+            </w:tcMar>
+          </w:tcPr>
+          <w:p>
+            <w:r>
+              <w:rPr>
+                <w:sz w:val="18"/>
+                <w:szCs w:val="18"/>
+              </w:rPr>
+              <w:t>String message from last caught exception</w:t>
             </w:r>
           </w:p>
         </w:tc>
@@ -11399,7 +11470,7 @@
                 <w:sz w:val="18"/>
                 <w:szCs w:val="18"/>
               </w:rPr>
-              <w:t>last_error</w:t>
+              <w:t xml:space="preserve">last_pump_run</w:t>
             </w:r>
             <w:proofErr w:type="spellEnd"/>
           </w:p>
@@ -11427,7 +11498,7 @@
                 <w:sz w:val="18"/>
                 <w:szCs w:val="18"/>
               </w:rPr>
-              <w:t>None</w:t>
+              <w:t xml:space="preserve">None</w:t>
             </w:r>
           </w:p>
         </w:tc>
@@ -11454,7 +11525,375 @@
                 <w:sz w:val="18"/>
                 <w:szCs w:val="18"/>
               </w:rPr>
-              <w:t>String message from last caught exception</w:t>
+              <w:t xml:space="preserve">Timestamp of last pump activation</w:t>
+            </w:r>
+          </w:p>
+        </w:tc>
+      </w:tr>
+      <w:tr>
+        <w:tblPrEx>
+          <w:tblCellMar>
+            <w:top w:w="0" w:type="dxa"/>
+            <w:bottom w:w="0" w:type="dxa"/>
+          </w:tblCellMar>
+        </w:tblPrEx>
+        <w:tc>
+          <w:tcPr>
+            <w:tcW w:w="2700" w:type="dxa"/>
+            <w:tcBorders>
+              <w:top w:val="single" w:sz="1" w:space="0" w:color="CCCCCC"/>
+              <w:left w:val="single" w:sz="1" w:space="0" w:color="CCCCCC"/>
+              <w:bottom w:val="single" w:sz="1" w:space="0" w:color="CCCCCC"/>
+              <w:right w:val="single" w:sz="1" w:space="0" w:color="CCCCCC"/>
+            </w:tcBorders>
+            <w:shd w:val="clear" w:color="auto" w:fill="FFFFFF"/>
+            <w:tcMar>
+              <w:top w:w="80" w:type="dxa"/>
+              <w:left w:w="120" w:type="dxa"/>
+              <w:bottom w:w="80" w:type="dxa"/>
+              <w:right w:w="120" w:type="dxa"/>
+            </w:tcMar>
+          </w:tcPr>
+          <w:p>
+            <w:proofErr w:type="spellStart"/>
+            <w:r>
+              <w:rPr>
+                <w:rFonts w:ascii="Courier New" w:eastAsia="Courier New" w:hAnsi="Courier New" w:cs="Courier New"/>
+                <w:sz w:val="18"/>
+                <w:szCs w:val="18"/>
+              </w:rPr>
+              <w:t xml:space="preserve">last_test_ts</w:t>
+            </w:r>
+            <w:proofErr w:type="spellEnd"/>
+          </w:p>
+        </w:tc>
+        <w:tc>
+          <w:tcPr>
+            <w:tcW w:w="1440" w:type="dxa"/>
+            <w:tcBorders>
+              <w:top w:val="single" w:sz="1" w:space="0" w:color="CCCCCC"/>
+              <w:left w:val="single" w:sz="1" w:space="0" w:color="CCCCCC"/>
+              <w:bottom w:val="single" w:sz="1" w:space="0" w:color="CCCCCC"/>
+              <w:right w:val="single" w:sz="1" w:space="0" w:color="CCCCCC"/>
+            </w:tcBorders>
+            <w:shd w:val="clear" w:color="auto" w:fill="FFFFFF"/>
+            <w:tcMar>
+              <w:top w:w="80" w:type="dxa"/>
+              <w:left w:w="120" w:type="dxa"/>
+              <w:bottom w:w="80" w:type="dxa"/>
+              <w:right w:w="120" w:type="dxa"/>
+            </w:tcMar>
+          </w:tcPr>
+          <w:p>
+            <w:r>
+              <w:rPr>
+                <w:sz w:val="18"/>
+                <w:szCs w:val="18"/>
+              </w:rPr>
+              <w:t xml:space="preserve">None</w:t>
+            </w:r>
+          </w:p>
+        </w:tc>
+        <w:tc>
+          <w:tcPr>
+            <w:tcW w:w="5220" w:type="dxa"/>
+            <w:tcBorders>
+              <w:top w:val="single" w:sz="1" w:space="0" w:color="CCCCCC"/>
+              <w:left w:val="single" w:sz="1" w:space="0" w:color="CCCCCC"/>
+              <w:bottom w:val="single" w:sz="1" w:space="0" w:color="CCCCCC"/>
+              <w:right w:val="single" w:sz="1" w:space="0" w:color="CCCCCC"/>
+            </w:tcBorders>
+            <w:shd w:val="clear" w:color="auto" w:fill="FFFFFF"/>
+            <w:tcMar>
+              <w:top w:w="80" w:type="dxa"/>
+              <w:left w:w="120" w:type="dxa"/>
+              <w:bottom w:w="80" w:type="dxa"/>
+              <w:right w:w="120" w:type="dxa"/>
+            </w:tcMar>
+          </w:tcPr>
+          <w:p>
+            <w:r>
+              <w:rPr>
+                <w:sz w:val="18"/>
+                <w:szCs w:val="18"/>
+              </w:rPr>
+              <w:t xml:space="preserve">Timestamp when last periodic test completed</w:t>
+            </w:r>
+          </w:p>
+        </w:tc>
+      </w:tr>
+      <w:tr>
+        <w:tblPrEx>
+          <w:tblCellMar>
+            <w:top w:w="0" w:type="dxa"/>
+            <w:bottom w:w="0" w:type="dxa"/>
+          </w:tblCellMar>
+        </w:tblPrEx>
+        <w:tc>
+          <w:tcPr>
+            <w:tcW w:w="2700" w:type="dxa"/>
+            <w:tcBorders>
+              <w:top w:val="single" w:sz="1" w:space="0" w:color="CCCCCC"/>
+              <w:left w:val="single" w:sz="1" w:space="0" w:color="CCCCCC"/>
+              <w:bottom w:val="single" w:sz="1" w:space="0" w:color="CCCCCC"/>
+              <w:right w:val="single" w:sz="1" w:space="0" w:color="CCCCCC"/>
+            </w:tcBorders>
+            <w:shd w:val="clear" w:color="auto" w:fill="FFFFFF"/>
+            <w:tcMar>
+              <w:top w:w="80" w:type="dxa"/>
+              <w:left w:w="120" w:type="dxa"/>
+              <w:bottom w:w="80" w:type="dxa"/>
+              <w:right w:w="120" w:type="dxa"/>
+            </w:tcMar>
+          </w:tcPr>
+          <w:p>
+            <w:proofErr w:type="spellStart"/>
+            <w:r>
+              <w:rPr>
+                <w:rFonts w:ascii="Courier New" w:eastAsia="Courier New" w:hAnsi="Courier New" w:cs="Courier New"/>
+                <w:sz w:val="18"/>
+                <w:szCs w:val="18"/>
+              </w:rPr>
+              <w:t xml:space="preserve">delta_t</w:t>
+            </w:r>
+            <w:proofErr w:type="spellEnd"/>
+          </w:p>
+        </w:tc>
+        <w:tc>
+          <w:tcPr>
+            <w:tcW w:w="1440" w:type="dxa"/>
+            <w:tcBorders>
+              <w:top w:val="single" w:sz="1" w:space="0" w:color="CCCCCC"/>
+              <w:left w:val="single" w:sz="1" w:space="0" w:color="CCCCCC"/>
+              <w:bottom w:val="single" w:sz="1" w:space="0" w:color="CCCCCC"/>
+              <w:right w:val="single" w:sz="1" w:space="0" w:color="CCCCCC"/>
+            </w:tcBorders>
+            <w:shd w:val="clear" w:color="auto" w:fill="FFFFFF"/>
+            <w:tcMar>
+              <w:top w:w="80" w:type="dxa"/>
+              <w:left w:w="120" w:type="dxa"/>
+              <w:bottom w:w="80" w:type="dxa"/>
+              <w:right w:w="120" w:type="dxa"/>
+            </w:tcMar>
+          </w:tcPr>
+          <w:p>
+            <w:r>
+              <w:rPr>
+                <w:sz w:val="18"/>
+                <w:szCs w:val="18"/>
+              </w:rPr>
+              <w:t xml:space="preserve">None</w:t>
+            </w:r>
+          </w:p>
+        </w:tc>
+        <w:tc>
+          <w:tcPr>
+            <w:tcW w:w="5220" w:type="dxa"/>
+            <w:tcBorders>
+              <w:top w:val="single" w:sz="1" w:space="0" w:color="CCCCCC"/>
+              <w:left w:val="single" w:sz="1" w:space="0" w:color="CCCCCC"/>
+              <w:bottom w:val="single" w:sz="1" w:space="0" w:color="CCCCCC"/>
+              <w:right w:val="single" w:sz="1" w:space="0" w:color="CCCCCC"/>
+            </w:tcBorders>
+            <w:shd w:val="clear" w:color="auto" w:fill="FFFFFF"/>
+            <w:tcMar>
+              <w:top w:w="80" w:type="dxa"/>
+              <w:left w:w="120" w:type="dxa"/>
+              <w:bottom w:w="80" w:type="dxa"/>
+              <w:right w:w="120" w:type="dxa"/>
+            </w:tcMar>
+          </w:tcPr>
+          <w:p>
+            <w:r>
+              <w:rPr>
+                <w:sz w:val="18"/>
+                <w:szCs w:val="18"/>
+              </w:rPr>
+              <w:t xml:space="preserve">tReturn − tFlow (°C), computed each loop</w:t>
+            </w:r>
+          </w:p>
+        </w:tc>
+      </w:tr>
+      <w:tr>
+        <w:tblPrEx>
+          <w:tblCellMar>
+            <w:top w:w="0" w:type="dxa"/>
+            <w:bottom w:w="0" w:type="dxa"/>
+          </w:tblCellMar>
+        </w:tblPrEx>
+        <w:tc>
+          <w:tcPr>
+            <w:tcW w:w="2700" w:type="dxa"/>
+            <w:tcBorders>
+              <w:top w:val="single" w:sz="1" w:space="0" w:color="CCCCCC"/>
+              <w:left w:val="single" w:sz="1" w:space="0" w:color="CCCCCC"/>
+              <w:bottom w:val="single" w:sz="1" w:space="0" w:color="CCCCCC"/>
+              <w:right w:val="single" w:sz="1" w:space="0" w:color="CCCCCC"/>
+            </w:tcBorders>
+            <w:shd w:val="clear" w:color="auto" w:fill="FFFFFF"/>
+            <w:tcMar>
+              <w:top w:w="80" w:type="dxa"/>
+              <w:left w:w="120" w:type="dxa"/>
+              <w:bottom w:w="80" w:type="dxa"/>
+              <w:right w:w="120" w:type="dxa"/>
+            </w:tcMar>
+          </w:tcPr>
+          <w:p>
+            <w:proofErr w:type="spellStart"/>
+            <w:r>
+              <w:rPr>
+                <w:rFonts w:ascii="Courier New" w:eastAsia="Courier New" w:hAnsi="Courier New" w:cs="Courier New"/>
+                <w:sz w:val="18"/>
+                <w:szCs w:val="18"/>
+              </w:rPr>
+              <w:t xml:space="preserve">time_synced</w:t>
+            </w:r>
+            <w:proofErr w:type="spellEnd"/>
+          </w:p>
+        </w:tc>
+        <w:tc>
+          <w:tcPr>
+            <w:tcW w:w="1440" w:type="dxa"/>
+            <w:tcBorders>
+              <w:top w:val="single" w:sz="1" w:space="0" w:color="CCCCCC"/>
+              <w:left w:val="single" w:sz="1" w:space="0" w:color="CCCCCC"/>
+              <w:bottom w:val="single" w:sz="1" w:space="0" w:color="CCCCCC"/>
+              <w:right w:val="single" w:sz="1" w:space="0" w:color="CCCCCC"/>
+            </w:tcBorders>
+            <w:shd w:val="clear" w:color="auto" w:fill="FFFFFF"/>
+            <w:tcMar>
+              <w:top w:w="80" w:type="dxa"/>
+              <w:left w:w="120" w:type="dxa"/>
+              <w:bottom w:w="80" w:type="dxa"/>
+              <w:right w:w="120" w:type="dxa"/>
+            </w:tcMar>
+          </w:tcPr>
+          <w:p>
+            <w:r>
+              <w:rPr>
+                <w:sz w:val="18"/>
+                <w:szCs w:val="18"/>
+              </w:rPr>
+              <w:t xml:space="preserve">False</w:t>
+            </w:r>
+          </w:p>
+        </w:tc>
+        <w:tc>
+          <w:tcPr>
+            <w:tcW w:w="5220" w:type="dxa"/>
+            <w:tcBorders>
+              <w:top w:val="single" w:sz="1" w:space="0" w:color="CCCCCC"/>
+              <w:left w:val="single" w:sz="1" w:space="0" w:color="CCCCCC"/>
+              <w:bottom w:val="single" w:sz="1" w:space="0" w:color="CCCCCC"/>
+              <w:right w:val="single" w:sz="1" w:space="0" w:color="CCCCCC"/>
+            </w:tcBorders>
+            <w:shd w:val="clear" w:color="auto" w:fill="FFFFFF"/>
+            <w:tcMar>
+              <w:top w:w="80" w:type="dxa"/>
+              <w:left w:w="120" w:type="dxa"/>
+              <w:bottom w:w="80" w:type="dxa"/>
+              <w:right w:w="120" w:type="dxa"/>
+            </w:tcMar>
+          </w:tcPr>
+          <w:p>
+            <w:r>
+              <w:rPr>
+                <w:sz w:val="18"/>
+                <w:szCs w:val="18"/>
+              </w:rPr>
+              <w:t xml:space="preserve">True after first successful NTP sync</w:t>
+            </w:r>
+          </w:p>
+        </w:tc>
+      </w:tr>
+      <w:tr>
+        <w:tblPrEx>
+          <w:tblCellMar>
+            <w:top w:w="0" w:type="dxa"/>
+            <w:bottom w:w="0" w:type="dxa"/>
+          </w:tblCellMar>
+        </w:tblPrEx>
+        <w:tc>
+          <w:tcPr>
+            <w:tcW w:w="2700" w:type="dxa"/>
+            <w:tcBorders>
+              <w:top w:val="single" w:sz="1" w:space="0" w:color="CCCCCC"/>
+              <w:left w:val="single" w:sz="1" w:space="0" w:color="CCCCCC"/>
+              <w:bottom w:val="single" w:sz="1" w:space="0" w:color="CCCCCC"/>
+              <w:right w:val="single" w:sz="1" w:space="0" w:color="CCCCCC"/>
+            </w:tcBorders>
+            <w:shd w:val="clear" w:color="auto" w:fill="FFFFFF"/>
+            <w:tcMar>
+              <w:top w:w="80" w:type="dxa"/>
+              <w:left w:w="120" w:type="dxa"/>
+              <w:bottom w:w="80" w:type="dxa"/>
+              <w:right w:w="120" w:type="dxa"/>
+            </w:tcMar>
+          </w:tcPr>
+          <w:p>
+            <w:proofErr w:type="spellStart"/>
+            <w:r>
+              <w:rPr>
+                <w:rFonts w:ascii="Courier New" w:eastAsia="Courier New" w:hAnsi="Courier New" w:cs="Courier New"/>
+                <w:sz w:val="18"/>
+                <w:szCs w:val="18"/>
+              </w:rPr>
+              <w:t xml:space="preserve">last_ntp_sync</w:t>
+            </w:r>
+            <w:proofErr w:type="spellEnd"/>
+          </w:p>
+        </w:tc>
+        <w:tc>
+          <w:tcPr>
+            <w:tcW w:w="1440" w:type="dxa"/>
+            <w:tcBorders>
+              <w:top w:val="single" w:sz="1" w:space="0" w:color="CCCCCC"/>
+              <w:left w:val="single" w:sz="1" w:space="0" w:color="CCCCCC"/>
+              <w:bottom w:val="single" w:sz="1" w:space="0" w:color="CCCCCC"/>
+              <w:right w:val="single" w:sz="1" w:space="0" w:color="CCCCCC"/>
+            </w:tcBorders>
+            <w:shd w:val="clear" w:color="auto" w:fill="FFFFFF"/>
+            <w:tcMar>
+              <w:top w:w="80" w:type="dxa"/>
+              <w:left w:w="120" w:type="dxa"/>
+              <w:bottom w:w="80" w:type="dxa"/>
+              <w:right w:w="120" w:type="dxa"/>
+            </w:tcMar>
+          </w:tcPr>
+          <w:p>
+            <w:r>
+              <w:rPr>
+                <w:sz w:val="18"/>
+                <w:szCs w:val="18"/>
+              </w:rPr>
+              <w:t xml:space="preserve">None</w:t>
+            </w:r>
+          </w:p>
+        </w:tc>
+        <w:tc>
+          <w:tcPr>
+            <w:tcW w:w="5220" w:type="dxa"/>
+            <w:tcBorders>
+              <w:top w:val="single" w:sz="1" w:space="0" w:color="CCCCCC"/>
+              <w:left w:val="single" w:sz="1" w:space="0" w:color="CCCCCC"/>
+              <w:bottom w:val="single" w:sz="1" w:space="0" w:color="CCCCCC"/>
+              <w:right w:val="single" w:sz="1" w:space="0" w:color="CCCCCC"/>
+            </w:tcBorders>
+            <w:shd w:val="clear" w:color="auto" w:fill="FFFFFF"/>
+            <w:tcMar>
+              <w:top w:w="80" w:type="dxa"/>
+              <w:left w:w="120" w:type="dxa"/>
+              <w:bottom w:w="80" w:type="dxa"/>
+              <w:right w:w="120" w:type="dxa"/>
+            </w:tcMar>
+          </w:tcPr>
+          <w:p>
+            <w:r>
+              <w:rPr>
+                <w:sz w:val="18"/>
+                <w:szCs w:val="18"/>
+              </w:rPr>
+              <w:t xml:space="preserve">Timestamp of last successful NTP sync</w:t>
             </w:r>
           </w:p>
         </w:tc>
@@ -20508,7 +20947,7 @@
           <w:sz w:val="18"/>
           <w:szCs w:val="18"/>
         </w:rPr>
-        <w:t>v2.1.0  |</w:t>
+        <w:t>v0.9.0  |</w:t>
       </w:r>
       <w:proofErr w:type="gramEnd"/>
       <w:r>

</xml_diff>

<commit_message>
Add tSolarPlate/tSolarRef sensors and rename deltas for clarity
- Add tSolarPlate and tSolarRef to rom_to_label (placeholder ROMs until
  sensors are wired and real IDs discovered at boot)
- Rename delta_t → delta_t_flow_return throughout (state, feeds, controller,
  debug JSON); AIO feed renamed delta_temp → delta-t-flow-return
- Add delta_irradiance (tSolarPlate − tSolarRef) computed each loop,
  published to new AIO feed delta-irradiance
- Retire tEnclosure dedicated AIO feed (still in safety chain + debug JSON)
- Silence spurious "no feed configured" warnings for intentionally
  unpublished sensors
- Bump manifest to 1.2.2

Co-Authored-By: Claude Sonnet 4.6 <noreply@anthropic.com>
</commit_message>
<xml_diff>
--- a/pool controller docs.docx
+++ b/pool controller docs.docx
@@ -41,42 +41,37 @@
         <w:rPr>
           <w:color w:val="555555"/>
         </w:rPr>
-        <w:t xml:space="preserve">Firmware </w:t>
+        <w:t>Firmware v1.2.1  |  Raspberry Pi Pico W  |  MicroPython</w:t>
       </w:r>
       <w:proofErr w:type="gramStart"/>
       <w:r>
         <w:rPr>
           <w:color w:val="555555"/>
         </w:rPr>
-        <w:t>v2.1.0  |</w:t>
       </w:r>
       <w:proofErr w:type="gramEnd"/>
       <w:r>
         <w:rPr>
           <w:color w:val="555555"/>
         </w:rPr>
-        <w:t xml:space="preserve">  Raspberry Pi Pico </w:t>
       </w:r>
       <w:proofErr w:type="gramStart"/>
       <w:r>
         <w:rPr>
           <w:color w:val="555555"/>
         </w:rPr>
-        <w:t>W  |</w:t>
       </w:r>
       <w:proofErr w:type="gramEnd"/>
       <w:r>
         <w:rPr>
           <w:color w:val="555555"/>
         </w:rPr>
-        <w:t xml:space="preserve">  </w:t>
       </w:r>
       <w:proofErr w:type="spellStart"/>
       <w:r>
         <w:rPr>
           <w:color w:val="555555"/>
         </w:rPr>
-        <w:t>MicroPython</w:t>
       </w:r>
       <w:proofErr w:type="spellEnd"/>
     </w:p>
@@ -139,7 +134,7 @@
                 <w:sz w:val="18"/>
                 <w:szCs w:val="18"/>
               </w:rPr>
-              <w:t xml:space="preserve">main.py </w:t>
+              <w:t>main.py v0.9.5</w:t>
             </w:r>
             <w:r>
               <w:rPr>
@@ -147,7 +142,6 @@
                 <w:sz w:val="16"/>
                 <w:szCs w:val="16"/>
               </w:rPr>
-              <w:t>v2.1.0</w:t>
             </w:r>
           </w:p>
         </w:tc>
@@ -180,7 +174,7 @@
                 <w:sz w:val="18"/>
                 <w:szCs w:val="18"/>
               </w:rPr>
-              <w:t xml:space="preserve">controller.py </w:t>
+              <w:t>controller/controller.py v0.9.5</w:t>
             </w:r>
             <w:r>
               <w:rPr>
@@ -188,7 +182,6 @@
                 <w:sz w:val="16"/>
                 <w:szCs w:val="16"/>
               </w:rPr>
-              <w:t>v0.6.0</w:t>
             </w:r>
           </w:p>
         </w:tc>
@@ -221,7 +214,7 @@
                 <w:sz w:val="18"/>
                 <w:szCs w:val="18"/>
               </w:rPr>
-              <w:t xml:space="preserve">mqtt.py </w:t>
+              <w:t>net/mqtt.py v0.5.1</w:t>
             </w:r>
             <w:r>
               <w:rPr>
@@ -229,7 +222,6 @@
                 <w:sz w:val="16"/>
                 <w:szCs w:val="16"/>
               </w:rPr>
-              <w:t>v0.5.0</w:t>
             </w:r>
           </w:p>
         </w:tc>
@@ -262,7 +254,7 @@
                 <w:sz w:val="18"/>
                 <w:szCs w:val="18"/>
               </w:rPr>
-              <w:t xml:space="preserve">ota.py </w:t>
+              <w:t>ota.py v0.1.2</w:t>
             </w:r>
             <w:r>
               <w:rPr>
@@ -270,7 +262,6 @@
                 <w:sz w:val="16"/>
                 <w:szCs w:val="16"/>
               </w:rPr>
-              <w:t>v0.1.0</w:t>
             </w:r>
           </w:p>
         </w:tc>
@@ -825,7 +816,7 @@
                 <w:sz w:val="20"/>
                 <w:szCs w:val="20"/>
               </w:rPr>
-              <w:t>GPIO 5 (HIGH = pump ON)</w:t>
+              <w:t>GPIO 16 (HIGH = pump ON)</w:t>
             </w:r>
           </w:p>
         </w:tc>
@@ -887,7 +878,7 @@
                 <w:sz w:val="20"/>
                 <w:szCs w:val="20"/>
               </w:rPr>
-              <w:t>GPIO 6 (onboard or external)</w:t>
+              <w:t>"LED" (Pico W onboard LED, active-high)</w:t>
             </w:r>
           </w:p>
         </w:tc>
@@ -949,7 +940,7 @@
                 <w:sz w:val="20"/>
                 <w:szCs w:val="20"/>
               </w:rPr>
-              <w:t>GPIO 10, PULL_UP (LOW = pressed)</w:t>
+              <w:t>GPIO 3, PULL_UP (LOW = pressed)</w:t>
             </w:r>
           </w:p>
         </w:tc>
@@ -1561,7 +1552,7 @@
                 <w:sz w:val="20"/>
                 <w:szCs w:val="20"/>
               </w:rPr>
-              <w:t>network/__init__.py</w:t>
+              <w:t>net/__init__.py</w:t>
             </w:r>
           </w:p>
         </w:tc>
@@ -1588,7 +1579,7 @@
                 <w:sz w:val="20"/>
                 <w:szCs w:val="20"/>
               </w:rPr>
-              <w:t xml:space="preserve">Aggregates </w:t>
+              <w:t>Aggregates WiFi + MQTT. Owns watchdog restart callback and pre_restart_hook.</w:t>
             </w:r>
             <w:proofErr w:type="spellStart"/>
             <w:r>
@@ -1596,7 +1587,6 @@
                 <w:sz w:val="20"/>
                 <w:szCs w:val="20"/>
               </w:rPr>
-              <w:t>WiFi</w:t>
             </w:r>
             <w:proofErr w:type="spellEnd"/>
             <w:r>
@@ -1604,7 +1594,6 @@
                 <w:sz w:val="20"/>
                 <w:szCs w:val="20"/>
               </w:rPr>
-              <w:t xml:space="preserve"> + MQTT. Owns watchdog restart callback.</w:t>
             </w:r>
           </w:p>
         </w:tc>
@@ -1639,7 +1628,7 @@
                 <w:sz w:val="20"/>
                 <w:szCs w:val="20"/>
               </w:rPr>
-              <w:t>network/wifi.py</w:t>
+              <w:t>net/wifi.py</w:t>
             </w:r>
           </w:p>
         </w:tc>
@@ -1733,8 +1722,7 @@
                 <w:sz w:val="20"/>
                 <w:szCs w:val="20"/>
               </w:rPr>
-              <w:lastRenderedPageBreak/>
-              <w:t>network/mqtt.py</w:t>
+              <w:t>net/mqtt.py</w:t>
             </w:r>
           </w:p>
         </w:tc>
@@ -1796,7 +1784,7 @@
                 <w:sz w:val="20"/>
                 <w:szCs w:val="20"/>
               </w:rPr>
-              <w:t>network/feeds.py</w:t>
+              <w:t>net/feeds.py</w:t>
             </w:r>
           </w:p>
         </w:tc>
@@ -2216,7 +2204,7 @@
           <w:sz w:val="18"/>
           <w:szCs w:val="18"/>
         </w:rPr>
-        <w:t xml:space="preserve">  </w:t>
+        <w:t xml:space="preserve">  │  2. Read manifest.json → state["fw_version"]        │</w:t>
       </w:r>
       <w:proofErr w:type="gramStart"/>
       <w:r>
@@ -2226,7 +2214,6 @@
           <w:sz w:val="18"/>
           <w:szCs w:val="18"/>
         </w:rPr>
-        <w:t>│  2</w:t>
       </w:r>
       <w:proofErr w:type="gramEnd"/>
       <w:r>
@@ -2236,7 +2223,6 @@
           <w:sz w:val="18"/>
           <w:szCs w:val="18"/>
         </w:rPr>
-        <w:t xml:space="preserve">. Sensors </w:t>
       </w:r>
       <w:proofErr w:type="spellStart"/>
       <w:r>
@@ -2246,7 +2232,15 @@
           <w:sz w:val="18"/>
           <w:szCs w:val="18"/>
         </w:rPr>
-        <w:t>init</w:t>
+      </w:r>
+      <w:proofErr w:type="gramStart"/>
+      <w:r>
+        <w:rPr>
+          <w:rFonts w:ascii="Courier New" w:eastAsia="Courier New" w:hAnsi="Courier New" w:cs="Courier New"/>
+          <w:color w:val="333333"/>
+          <w:sz w:val="18"/>
+          <w:szCs w:val="18"/>
+        </w:rPr>
       </w:r>
       <w:proofErr w:type="spellEnd"/>
       <w:r>
@@ -2256,7 +2250,31 @@
           <w:sz w:val="18"/>
           <w:szCs w:val="18"/>
         </w:rPr>
-        <w:t xml:space="preserve"> + first read                       │</w:t>
+      </w:r>
+      <w:proofErr w:type="gramEnd"/>
+      <w:r>
+        <w:rPr>
+          <w:rFonts w:ascii="Courier New" w:eastAsia="Courier New" w:hAnsi="Courier New" w:cs="Courier New"/>
+          <w:color w:val="333333"/>
+          <w:sz w:val="18"/>
+          <w:szCs w:val="18"/>
+        </w:rPr>
+      </w:r>
+      <w:r>
+        <w:rPr>
+          <w:rFonts w:ascii="Courier New" w:eastAsia="Courier New" w:hAnsi="Courier New" w:cs="Courier New"/>
+          <w:color w:val="333333"/>
+          <w:sz w:val="18"/>
+          <w:szCs w:val="18"/>
+        </w:rPr>
+      </w:r>
+      <w:r>
+        <w:rPr>
+          <w:rFonts w:ascii="Courier New" w:eastAsia="Courier New" w:hAnsi="Courier New" w:cs="Courier New"/>
+          <w:color w:val="333333"/>
+          <w:sz w:val="18"/>
+          <w:szCs w:val="18"/>
+        </w:rPr>
       </w:r>
     </w:p>
     <w:p>
@@ -2272,7 +2290,7 @@
           <w:sz w:val="18"/>
           <w:szCs w:val="18"/>
         </w:rPr>
-        <w:t xml:space="preserve">  </w:t>
+        <w:t xml:space="preserve">  │  3. Sensors init + first read                        │</w:t>
       </w:r>
       <w:proofErr w:type="gramStart"/>
       <w:r>
@@ -2282,7 +2300,6 @@
           <w:sz w:val="18"/>
           <w:szCs w:val="18"/>
         </w:rPr>
-        <w:t>│  3</w:t>
       </w:r>
       <w:proofErr w:type="gramEnd"/>
       <w:r>
@@ -2292,7 +2309,6 @@
           <w:sz w:val="18"/>
           <w:szCs w:val="18"/>
         </w:rPr>
-        <w:t xml:space="preserve">. </w:t>
       </w:r>
       <w:proofErr w:type="spellStart"/>
       <w:r>
@@ -2302,48 +2318,15 @@
           <w:sz w:val="18"/>
           <w:szCs w:val="18"/>
         </w:rPr>
-        <w:t>Network.connect</w:t>
       </w:r>
       <w:proofErr w:type="spellEnd"/>
-      <w:proofErr w:type="gramStart"/>
-      <w:r>
-        <w:rPr>
-          <w:rFonts w:ascii="Courier New" w:eastAsia="Courier New" w:hAnsi="Courier New" w:cs="Courier New"/>
-          <w:color w:val="333333"/>
-          <w:sz w:val="18"/>
-          <w:szCs w:val="18"/>
-        </w:rPr>
-        <w:t>()  (</w:t>
-      </w:r>
-      <w:proofErr w:type="gramEnd"/>
-      <w:r>
-        <w:rPr>
-          <w:rFonts w:ascii="Courier New" w:eastAsia="Courier New" w:hAnsi="Courier New" w:cs="Courier New"/>
-          <w:color w:val="333333"/>
-          <w:sz w:val="18"/>
-          <w:szCs w:val="18"/>
-        </w:rPr>
-        <w:t xml:space="preserve">blocking, boot </w:t>
-      </w:r>
-      <w:proofErr w:type="gramStart"/>
-      <w:r>
-        <w:rPr>
-          <w:rFonts w:ascii="Courier New" w:eastAsia="Courier New" w:hAnsi="Courier New" w:cs="Courier New"/>
-          <w:color w:val="333333"/>
-          <w:sz w:val="18"/>
-          <w:szCs w:val="18"/>
-        </w:rPr>
-        <w:t xml:space="preserve">only)   </w:t>
-      </w:r>
-      <w:proofErr w:type="gramEnd"/>
-      <w:r>
-        <w:rPr>
-          <w:rFonts w:ascii="Courier New" w:eastAsia="Courier New" w:hAnsi="Courier New" w:cs="Courier New"/>
-          <w:color w:val="333333"/>
-          <w:sz w:val="18"/>
-          <w:szCs w:val="18"/>
-        </w:rPr>
-        <w:t xml:space="preserve">     │</w:t>
+      <w:r>
+        <w:rPr>
+          <w:rFonts w:ascii="Courier New" w:eastAsia="Courier New" w:hAnsi="Courier New" w:cs="Courier New"/>
+          <w:color w:val="333333"/>
+          <w:sz w:val="18"/>
+          <w:szCs w:val="18"/>
+        </w:rPr>
       </w:r>
     </w:p>
     <w:p>
@@ -2359,7 +2342,7 @@
           <w:sz w:val="18"/>
           <w:szCs w:val="18"/>
         </w:rPr>
-        <w:t xml:space="preserve">  </w:t>
+        <w:t xml:space="preserve">  │  4. Network.connect() + NTP sync  (blocking)         │</w:t>
       </w:r>
       <w:proofErr w:type="gramStart"/>
       <w:r>
@@ -2369,7 +2352,6 @@
           <w:sz w:val="18"/>
           <w:szCs w:val="18"/>
         </w:rPr>
-        <w:t>│  4</w:t>
       </w:r>
       <w:proofErr w:type="gramEnd"/>
       <w:r>
@@ -2379,7 +2361,6 @@
           <w:sz w:val="18"/>
           <w:szCs w:val="18"/>
         </w:rPr>
-        <w:t xml:space="preserve">. Controller </w:t>
       </w:r>
       <w:proofErr w:type="spellStart"/>
       <w:r>
@@ -2389,17 +2370,43 @@
           <w:sz w:val="18"/>
           <w:szCs w:val="18"/>
         </w:rPr>
-        <w:t>init</w:t>
       </w:r>
       <w:proofErr w:type="spellEnd"/>
-      <w:r>
-        <w:rPr>
-          <w:rFonts w:ascii="Courier New" w:eastAsia="Courier New" w:hAnsi="Courier New" w:cs="Courier New"/>
-          <w:color w:val="333333"/>
-          <w:sz w:val="18"/>
-          <w:szCs w:val="18"/>
-        </w:rPr>
-        <w:t xml:space="preserve">                                 │</w:t>
+      <w:proofErr w:type="gramStart"/>
+      <w:r>
+        <w:rPr>
+          <w:rFonts w:ascii="Courier New" w:eastAsia="Courier New" w:hAnsi="Courier New" w:cs="Courier New"/>
+          <w:color w:val="333333"/>
+          <w:sz w:val="18"/>
+          <w:szCs w:val="18"/>
+        </w:rPr>
+      </w:r>
+      <w:proofErr w:type="gramEnd"/>
+      <w:r>
+        <w:rPr>
+          <w:rFonts w:ascii="Courier New" w:eastAsia="Courier New" w:hAnsi="Courier New" w:cs="Courier New"/>
+          <w:color w:val="333333"/>
+          <w:sz w:val="18"/>
+          <w:szCs w:val="18"/>
+        </w:rPr>
+      </w:r>
+      <w:proofErr w:type="gramStart"/>
+      <w:r>
+        <w:rPr>
+          <w:rFonts w:ascii="Courier New" w:eastAsia="Courier New" w:hAnsi="Courier New" w:cs="Courier New"/>
+          <w:color w:val="333333"/>
+          <w:sz w:val="18"/>
+          <w:szCs w:val="18"/>
+        </w:rPr>
+      </w:r>
+      <w:proofErr w:type="gramEnd"/>
+      <w:r>
+        <w:rPr>
+          <w:rFonts w:ascii="Courier New" w:eastAsia="Courier New" w:hAnsi="Courier New" w:cs="Courier New"/>
+          <w:color w:val="333333"/>
+          <w:sz w:val="18"/>
+          <w:szCs w:val="18"/>
+        </w:rPr>
       </w:r>
     </w:p>
     <w:p>
@@ -2415,7 +2422,43 @@
           <w:sz w:val="18"/>
           <w:szCs w:val="18"/>
         </w:rPr>
-        <w:t xml:space="preserve">  └──────────────────────┬──────────────────────────────┘</w:t>
+        <w:t xml:space="preserve">  │  5. Controller init + pre_restart_hook               │</w:t>
+      </w:r>
+      <w:proofErr w:type="gramStart"/>
+      <w:r>
+        <w:rPr>
+          <w:rFonts w:ascii="Courier New" w:eastAsia="Courier New" w:hAnsi="Courier New" w:cs="Courier New"/>
+          <w:color w:val="333333"/>
+          <w:sz w:val="18"/>
+          <w:szCs w:val="18"/>
+        </w:rPr>
+      </w:r>
+      <w:proofErr w:type="gramEnd"/>
+      <w:r>
+        <w:rPr>
+          <w:rFonts w:ascii="Courier New" w:eastAsia="Courier New" w:hAnsi="Courier New" w:cs="Courier New"/>
+          <w:color w:val="333333"/>
+          <w:sz w:val="18"/>
+          <w:szCs w:val="18"/>
+        </w:rPr>
+      </w:r>
+      <w:proofErr w:type="spellStart"/>
+      <w:r>
+        <w:rPr>
+          <w:rFonts w:ascii="Courier New" w:eastAsia="Courier New" w:hAnsi="Courier New" w:cs="Courier New"/>
+          <w:color w:val="333333"/>
+          <w:sz w:val="18"/>
+          <w:szCs w:val="18"/>
+        </w:rPr>
+      </w:r>
+      <w:proofErr w:type="spellEnd"/>
+      <w:r>
+        <w:rPr>
+          <w:rFonts w:ascii="Courier New" w:eastAsia="Courier New" w:hAnsi="Courier New" w:cs="Courier New"/>
+          <w:color w:val="333333"/>
+          <w:sz w:val="18"/>
+          <w:szCs w:val="18"/>
+        </w:rPr>
       </w:r>
     </w:p>
     <w:p>
@@ -2431,7 +2474,7 @@
           <w:sz w:val="18"/>
           <w:szCs w:val="18"/>
         </w:rPr>
-        <w:t xml:space="preserve">                         │</w:t>
+        <w:t xml:space="preserve">  └──────────────────────┬──────────────────────────────┘</w:t>
       </w:r>
     </w:p>
     <w:p>
@@ -2447,7 +2490,7 @@
           <w:sz w:val="18"/>
           <w:szCs w:val="18"/>
         </w:rPr>
-        <w:t xml:space="preserve">  ┌──────────────────────▼──────────────────────────────┐</w:t>
+        <w:t xml:space="preserve">                         │</w:t>
       </w:r>
     </w:p>
     <w:p>
@@ -2463,27 +2506,7 @@
           <w:sz w:val="18"/>
           <w:szCs w:val="18"/>
         </w:rPr>
-        <w:t xml:space="preserve">  │                  MAIN LOOP (while </w:t>
-      </w:r>
-      <w:proofErr w:type="gramStart"/>
-      <w:r>
-        <w:rPr>
-          <w:rFonts w:ascii="Courier New" w:eastAsia="Courier New" w:hAnsi="Courier New" w:cs="Courier New"/>
-          <w:color w:val="333333"/>
-          <w:sz w:val="18"/>
-          <w:szCs w:val="18"/>
-        </w:rPr>
-        <w:t xml:space="preserve">True)   </w:t>
-      </w:r>
-      <w:proofErr w:type="gramEnd"/>
-      <w:r>
-        <w:rPr>
-          <w:rFonts w:ascii="Courier New" w:eastAsia="Courier New" w:hAnsi="Courier New" w:cs="Courier New"/>
-          <w:color w:val="333333"/>
-          <w:sz w:val="18"/>
-          <w:szCs w:val="18"/>
-        </w:rPr>
-        <w:t xml:space="preserve">          │</w:t>
+        <w:t xml:space="preserve">  ┌──────────────────────▼──────────────────────────────┐</w:t>
       </w:r>
     </w:p>
     <w:p>
@@ -2499,7 +2522,27 @@
           <w:sz w:val="18"/>
           <w:szCs w:val="18"/>
         </w:rPr>
-        <w:t xml:space="preserve">  │                                                     │</w:t>
+        <w:t xml:space="preserve">  │                  MAIN LOOP (while </w:t>
+      </w:r>
+      <w:proofErr w:type="gramStart"/>
+      <w:r>
+        <w:rPr>
+          <w:rFonts w:ascii="Courier New" w:eastAsia="Courier New" w:hAnsi="Courier New" w:cs="Courier New"/>
+          <w:color w:val="333333"/>
+          <w:sz w:val="18"/>
+          <w:szCs w:val="18"/>
+        </w:rPr>
+        <w:t xml:space="preserve">True)   </w:t>
+      </w:r>
+      <w:proofErr w:type="gramEnd"/>
+      <w:r>
+        <w:rPr>
+          <w:rFonts w:ascii="Courier New" w:eastAsia="Courier New" w:hAnsi="Courier New" w:cs="Courier New"/>
+          <w:color w:val="333333"/>
+          <w:sz w:val="18"/>
+          <w:szCs w:val="18"/>
+        </w:rPr>
+        <w:t xml:space="preserve">          │</w:t>
       </w:r>
     </w:p>
     <w:p>
@@ -2515,27 +2558,7 @@
           <w:sz w:val="18"/>
           <w:szCs w:val="18"/>
         </w:rPr>
-        <w:t xml:space="preserve">  </w:t>
-      </w:r>
-      <w:proofErr w:type="gramStart"/>
-      <w:r>
-        <w:rPr>
-          <w:rFonts w:ascii="Courier New" w:eastAsia="Courier New" w:hAnsi="Courier New" w:cs="Courier New"/>
-          <w:color w:val="333333"/>
-          <w:sz w:val="18"/>
-          <w:szCs w:val="18"/>
-        </w:rPr>
-        <w:t>│  Every</w:t>
-      </w:r>
-      <w:proofErr w:type="gramEnd"/>
-      <w:r>
-        <w:rPr>
-          <w:rFonts w:ascii="Courier New" w:eastAsia="Courier New" w:hAnsi="Courier New" w:cs="Courier New"/>
-          <w:color w:val="333333"/>
-          <w:sz w:val="18"/>
-          <w:szCs w:val="18"/>
-        </w:rPr>
-        <w:t xml:space="preserve"> 2 s ──► Read temperature sensors             │</w:t>
+        <w:t xml:space="preserve">  │                                                     │</w:t>
       </w:r>
     </w:p>
     <w:p>
@@ -2551,7 +2574,27 @@
           <w:sz w:val="18"/>
           <w:szCs w:val="18"/>
         </w:rPr>
-        <w:t xml:space="preserve">  │            ──► Read water level sensor              │</w:t>
+        <w:t xml:space="preserve">  </w:t>
+      </w:r>
+      <w:proofErr w:type="gramStart"/>
+      <w:r>
+        <w:rPr>
+          <w:rFonts w:ascii="Courier New" w:eastAsia="Courier New" w:hAnsi="Courier New" w:cs="Courier New"/>
+          <w:color w:val="333333"/>
+          <w:sz w:val="18"/>
+          <w:szCs w:val="18"/>
+        </w:rPr>
+        <w:t>│  Every</w:t>
+      </w:r>
+      <w:proofErr w:type="gramEnd"/>
+      <w:r>
+        <w:rPr>
+          <w:rFonts w:ascii="Courier New" w:eastAsia="Courier New" w:hAnsi="Courier New" w:cs="Courier New"/>
+          <w:color w:val="333333"/>
+          <w:sz w:val="18"/>
+          <w:szCs w:val="18"/>
+        </w:rPr>
+        <w:t xml:space="preserve"> 2 s ──► Read temperature sensors             │</w:t>
       </w:r>
     </w:p>
     <w:p>
@@ -2567,7 +2610,7 @@
           <w:sz w:val="18"/>
           <w:szCs w:val="18"/>
         </w:rPr>
-        <w:t xml:space="preserve">  │                                                     │</w:t>
+        <w:t xml:space="preserve">  │            ──► Read water level sensor              │</w:t>
       </w:r>
     </w:p>
     <w:p>
@@ -2583,89 +2626,7 @@
           <w:sz w:val="18"/>
           <w:szCs w:val="18"/>
         </w:rPr>
-        <w:t xml:space="preserve">  </w:t>
-      </w:r>
-      <w:proofErr w:type="gramStart"/>
-      <w:r>
-        <w:rPr>
-          <w:rFonts w:ascii="Courier New" w:eastAsia="Courier New" w:hAnsi="Courier New" w:cs="Courier New"/>
-          <w:color w:val="333333"/>
-          <w:sz w:val="18"/>
-          <w:szCs w:val="18"/>
-        </w:rPr>
-        <w:t>│  Every</w:t>
-      </w:r>
-      <w:proofErr w:type="gramEnd"/>
-      <w:r>
-        <w:rPr>
-          <w:rFonts w:ascii="Courier New" w:eastAsia="Courier New" w:hAnsi="Courier New" w:cs="Courier New"/>
-          <w:color w:val="333333"/>
-          <w:sz w:val="18"/>
-          <w:szCs w:val="18"/>
-        </w:rPr>
-        <w:t xml:space="preserve"> tick ─► </w:t>
-      </w:r>
-      <w:proofErr w:type="spellStart"/>
-      <w:proofErr w:type="gramStart"/>
-      <w:r>
-        <w:rPr>
-          <w:rFonts w:ascii="Courier New" w:eastAsia="Courier New" w:hAnsi="Courier New" w:cs="Courier New"/>
-          <w:color w:val="333333"/>
-          <w:sz w:val="18"/>
-          <w:szCs w:val="18"/>
-        </w:rPr>
-        <w:t>network.loop</w:t>
-      </w:r>
-      <w:proofErr w:type="spellEnd"/>
-      <w:r>
-        <w:rPr>
-          <w:rFonts w:ascii="Courier New" w:eastAsia="Courier New" w:hAnsi="Courier New" w:cs="Courier New"/>
-          <w:color w:val="333333"/>
-          <w:sz w:val="18"/>
-          <w:szCs w:val="18"/>
-        </w:rPr>
-        <w:t>()  (</w:t>
-      </w:r>
-      <w:proofErr w:type="spellStart"/>
-      <w:proofErr w:type="gramEnd"/>
-      <w:r>
-        <w:rPr>
-          <w:rFonts w:ascii="Courier New" w:eastAsia="Courier New" w:hAnsi="Courier New" w:cs="Courier New"/>
-          <w:color w:val="333333"/>
-          <w:sz w:val="18"/>
-          <w:szCs w:val="18"/>
-        </w:rPr>
-        <w:t>WiFi</w:t>
-      </w:r>
-      <w:proofErr w:type="spellEnd"/>
-      <w:r>
-        <w:rPr>
-          <w:rFonts w:ascii="Courier New" w:eastAsia="Courier New" w:hAnsi="Courier New" w:cs="Courier New"/>
-          <w:color w:val="333333"/>
-          <w:sz w:val="18"/>
-          <w:szCs w:val="18"/>
-        </w:rPr>
-        <w:t xml:space="preserve"> + </w:t>
-      </w:r>
-      <w:proofErr w:type="gramStart"/>
-      <w:r>
-        <w:rPr>
-          <w:rFonts w:ascii="Courier New" w:eastAsia="Courier New" w:hAnsi="Courier New" w:cs="Courier New"/>
-          <w:color w:val="333333"/>
-          <w:sz w:val="18"/>
-          <w:szCs w:val="18"/>
-        </w:rPr>
-        <w:t xml:space="preserve">MQTT)   </w:t>
-      </w:r>
-      <w:proofErr w:type="gramEnd"/>
-      <w:r>
-        <w:rPr>
-          <w:rFonts w:ascii="Courier New" w:eastAsia="Courier New" w:hAnsi="Courier New" w:cs="Courier New"/>
-          <w:color w:val="333333"/>
-          <w:sz w:val="18"/>
-          <w:szCs w:val="18"/>
-        </w:rPr>
-        <w:t xml:space="preserve">     │</w:t>
+        <w:t xml:space="preserve">  │                                                     │</w:t>
       </w:r>
     </w:p>
     <w:p>
@@ -2681,7 +2642,27 @@
           <w:sz w:val="18"/>
           <w:szCs w:val="18"/>
         </w:rPr>
-        <w:t xml:space="preserve">  │            ──► </w:t>
+        <w:t xml:space="preserve">  </w:t>
+      </w:r>
+      <w:proofErr w:type="gramStart"/>
+      <w:r>
+        <w:rPr>
+          <w:rFonts w:ascii="Courier New" w:eastAsia="Courier New" w:hAnsi="Courier New" w:cs="Courier New"/>
+          <w:color w:val="333333"/>
+          <w:sz w:val="18"/>
+          <w:szCs w:val="18"/>
+        </w:rPr>
+        <w:t>│  Every</w:t>
+      </w:r>
+      <w:proofErr w:type="gramEnd"/>
+      <w:r>
+        <w:rPr>
+          <w:rFonts w:ascii="Courier New" w:eastAsia="Courier New" w:hAnsi="Courier New" w:cs="Courier New"/>
+          <w:color w:val="333333"/>
+          <w:sz w:val="18"/>
+          <w:szCs w:val="18"/>
+        </w:rPr>
+        <w:t xml:space="preserve"> tick ─► </w:t>
       </w:r>
       <w:proofErr w:type="spellStart"/>
       <w:proofErr w:type="gramStart"/>
@@ -2692,7 +2673,7 @@
           <w:sz w:val="18"/>
           <w:szCs w:val="18"/>
         </w:rPr>
-        <w:t>controller.loop</w:t>
+        <w:t>network.loop</w:t>
       </w:r>
       <w:proofErr w:type="spellEnd"/>
       <w:r>
@@ -2702,8 +2683,9 @@
           <w:sz w:val="18"/>
           <w:szCs w:val="18"/>
         </w:rPr>
-        <w:t xml:space="preserve">()   </w:t>
-      </w:r>
+        <w:t>()  (</w:t>
+      </w:r>
+      <w:proofErr w:type="spellStart"/>
       <w:proofErr w:type="gramEnd"/>
       <w:r>
         <w:rPr>
@@ -2712,7 +2694,37 @@
           <w:sz w:val="18"/>
           <w:szCs w:val="18"/>
         </w:rPr>
-        <w:t xml:space="preserve">                 │</w:t>
+        <w:t>WiFi</w:t>
+      </w:r>
+      <w:proofErr w:type="spellEnd"/>
+      <w:r>
+        <w:rPr>
+          <w:rFonts w:ascii="Courier New" w:eastAsia="Courier New" w:hAnsi="Courier New" w:cs="Courier New"/>
+          <w:color w:val="333333"/>
+          <w:sz w:val="18"/>
+          <w:szCs w:val="18"/>
+        </w:rPr>
+        <w:t xml:space="preserve"> + </w:t>
+      </w:r>
+      <w:proofErr w:type="gramStart"/>
+      <w:r>
+        <w:rPr>
+          <w:rFonts w:ascii="Courier New" w:eastAsia="Courier New" w:hAnsi="Courier New" w:cs="Courier New"/>
+          <w:color w:val="333333"/>
+          <w:sz w:val="18"/>
+          <w:szCs w:val="18"/>
+        </w:rPr>
+        <w:t xml:space="preserve">MQTT)   </w:t>
+      </w:r>
+      <w:proofErr w:type="gramEnd"/>
+      <w:r>
+        <w:rPr>
+          <w:rFonts w:ascii="Courier New" w:eastAsia="Courier New" w:hAnsi="Courier New" w:cs="Courier New"/>
+          <w:color w:val="333333"/>
+          <w:sz w:val="18"/>
+          <w:szCs w:val="18"/>
+        </w:rPr>
+        <w:t xml:space="preserve">     │</w:t>
       </w:r>
     </w:p>
     <w:p>
@@ -2739,7 +2751,7 @@
           <w:sz w:val="18"/>
           <w:szCs w:val="18"/>
         </w:rPr>
-        <w:t>gc.collect</w:t>
+        <w:t>controller.loop</w:t>
       </w:r>
       <w:proofErr w:type="spellEnd"/>
       <w:r>
@@ -2759,7 +2771,95 @@
           <w:sz w:val="18"/>
           <w:szCs w:val="18"/>
         </w:rPr>
-        <w:t xml:space="preserve">                      │</w:t>
+        <w:t xml:space="preserve">                 │</w:t>
+      </w:r>
+    </w:p>
+    <w:p>
+      <w:pPr>
+        <w:shd w:val="clear" w:color="auto" w:fill="F5F5F5"/>
+        <w:spacing w:before="40" w:after="40"/>
+        <w:ind w:left="360"/>
+      </w:pPr>
+      <w:r>
+        <w:rPr>
+          <w:rFonts w:ascii="Courier New" w:eastAsia="Courier New" w:hAnsi="Courier New" w:cs="Courier New"/>
+          <w:color w:val="333333"/>
+          <w:sz w:val="18"/>
+          <w:szCs w:val="18"/>
+        </w:rPr>
+        <w:t xml:space="preserve">  │            ──► status_led.update()                    │</w:t>
+      </w:r>
+      <w:proofErr w:type="spellStart"/>
+      <w:proofErr w:type="gramStart"/>
+      <w:r>
+        <w:rPr>
+          <w:rFonts w:ascii="Courier New" w:eastAsia="Courier New" w:hAnsi="Courier New" w:cs="Courier New"/>
+          <w:color w:val="333333"/>
+          <w:sz w:val="18"/>
+          <w:szCs w:val="18"/>
+        </w:rPr>
+      </w:r>
+      <w:proofErr w:type="spellEnd"/>
+      <w:r>
+        <w:rPr>
+          <w:rFonts w:ascii="Courier New" w:eastAsia="Courier New" w:hAnsi="Courier New" w:cs="Courier New"/>
+          <w:color w:val="333333"/>
+          <w:sz w:val="18"/>
+          <w:szCs w:val="18"/>
+        </w:rPr>
+      </w:r>
+      <w:proofErr w:type="gramEnd"/>
+      <w:r>
+        <w:rPr>
+          <w:rFonts w:ascii="Courier New" w:eastAsia="Courier New" w:hAnsi="Courier New" w:cs="Courier New"/>
+          <w:color w:val="333333"/>
+          <w:sz w:val="18"/>
+          <w:szCs w:val="18"/>
+        </w:rPr>
+      </w:r>
+    </w:p>
+    <w:p>
+      <w:pPr>
+        <w:shd w:val="clear" w:color="auto" w:fill="F5F5F5"/>
+        <w:spacing w:before="40" w:after="40"/>
+        <w:ind w:left="360"/>
+      </w:pPr>
+      <w:r>
+        <w:rPr>
+          <w:rFonts w:ascii="Courier New" w:eastAsia="Courier New" w:hAnsi="Courier New" w:cs="Courier New"/>
+          <w:color w:val="333333"/>
+          <w:sz w:val="18"/>
+          <w:szCs w:val="18"/>
+        </w:rPr>
+        <w:t xml:space="preserve">  │            ──► gc.collect()                         │</w:t>
+      </w:r>
+      <w:proofErr w:type="spellStart"/>
+      <w:proofErr w:type="gramStart"/>
+      <w:r>
+        <w:rPr>
+          <w:rFonts w:ascii="Courier New" w:eastAsia="Courier New" w:hAnsi="Courier New" w:cs="Courier New"/>
+          <w:color w:val="333333"/>
+          <w:sz w:val="18"/>
+          <w:szCs w:val="18"/>
+        </w:rPr>
+      </w:r>
+      <w:proofErr w:type="spellEnd"/>
+      <w:r>
+        <w:rPr>
+          <w:rFonts w:ascii="Courier New" w:eastAsia="Courier New" w:hAnsi="Courier New" w:cs="Courier New"/>
+          <w:color w:val="333333"/>
+          <w:sz w:val="18"/>
+          <w:szCs w:val="18"/>
+        </w:rPr>
+      </w:r>
+      <w:proofErr w:type="gramEnd"/>
+      <w:r>
+        <w:rPr>
+          <w:rFonts w:ascii="Courier New" w:eastAsia="Courier New" w:hAnsi="Courier New" w:cs="Courier New"/>
+          <w:color w:val="333333"/>
+          <w:sz w:val="18"/>
+          <w:szCs w:val="18"/>
+        </w:rPr>
       </w:r>
     </w:p>
     <w:p>
@@ -3034,8 +3134,16 @@
         <w:spacing w:before="40" w:after="40"/>
       </w:pPr>
       <w:r>
-        <w:t>Performs one blocking sensor read so state is populated with real values before the first controller loop</w:t>
-      </w:r>
+        <w:t>Reads manifest.json to populate state["fw_version"] (the bundle version reported in the debug feed)</w:t>
+      </w:r>
+      <w:proofErr w:type="spellStart"/>
+      <w:r/>
+      <w:proofErr w:type="spellEnd"/>
+      <w:r/>
+      <w:proofErr w:type="spellStart"/>
+      <w:r/>
+      <w:proofErr w:type="spellEnd"/>
+      <w:r/>
     </w:p>
     <w:p>
       <w:pPr>
@@ -3047,15 +3155,7 @@
         <w:spacing w:before="40" w:after="40"/>
       </w:pPr>
       <w:r>
-        <w:t xml:space="preserve">Connects </w:t>
-      </w:r>
-      <w:proofErr w:type="spellStart"/>
-      <w:r>
-        <w:t>WiFi</w:t>
-      </w:r>
-      <w:proofErr w:type="spellEnd"/>
-      <w:r>
-        <w:t xml:space="preserve"> and MQTT (blocking at boot — acceptable since we want connectivity before entering the loop)</w:t>
+        <w:t>Performs one blocking sensor read so state is populated with real values before the first controller loop</w:t>
       </w:r>
     </w:p>
     <w:p>
@@ -3068,8 +3168,61 @@
         <w:spacing w:before="40" w:after="40"/>
       </w:pPr>
       <w:r>
-        <w:t>Constructs the Controller and enters the non-blocking main loop</w:t>
-      </w:r>
+        <w:t xml:space="preserve">Connects </w:t>
+      </w:r>
+      <w:proofErr w:type="spellStart"/>
+      <w:r>
+        <w:t>WiFi</w:t>
+      </w:r>
+      <w:proofErr w:type="spellEnd"/>
+      <w:r>
+        <w:t xml:space="preserve"> and MQTT (blocking at boot — acceptable since we want connectivity before entering the loop)</w:t>
+      </w:r>
+    </w:p>
+    <w:p>
+      <w:pPr>
+        <w:pStyle w:val="ListParagraph"/>
+        <w:numPr>
+          <w:ilvl w:val="0"/>
+          <w:numId w:val="2"/>
+        </w:numPr>
+        <w:spacing w:before="40" w:after="40"/>
+      </w:pPr>
+      <w:r>
+        <w:t>Syncs the Pico RTC via NTP (sets UK local time for correct core-hours comparisons)</w:t>
+      </w:r>
+      <w:proofErr w:type="spellStart"/>
+      <w:r/>
+      <w:proofErr w:type="spellEnd"/>
+      <w:r/>
+    </w:p>
+    <w:p>
+      <w:pPr>
+        <w:pStyle w:val="ListParagraph"/>
+        <w:numPr>
+          <w:ilvl w:val="0"/>
+          <w:numId w:val="2"/>
+        </w:numPr>
+        <w:spacing w:before="40" w:after="40"/>
+      </w:pPr>
+      <w:r>
+        <w:t>Constructs the Controller and wires network.pre_restart_hook (pump off before any watchdog reset); enters the non-blocking main loop</w:t>
+      </w:r>
+      <w:proofErr w:type="spellStart"/>
+      <w:r/>
+      <w:proofErr w:type="spellEnd"/>
+      <w:r/>
+    </w:p>
+    <w:p>
+      <w:pPr>
+        <w:pStyle w:val="ListParagraph"/>
+        <w:numPr>
+          <w:ilvl w:val="0"/>
+          <w:numId w:val="2"/>
+        </w:numPr>
+        <w:spacing w:before="40" w:after="40"/>
+      </w:pPr>
+      <w:r/>
     </w:p>
     <w:p>
       <w:pPr>
@@ -3182,7 +3335,7 @@
           <w:sz w:val="18"/>
           <w:szCs w:val="18"/>
         </w:rPr>
-        <w:t xml:space="preserve">  ├─1─ _</w:t>
+        <w:t xml:space="preserve">  │</w:t>
       </w:r>
       <w:proofErr w:type="spellStart"/>
       <w:r>
@@ -3192,7 +3345,6 @@
           <w:sz w:val="18"/>
           <w:szCs w:val="18"/>
         </w:rPr>
-        <w:t>update_</w:t>
       </w:r>
       <w:proofErr w:type="gramStart"/>
       <w:r>
@@ -3202,7 +3354,6 @@
           <w:sz w:val="18"/>
           <w:szCs w:val="18"/>
         </w:rPr>
-        <w:t>runtime</w:t>
       </w:r>
       <w:proofErr w:type="spellEnd"/>
       <w:r>
@@ -3212,7 +3363,6 @@
           <w:sz w:val="18"/>
           <w:szCs w:val="18"/>
         </w:rPr>
-        <w:t>(</w:t>
       </w:r>
       <w:proofErr w:type="gramEnd"/>
       <w:r>
@@ -3222,7 +3372,6 @@
           <w:sz w:val="18"/>
           <w:szCs w:val="18"/>
         </w:rPr>
-        <w:t>)        ← always runs, even on safety stop</w:t>
       </w:r>
     </w:p>
     <w:p>
@@ -3238,7 +3387,7 @@
           <w:sz w:val="18"/>
           <w:szCs w:val="18"/>
         </w:rPr>
-        <w:t xml:space="preserve">  │     Accumulate pump-on seconds</w:t>
+        <w:t xml:space="preserve">  │</w:t>
       </w:r>
     </w:p>
     <w:p>
@@ -3254,7 +3403,7 @@
           <w:sz w:val="18"/>
           <w:szCs w:val="18"/>
         </w:rPr>
-        <w:t xml:space="preserve">  │     Reset daily counter at midnight</w:t>
+        <w:t xml:space="preserve">  │</w:t>
       </w:r>
     </w:p>
     <w:p>
@@ -4389,7 +4538,7 @@
           <w:sz w:val="18"/>
           <w:szCs w:val="18"/>
         </w:rPr>
-        <w:t xml:space="preserve">  └─5─ _</w:t>
+        <w:t xml:space="preserve">  └─5─ _check_publish()  ← 30 s (core hours) / 300 s (off-hours)</w:t>
       </w:r>
       <w:proofErr w:type="spellStart"/>
       <w:r>
@@ -4399,7 +4548,6 @@
           <w:sz w:val="18"/>
           <w:szCs w:val="18"/>
         </w:rPr>
-        <w:t>check_</w:t>
       </w:r>
       <w:proofErr w:type="gramStart"/>
       <w:r>
@@ -4409,7 +4557,6 @@
           <w:sz w:val="18"/>
           <w:szCs w:val="18"/>
         </w:rPr>
-        <w:t>publish</w:t>
       </w:r>
       <w:proofErr w:type="spellEnd"/>
       <w:r>
@@ -4419,7 +4566,6 @@
           <w:sz w:val="18"/>
           <w:szCs w:val="18"/>
         </w:rPr>
-        <w:t>(</w:t>
       </w:r>
       <w:proofErr w:type="gramEnd"/>
       <w:r>
@@ -4429,7 +4575,6 @@
           <w:sz w:val="18"/>
           <w:szCs w:val="18"/>
         </w:rPr>
-        <w:t>)         ← publish full state every 30 s</w:t>
       </w:r>
     </w:p>
     <w:p>
@@ -9472,32 +9617,20 @@
         <w:spacing w:before="80" w:after="120"/>
       </w:pPr>
       <w:r>
-        <w:t xml:space="preserve">If </w:t>
+        <w:t>If verify_or_rollback() detects a broken critical file after an OTA update, it restores all .bak files and reboots. This is fully automatic — no physical access to the Pico is required. Critical files checked: main.py, state.py, ota.py, controller/controller.py, net/__init__.py, sensors/__init__.py.</w:t>
       </w:r>
       <w:proofErr w:type="spellStart"/>
-      <w:r>
-        <w:t>verify_or_</w:t>
-      </w:r>
+      <w:r/>
       <w:proofErr w:type="gramStart"/>
-      <w:r>
-        <w:t>rollback</w:t>
-      </w:r>
+      <w:r/>
       <w:proofErr w:type="spellEnd"/>
-      <w:r>
-        <w:t>(</w:t>
-      </w:r>
+      <w:r/>
       <w:proofErr w:type="gramEnd"/>
-      <w:r>
-        <w:t>) detects a broken critical file after an OTA update, it restores all .</w:t>
-      </w:r>
+      <w:r/>
       <w:proofErr w:type="spellStart"/>
-      <w:r>
-        <w:t>bak</w:t>
-      </w:r>
+      <w:r/>
       <w:proofErr w:type="spellEnd"/>
-      <w:r>
-        <w:t xml:space="preserve"> files and reboots. This is fully automatic — no physical access to the Pico is required. Critical files checked: main.py, state.py, ota.py, controller/controller.py, network/__init__.py, sensors/__init__.py.</w:t>
-      </w:r>
+      <w:r/>
     </w:p>
     <w:p>
       <w:pPr>
@@ -10155,7 +10288,7 @@
               <w:bottom w:val="single" w:sz="1" w:space="0" w:color="CCCCCC"/>
               <w:right w:val="single" w:sz="1" w:space="0" w:color="CCCCCC"/>
             </w:tcBorders>
-            <w:shd w:val="clear" w:color="auto" w:fill="F2F2F2"/>
+            <w:shd w:val="clear" w:color="auto" w:fill="FFFFFF"/>
             <w:tcMar>
               <w:top w:w="80" w:type="dxa"/>
               <w:left w:w="120" w:type="dxa"/>
@@ -10171,7 +10304,7 @@
                 <w:sz w:val="18"/>
                 <w:szCs w:val="18"/>
               </w:rPr>
-              <w:t>daily_runtime_sec</w:t>
+              <w:t>last_pump_run</w:t>
             </w:r>
             <w:proofErr w:type="spellEnd"/>
           </w:p>
@@ -10185,21 +10318,21 @@
               <w:bottom w:val="single" w:sz="1" w:space="0" w:color="CCCCCC"/>
               <w:right w:val="single" w:sz="1" w:space="0" w:color="CCCCCC"/>
             </w:tcBorders>
-            <w:shd w:val="clear" w:color="auto" w:fill="F2F2F2"/>
-            <w:tcMar>
-              <w:top w:w="80" w:type="dxa"/>
-              <w:left w:w="120" w:type="dxa"/>
-              <w:bottom w:w="80" w:type="dxa"/>
-              <w:right w:w="120" w:type="dxa"/>
-            </w:tcMar>
-          </w:tcPr>
-          <w:p>
-            <w:r>
-              <w:rPr>
-                <w:sz w:val="18"/>
-                <w:szCs w:val="18"/>
-              </w:rPr>
-              <w:t>0</w:t>
+            <w:shd w:val="clear" w:color="auto" w:fill="FFFFFF"/>
+            <w:tcMar>
+              <w:top w:w="80" w:type="dxa"/>
+              <w:left w:w="120" w:type="dxa"/>
+              <w:bottom w:w="80" w:type="dxa"/>
+              <w:right w:w="120" w:type="dxa"/>
+            </w:tcMar>
+          </w:tcPr>
+          <w:p>
+            <w:r>
+              <w:rPr>
+                <w:sz w:val="18"/>
+                <w:szCs w:val="18"/>
+              </w:rPr>
+              <w:t>None</w:t>
             </w:r>
           </w:p>
         </w:tc>
@@ -10212,21 +10345,21 @@
               <w:bottom w:val="single" w:sz="1" w:space="0" w:color="CCCCCC"/>
               <w:right w:val="single" w:sz="1" w:space="0" w:color="CCCCCC"/>
             </w:tcBorders>
-            <w:shd w:val="clear" w:color="auto" w:fill="F2F2F2"/>
-            <w:tcMar>
-              <w:top w:w="80" w:type="dxa"/>
-              <w:left w:w="120" w:type="dxa"/>
-              <w:bottom w:w="80" w:type="dxa"/>
-              <w:right w:w="120" w:type="dxa"/>
-            </w:tcMar>
-          </w:tcPr>
-          <w:p>
-            <w:r>
-              <w:rPr>
-                <w:sz w:val="18"/>
-                <w:szCs w:val="18"/>
-              </w:rPr>
-              <w:t>Pump-on seconds today (resets at midnight)</w:t>
+            <w:shd w:val="clear" w:color="auto" w:fill="FFFFFF"/>
+            <w:tcMar>
+              <w:top w:w="80" w:type="dxa"/>
+              <w:left w:w="120" w:type="dxa"/>
+              <w:bottom w:w="80" w:type="dxa"/>
+              <w:right w:w="120" w:type="dxa"/>
+            </w:tcMar>
+          </w:tcPr>
+          <w:p>
+            <w:r>
+              <w:rPr>
+                <w:sz w:val="18"/>
+                <w:szCs w:val="18"/>
+              </w:rPr>
+              <w:t>Timestamp of last pump activation</w:t>
             </w:r>
           </w:p>
         </w:tc>
@@ -10339,23 +10472,25 @@
               <w:bottom w:val="single" w:sz="1" w:space="0" w:color="CCCCCC"/>
               <w:right w:val="single" w:sz="1" w:space="0" w:color="CCCCCC"/>
             </w:tcBorders>
-            <w:shd w:val="clear" w:color="auto" w:fill="F2F2F2"/>
-            <w:tcMar>
-              <w:top w:w="80" w:type="dxa"/>
-              <w:left w:w="120" w:type="dxa"/>
-              <w:bottom w:w="80" w:type="dxa"/>
-              <w:right w:w="120" w:type="dxa"/>
-            </w:tcMar>
-          </w:tcPr>
-          <w:p>
+            <w:shd w:val="clear" w:color="auto" w:fill="FFFFFF"/>
+            <w:tcMar>
+              <w:top w:w="80" w:type="dxa"/>
+              <w:left w:w="120" w:type="dxa"/>
+              <w:bottom w:w="80" w:type="dxa"/>
+              <w:right w:w="120" w:type="dxa"/>
+            </w:tcMar>
+          </w:tcPr>
+          <w:p>
+            <w:proofErr w:type="spellStart"/>
             <w:r>
               <w:rPr>
                 <w:rFonts w:ascii="Courier New" w:eastAsia="Courier New" w:hAnsi="Courier New" w:cs="Courier New"/>
                 <w:sz w:val="18"/>
                 <w:szCs w:val="18"/>
               </w:rPr>
-              <w:t>temps</w:t>
-            </w:r>
+              <w:t>delta_t</w:t>
+            </w:r>
+            <w:proofErr w:type="spellEnd"/>
           </w:p>
         </w:tc>
         <w:tc>
@@ -10367,21 +10502,21 @@
               <w:bottom w:val="single" w:sz="1" w:space="0" w:color="CCCCCC"/>
               <w:right w:val="single" w:sz="1" w:space="0" w:color="CCCCCC"/>
             </w:tcBorders>
-            <w:shd w:val="clear" w:color="auto" w:fill="F2F2F2"/>
-            <w:tcMar>
-              <w:top w:w="80" w:type="dxa"/>
-              <w:left w:w="120" w:type="dxa"/>
-              <w:bottom w:w="80" w:type="dxa"/>
-              <w:right w:w="120" w:type="dxa"/>
-            </w:tcMar>
-          </w:tcPr>
-          <w:p>
-            <w:r>
-              <w:rPr>
-                <w:sz w:val="18"/>
-                <w:szCs w:val="18"/>
-              </w:rPr>
-              <w:t>{}</w:t>
+            <w:shd w:val="clear" w:color="auto" w:fill="FFFFFF"/>
+            <w:tcMar>
+              <w:top w:w="80" w:type="dxa"/>
+              <w:left w:w="120" w:type="dxa"/>
+              <w:bottom w:w="80" w:type="dxa"/>
+              <w:right w:w="120" w:type="dxa"/>
+            </w:tcMar>
+          </w:tcPr>
+          <w:p>
+            <w:r>
+              <w:rPr>
+                <w:sz w:val="18"/>
+                <w:szCs w:val="18"/>
+              </w:rPr>
+              <w:t>None</w:t>
             </w:r>
           </w:p>
         </w:tc>
@@ -10394,30 +10529,21 @@
               <w:bottom w:val="single" w:sz="1" w:space="0" w:color="CCCCCC"/>
               <w:right w:val="single" w:sz="1" w:space="0" w:color="CCCCCC"/>
             </w:tcBorders>
-            <w:shd w:val="clear" w:color="auto" w:fill="F2F2F2"/>
-            <w:tcMar>
-              <w:top w:w="80" w:type="dxa"/>
-              <w:left w:w="120" w:type="dxa"/>
-              <w:bottom w:w="80" w:type="dxa"/>
-              <w:right w:w="120" w:type="dxa"/>
-            </w:tcMar>
-          </w:tcPr>
-          <w:p>
-            <w:proofErr w:type="spellStart"/>
-            <w:r>
-              <w:rPr>
-                <w:sz w:val="18"/>
-                <w:szCs w:val="18"/>
-              </w:rPr>
-              <w:t>Dict</w:t>
-            </w:r>
-            <w:proofErr w:type="spellEnd"/>
-            <w:r>
-              <w:rPr>
-                <w:sz w:val="18"/>
-                <w:szCs w:val="18"/>
-              </w:rPr>
-              <w:t xml:space="preserve"> of label → temperature °C</w:t>
+            <w:shd w:val="clear" w:color="auto" w:fill="FFFFFF"/>
+            <w:tcMar>
+              <w:top w:w="80" w:type="dxa"/>
+              <w:left w:w="120" w:type="dxa"/>
+              <w:bottom w:w="80" w:type="dxa"/>
+              <w:right w:w="120" w:type="dxa"/>
+            </w:tcMar>
+          </w:tcPr>
+          <w:p>
+            <w:r>
+              <w:rPr>
+                <w:sz w:val="18"/>
+                <w:szCs w:val="18"/>
+              </w:rPr>
+              <w:t>tReturn − tFlow (°C), computed each loop; None when sensors absent</w:t>
             </w:r>
           </w:p>
         </w:tc>
@@ -10454,7 +10580,7 @@
                 <w:sz w:val="18"/>
                 <w:szCs w:val="18"/>
               </w:rPr>
-              <w:t>water_level_ok</w:t>
+              <w:t>last_test_ts</w:t>
             </w:r>
             <w:proofErr w:type="spellEnd"/>
           </w:p>
@@ -10482,7 +10608,7 @@
                 <w:sz w:val="18"/>
                 <w:szCs w:val="18"/>
               </w:rPr>
-              <w:t>False</w:t>
+              <w:t>None</w:t>
             </w:r>
           </w:p>
         </w:tc>
@@ -10509,7 +10635,7 @@
                 <w:sz w:val="18"/>
                 <w:szCs w:val="18"/>
               </w:rPr>
-              <w:t>FAIL-SAFE: False until sensor confirms wet</w:t>
+              <w:t>Timestamp when last periodic test completed</w:t>
             </w:r>
           </w:p>
         </w:tc>
@@ -10539,69 +10665,76 @@
             </w:tcMar>
           </w:tcPr>
           <w:p>
+            <w:r>
+              <w:rPr>
+                <w:rFonts w:ascii="Courier New" w:eastAsia="Courier New" w:hAnsi="Courier New" w:cs="Courier New"/>
+                <w:sz w:val="18"/>
+                <w:szCs w:val="18"/>
+              </w:rPr>
+              <w:t>temps</w:t>
+            </w:r>
+          </w:p>
+        </w:tc>
+        <w:tc>
+          <w:tcPr>
+            <w:tcW w:w="1440" w:type="dxa"/>
+            <w:tcBorders>
+              <w:top w:val="single" w:sz="1" w:space="0" w:color="CCCCCC"/>
+              <w:left w:val="single" w:sz="1" w:space="0" w:color="CCCCCC"/>
+              <w:bottom w:val="single" w:sz="1" w:space="0" w:color="CCCCCC"/>
+              <w:right w:val="single" w:sz="1" w:space="0" w:color="CCCCCC"/>
+            </w:tcBorders>
+            <w:shd w:val="clear" w:color="auto" w:fill="F2F2F2"/>
+            <w:tcMar>
+              <w:top w:w="80" w:type="dxa"/>
+              <w:left w:w="120" w:type="dxa"/>
+              <w:bottom w:w="80" w:type="dxa"/>
+              <w:right w:w="120" w:type="dxa"/>
+            </w:tcMar>
+          </w:tcPr>
+          <w:p>
+            <w:r>
+              <w:rPr>
+                <w:sz w:val="18"/>
+                <w:szCs w:val="18"/>
+              </w:rPr>
+              <w:t>{}</w:t>
+            </w:r>
+          </w:p>
+        </w:tc>
+        <w:tc>
+          <w:tcPr>
+            <w:tcW w:w="5220" w:type="dxa"/>
+            <w:tcBorders>
+              <w:top w:val="single" w:sz="1" w:space="0" w:color="CCCCCC"/>
+              <w:left w:val="single" w:sz="1" w:space="0" w:color="CCCCCC"/>
+              <w:bottom w:val="single" w:sz="1" w:space="0" w:color="CCCCCC"/>
+              <w:right w:val="single" w:sz="1" w:space="0" w:color="CCCCCC"/>
+            </w:tcBorders>
+            <w:shd w:val="clear" w:color="auto" w:fill="F2F2F2"/>
+            <w:tcMar>
+              <w:top w:w="80" w:type="dxa"/>
+              <w:left w:w="120" w:type="dxa"/>
+              <w:bottom w:w="80" w:type="dxa"/>
+              <w:right w:w="120" w:type="dxa"/>
+            </w:tcMar>
+          </w:tcPr>
+          <w:p>
             <w:proofErr w:type="spellStart"/>
             <w:r>
               <w:rPr>
-                <w:rFonts w:ascii="Courier New" w:eastAsia="Courier New" w:hAnsi="Courier New" w:cs="Courier New"/>
-                <w:sz w:val="18"/>
-                <w:szCs w:val="18"/>
-              </w:rPr>
-              <w:t>sensors_ok</w:t>
+                <w:sz w:val="18"/>
+                <w:szCs w:val="18"/>
+              </w:rPr>
+              <w:t>Dict</w:t>
             </w:r>
             <w:proofErr w:type="spellEnd"/>
-          </w:p>
-        </w:tc>
-        <w:tc>
-          <w:tcPr>
-            <w:tcW w:w="1440" w:type="dxa"/>
-            <w:tcBorders>
-              <w:top w:val="single" w:sz="1" w:space="0" w:color="CCCCCC"/>
-              <w:left w:val="single" w:sz="1" w:space="0" w:color="CCCCCC"/>
-              <w:bottom w:val="single" w:sz="1" w:space="0" w:color="CCCCCC"/>
-              <w:right w:val="single" w:sz="1" w:space="0" w:color="CCCCCC"/>
-            </w:tcBorders>
-            <w:shd w:val="clear" w:color="auto" w:fill="F2F2F2"/>
-            <w:tcMar>
-              <w:top w:w="80" w:type="dxa"/>
-              <w:left w:w="120" w:type="dxa"/>
-              <w:bottom w:w="80" w:type="dxa"/>
-              <w:right w:w="120" w:type="dxa"/>
-            </w:tcMar>
-          </w:tcPr>
-          <w:p>
-            <w:r>
-              <w:rPr>
-                <w:sz w:val="18"/>
-                <w:szCs w:val="18"/>
-              </w:rPr>
-              <w:t>False</w:t>
-            </w:r>
-          </w:p>
-        </w:tc>
-        <w:tc>
-          <w:tcPr>
-            <w:tcW w:w="5220" w:type="dxa"/>
-            <w:tcBorders>
-              <w:top w:val="single" w:sz="1" w:space="0" w:color="CCCCCC"/>
-              <w:left w:val="single" w:sz="1" w:space="0" w:color="CCCCCC"/>
-              <w:bottom w:val="single" w:sz="1" w:space="0" w:color="CCCCCC"/>
-              <w:right w:val="single" w:sz="1" w:space="0" w:color="CCCCCC"/>
-            </w:tcBorders>
-            <w:shd w:val="clear" w:color="auto" w:fill="F2F2F2"/>
-            <w:tcMar>
-              <w:top w:w="80" w:type="dxa"/>
-              <w:left w:w="120" w:type="dxa"/>
-              <w:bottom w:w="80" w:type="dxa"/>
-              <w:right w:w="120" w:type="dxa"/>
-            </w:tcMar>
-          </w:tcPr>
-          <w:p>
-            <w:r>
-              <w:rPr>
-                <w:sz w:val="18"/>
-                <w:szCs w:val="18"/>
-              </w:rPr>
-              <w:t>FAIL-SAFE: False until all sensors report</w:t>
+            <w:r>
+              <w:rPr>
+                <w:sz w:val="18"/>
+                <w:szCs w:val="18"/>
+              </w:rPr>
+              <w:t xml:space="preserve"> of label → temperature °C</w:t>
             </w:r>
           </w:p>
         </w:tc>
@@ -10638,7 +10771,7 @@
                 <w:sz w:val="18"/>
                 <w:szCs w:val="18"/>
               </w:rPr>
-              <w:t>disconnected_sensors</w:t>
+              <w:t>water_level_ok</w:t>
             </w:r>
             <w:proofErr w:type="spellEnd"/>
           </w:p>
@@ -10666,7 +10799,7 @@
                 <w:sz w:val="18"/>
                 <w:szCs w:val="18"/>
               </w:rPr>
-              <w:t>[]</w:t>
+              <w:t>False</w:t>
             </w:r>
           </w:p>
         </w:tc>
@@ -10693,7 +10826,7 @@
                 <w:sz w:val="18"/>
                 <w:szCs w:val="18"/>
               </w:rPr>
-              <w:t>Labels of sensors that failed last read</w:t>
+              <w:t>FAIL-SAFE: False until sensor confirms wet</w:t>
             </w:r>
           </w:p>
         </w:tc>
@@ -10730,7 +10863,7 @@
                 <w:sz w:val="18"/>
                 <w:szCs w:val="18"/>
               </w:rPr>
-              <w:t>wifi_connected</w:t>
+              <w:t>sensors_ok</w:t>
             </w:r>
             <w:proofErr w:type="spellEnd"/>
           </w:p>
@@ -10780,21 +10913,12 @@
             </w:tcMar>
           </w:tcPr>
           <w:p>
-            <w:proofErr w:type="spellStart"/>
-            <w:r>
-              <w:rPr>
-                <w:sz w:val="18"/>
-                <w:szCs w:val="18"/>
-              </w:rPr>
-              <w:t>WiFi</w:t>
-            </w:r>
-            <w:proofErr w:type="spellEnd"/>
-            <w:r>
-              <w:rPr>
-                <w:sz w:val="18"/>
-                <w:szCs w:val="18"/>
-              </w:rPr>
-              <w:t xml:space="preserve"> connection state</w:t>
+            <w:r>
+              <w:rPr>
+                <w:sz w:val="18"/>
+                <w:szCs w:val="18"/>
+              </w:rPr>
+              <w:t>FAIL-SAFE: False until all sensors report</w:t>
             </w:r>
           </w:p>
         </w:tc>
@@ -10831,7 +10955,7 @@
                 <w:sz w:val="18"/>
                 <w:szCs w:val="18"/>
               </w:rPr>
-              <w:t>mqtt_connected</w:t>
+              <w:t>disconnected_sensors</w:t>
             </w:r>
             <w:proofErr w:type="spellEnd"/>
           </w:p>
@@ -10859,7 +10983,7 @@
                 <w:sz w:val="18"/>
                 <w:szCs w:val="18"/>
               </w:rPr>
-              <w:t>False</w:t>
+              <w:t>[]</w:t>
             </w:r>
           </w:p>
         </w:tc>
@@ -10886,7 +11010,7 @@
                 <w:sz w:val="18"/>
                 <w:szCs w:val="18"/>
               </w:rPr>
-              <w:t>MQTT connection state</w:t>
+              <w:t>Labels of sensors that failed last read</w:t>
             </w:r>
           </w:p>
         </w:tc>
@@ -10923,7 +11047,7 @@
                 <w:sz w:val="18"/>
                 <w:szCs w:val="18"/>
               </w:rPr>
-              <w:t>overtemp_shutdown</w:t>
+              <w:t>wifi_connected</w:t>
             </w:r>
             <w:proofErr w:type="spellEnd"/>
           </w:p>
@@ -10973,12 +11097,21 @@
             </w:tcMar>
           </w:tcPr>
           <w:p>
-            <w:r>
-              <w:rPr>
-                <w:sz w:val="18"/>
-                <w:szCs w:val="18"/>
-              </w:rPr>
-              <w:t>Enclosure temperature exceeded limit</w:t>
+            <w:proofErr w:type="spellStart"/>
+            <w:r>
+              <w:rPr>
+                <w:sz w:val="18"/>
+                <w:szCs w:val="18"/>
+              </w:rPr>
+              <w:t>WiFi</w:t>
+            </w:r>
+            <w:proofErr w:type="spellEnd"/>
+            <w:r>
+              <w:rPr>
+                <w:sz w:val="18"/>
+                <w:szCs w:val="18"/>
+              </w:rPr>
+              <w:t xml:space="preserve"> connection state</w:t>
             </w:r>
           </w:p>
         </w:tc>
@@ -11015,7 +11148,7 @@
                 <w:sz w:val="18"/>
                 <w:szCs w:val="18"/>
               </w:rPr>
-              <w:t>dry_run_protect</w:t>
+              <w:t>mqtt_connected</w:t>
             </w:r>
             <w:proofErr w:type="spellEnd"/>
           </w:p>
@@ -11070,7 +11203,7 @@
                 <w:sz w:val="18"/>
                 <w:szCs w:val="18"/>
               </w:rPr>
-              <w:t>Pump stopped due to low water level</w:t>
+              <w:t>MQTT connection state</w:t>
             </w:r>
           </w:p>
         </w:tc>
@@ -11091,7 +11224,7 @@
               <w:bottom w:val="single" w:sz="1" w:space="0" w:color="CCCCCC"/>
               <w:right w:val="single" w:sz="1" w:space="0" w:color="CCCCCC"/>
             </w:tcBorders>
-            <w:shd w:val="clear" w:color="auto" w:fill="F2F2F2"/>
+            <w:shd w:val="clear" w:color="auto" w:fill="FFFFFF"/>
             <w:tcMar>
               <w:top w:w="80" w:type="dxa"/>
               <w:left w:w="120" w:type="dxa"/>
@@ -11107,7 +11240,7 @@
                 <w:sz w:val="18"/>
                 <w:szCs w:val="18"/>
               </w:rPr>
-              <w:t>enclosure_sensor_missing</w:t>
+              <w:t>time_synced</w:t>
             </w:r>
             <w:proofErr w:type="spellEnd"/>
           </w:p>
@@ -11121,7 +11254,7 @@
               <w:bottom w:val="single" w:sz="1" w:space="0" w:color="CCCCCC"/>
               <w:right w:val="single" w:sz="1" w:space="0" w:color="CCCCCC"/>
             </w:tcBorders>
-            <w:shd w:val="clear" w:color="auto" w:fill="F2F2F2"/>
+            <w:shd w:val="clear" w:color="auto" w:fill="FFFFFF"/>
             <w:tcMar>
               <w:top w:w="80" w:type="dxa"/>
               <w:left w:w="120" w:type="dxa"/>
@@ -11148,37 +11281,21 @@
               <w:bottom w:val="single" w:sz="1" w:space="0" w:color="CCCCCC"/>
               <w:right w:val="single" w:sz="1" w:space="0" w:color="CCCCCC"/>
             </w:tcBorders>
-            <w:shd w:val="clear" w:color="auto" w:fill="F2F2F2"/>
-            <w:tcMar>
-              <w:top w:w="80" w:type="dxa"/>
-              <w:left w:w="120" w:type="dxa"/>
-              <w:bottom w:w="80" w:type="dxa"/>
-              <w:right w:w="120" w:type="dxa"/>
-            </w:tcMar>
-          </w:tcPr>
-          <w:p>
-            <w:r>
-              <w:rPr>
-                <w:sz w:val="18"/>
-                <w:szCs w:val="18"/>
-              </w:rPr>
-              <w:t xml:space="preserve">Enclosure sensor absent (distinct from </w:t>
-            </w:r>
-            <w:proofErr w:type="spellStart"/>
-            <w:r>
-              <w:rPr>
-                <w:sz w:val="18"/>
-                <w:szCs w:val="18"/>
-              </w:rPr>
-              <w:t>overtemp</w:t>
-            </w:r>
-            <w:proofErr w:type="spellEnd"/>
-            <w:r>
-              <w:rPr>
-                <w:sz w:val="18"/>
-                <w:szCs w:val="18"/>
-              </w:rPr>
-              <w:t>)</w:t>
+            <w:shd w:val="clear" w:color="auto" w:fill="FFFFFF"/>
+            <w:tcMar>
+              <w:top w:w="80" w:type="dxa"/>
+              <w:left w:w="120" w:type="dxa"/>
+              <w:bottom w:w="80" w:type="dxa"/>
+              <w:right w:w="120" w:type="dxa"/>
+            </w:tcMar>
+          </w:tcPr>
+          <w:p>
+            <w:r>
+              <w:rPr>
+                <w:sz w:val="18"/>
+                <w:szCs w:val="18"/>
+              </w:rPr>
+              <w:t>True after first successful NTP sync</w:t>
             </w:r>
           </w:p>
         </w:tc>
@@ -11215,7 +11332,7 @@
                 <w:sz w:val="18"/>
                 <w:szCs w:val="18"/>
               </w:rPr>
-              <w:t>critical_error</w:t>
+              <w:t>last_ntp_sync</w:t>
             </w:r>
             <w:proofErr w:type="spellEnd"/>
           </w:p>
@@ -11243,7 +11360,7 @@
                 <w:sz w:val="18"/>
                 <w:szCs w:val="18"/>
               </w:rPr>
-              <w:t>False</w:t>
+              <w:t>None</w:t>
             </w:r>
           </w:p>
         </w:tc>
@@ -11270,7 +11387,7 @@
                 <w:sz w:val="18"/>
                 <w:szCs w:val="18"/>
               </w:rPr>
-              <w:t>Unrecoverable software error → LED critical pattern</w:t>
+              <w:t>Timestamp of last successful NTP sync</w:t>
             </w:r>
           </w:p>
         </w:tc>
@@ -11307,6 +11424,390 @@
                 <w:sz w:val="18"/>
                 <w:szCs w:val="18"/>
               </w:rPr>
+              <w:t>overtemp_shutdown</w:t>
+            </w:r>
+            <w:proofErr w:type="spellEnd"/>
+          </w:p>
+        </w:tc>
+        <w:tc>
+          <w:tcPr>
+            <w:tcW w:w="1440" w:type="dxa"/>
+            <w:tcBorders>
+              <w:top w:val="single" w:sz="1" w:space="0" w:color="CCCCCC"/>
+              <w:left w:val="single" w:sz="1" w:space="0" w:color="CCCCCC"/>
+              <w:bottom w:val="single" w:sz="1" w:space="0" w:color="CCCCCC"/>
+              <w:right w:val="single" w:sz="1" w:space="0" w:color="CCCCCC"/>
+            </w:tcBorders>
+            <w:shd w:val="clear" w:color="auto" w:fill="F2F2F2"/>
+            <w:tcMar>
+              <w:top w:w="80" w:type="dxa"/>
+              <w:left w:w="120" w:type="dxa"/>
+              <w:bottom w:w="80" w:type="dxa"/>
+              <w:right w:w="120" w:type="dxa"/>
+            </w:tcMar>
+          </w:tcPr>
+          <w:p>
+            <w:r>
+              <w:rPr>
+                <w:sz w:val="18"/>
+                <w:szCs w:val="18"/>
+              </w:rPr>
+              <w:t>False</w:t>
+            </w:r>
+          </w:p>
+        </w:tc>
+        <w:tc>
+          <w:tcPr>
+            <w:tcW w:w="5220" w:type="dxa"/>
+            <w:tcBorders>
+              <w:top w:val="single" w:sz="1" w:space="0" w:color="CCCCCC"/>
+              <w:left w:val="single" w:sz="1" w:space="0" w:color="CCCCCC"/>
+              <w:bottom w:val="single" w:sz="1" w:space="0" w:color="CCCCCC"/>
+              <w:right w:val="single" w:sz="1" w:space="0" w:color="CCCCCC"/>
+            </w:tcBorders>
+            <w:shd w:val="clear" w:color="auto" w:fill="F2F2F2"/>
+            <w:tcMar>
+              <w:top w:w="80" w:type="dxa"/>
+              <w:left w:w="120" w:type="dxa"/>
+              <w:bottom w:w="80" w:type="dxa"/>
+              <w:right w:w="120" w:type="dxa"/>
+            </w:tcMar>
+          </w:tcPr>
+          <w:p>
+            <w:r>
+              <w:rPr>
+                <w:sz w:val="18"/>
+                <w:szCs w:val="18"/>
+              </w:rPr>
+              <w:t>Enclosure temperature exceeded limit</w:t>
+            </w:r>
+          </w:p>
+        </w:tc>
+      </w:tr>
+      <w:tr>
+        <w:tblPrEx>
+          <w:tblCellMar>
+            <w:top w:w="0" w:type="dxa"/>
+            <w:bottom w:w="0" w:type="dxa"/>
+          </w:tblCellMar>
+        </w:tblPrEx>
+        <w:tc>
+          <w:tcPr>
+            <w:tcW w:w="2700" w:type="dxa"/>
+            <w:tcBorders>
+              <w:top w:val="single" w:sz="1" w:space="0" w:color="CCCCCC"/>
+              <w:left w:val="single" w:sz="1" w:space="0" w:color="CCCCCC"/>
+              <w:bottom w:val="single" w:sz="1" w:space="0" w:color="CCCCCC"/>
+              <w:right w:val="single" w:sz="1" w:space="0" w:color="CCCCCC"/>
+            </w:tcBorders>
+            <w:shd w:val="clear" w:color="auto" w:fill="FFFFFF"/>
+            <w:tcMar>
+              <w:top w:w="80" w:type="dxa"/>
+              <w:left w:w="120" w:type="dxa"/>
+              <w:bottom w:w="80" w:type="dxa"/>
+              <w:right w:w="120" w:type="dxa"/>
+            </w:tcMar>
+          </w:tcPr>
+          <w:p>
+            <w:proofErr w:type="spellStart"/>
+            <w:r>
+              <w:rPr>
+                <w:rFonts w:ascii="Courier New" w:eastAsia="Courier New" w:hAnsi="Courier New" w:cs="Courier New"/>
+                <w:sz w:val="18"/>
+                <w:szCs w:val="18"/>
+              </w:rPr>
+              <w:t>dry_run_protect</w:t>
+            </w:r>
+            <w:proofErr w:type="spellEnd"/>
+          </w:p>
+        </w:tc>
+        <w:tc>
+          <w:tcPr>
+            <w:tcW w:w="1440" w:type="dxa"/>
+            <w:tcBorders>
+              <w:top w:val="single" w:sz="1" w:space="0" w:color="CCCCCC"/>
+              <w:left w:val="single" w:sz="1" w:space="0" w:color="CCCCCC"/>
+              <w:bottom w:val="single" w:sz="1" w:space="0" w:color="CCCCCC"/>
+              <w:right w:val="single" w:sz="1" w:space="0" w:color="CCCCCC"/>
+            </w:tcBorders>
+            <w:shd w:val="clear" w:color="auto" w:fill="FFFFFF"/>
+            <w:tcMar>
+              <w:top w:w="80" w:type="dxa"/>
+              <w:left w:w="120" w:type="dxa"/>
+              <w:bottom w:w="80" w:type="dxa"/>
+              <w:right w:w="120" w:type="dxa"/>
+            </w:tcMar>
+          </w:tcPr>
+          <w:p>
+            <w:r>
+              <w:rPr>
+                <w:sz w:val="18"/>
+                <w:szCs w:val="18"/>
+              </w:rPr>
+              <w:t>False</w:t>
+            </w:r>
+          </w:p>
+        </w:tc>
+        <w:tc>
+          <w:tcPr>
+            <w:tcW w:w="5220" w:type="dxa"/>
+            <w:tcBorders>
+              <w:top w:val="single" w:sz="1" w:space="0" w:color="CCCCCC"/>
+              <w:left w:val="single" w:sz="1" w:space="0" w:color="CCCCCC"/>
+              <w:bottom w:val="single" w:sz="1" w:space="0" w:color="CCCCCC"/>
+              <w:right w:val="single" w:sz="1" w:space="0" w:color="CCCCCC"/>
+            </w:tcBorders>
+            <w:shd w:val="clear" w:color="auto" w:fill="FFFFFF"/>
+            <w:tcMar>
+              <w:top w:w="80" w:type="dxa"/>
+              <w:left w:w="120" w:type="dxa"/>
+              <w:bottom w:w="80" w:type="dxa"/>
+              <w:right w:w="120" w:type="dxa"/>
+            </w:tcMar>
+          </w:tcPr>
+          <w:p>
+            <w:r>
+              <w:rPr>
+                <w:sz w:val="18"/>
+                <w:szCs w:val="18"/>
+              </w:rPr>
+              <w:t>Pump stopped due to low water level</w:t>
+            </w:r>
+          </w:p>
+        </w:tc>
+      </w:tr>
+      <w:tr>
+        <w:tblPrEx>
+          <w:tblCellMar>
+            <w:top w:w="0" w:type="dxa"/>
+            <w:bottom w:w="0" w:type="dxa"/>
+          </w:tblCellMar>
+        </w:tblPrEx>
+        <w:tc>
+          <w:tcPr>
+            <w:tcW w:w="2700" w:type="dxa"/>
+            <w:tcBorders>
+              <w:top w:val="single" w:sz="1" w:space="0" w:color="CCCCCC"/>
+              <w:left w:val="single" w:sz="1" w:space="0" w:color="CCCCCC"/>
+              <w:bottom w:val="single" w:sz="1" w:space="0" w:color="CCCCCC"/>
+              <w:right w:val="single" w:sz="1" w:space="0" w:color="CCCCCC"/>
+            </w:tcBorders>
+            <w:shd w:val="clear" w:color="auto" w:fill="F2F2F2"/>
+            <w:tcMar>
+              <w:top w:w="80" w:type="dxa"/>
+              <w:left w:w="120" w:type="dxa"/>
+              <w:bottom w:w="80" w:type="dxa"/>
+              <w:right w:w="120" w:type="dxa"/>
+            </w:tcMar>
+          </w:tcPr>
+          <w:p>
+            <w:proofErr w:type="spellStart"/>
+            <w:r>
+              <w:rPr>
+                <w:rFonts w:ascii="Courier New" w:eastAsia="Courier New" w:hAnsi="Courier New" w:cs="Courier New"/>
+                <w:sz w:val="18"/>
+                <w:szCs w:val="18"/>
+              </w:rPr>
+              <w:t>enclosure_sensor_missing</w:t>
+            </w:r>
+            <w:proofErr w:type="spellEnd"/>
+          </w:p>
+        </w:tc>
+        <w:tc>
+          <w:tcPr>
+            <w:tcW w:w="1440" w:type="dxa"/>
+            <w:tcBorders>
+              <w:top w:val="single" w:sz="1" w:space="0" w:color="CCCCCC"/>
+              <w:left w:val="single" w:sz="1" w:space="0" w:color="CCCCCC"/>
+              <w:bottom w:val="single" w:sz="1" w:space="0" w:color="CCCCCC"/>
+              <w:right w:val="single" w:sz="1" w:space="0" w:color="CCCCCC"/>
+            </w:tcBorders>
+            <w:shd w:val="clear" w:color="auto" w:fill="F2F2F2"/>
+            <w:tcMar>
+              <w:top w:w="80" w:type="dxa"/>
+              <w:left w:w="120" w:type="dxa"/>
+              <w:bottom w:w="80" w:type="dxa"/>
+              <w:right w:w="120" w:type="dxa"/>
+            </w:tcMar>
+          </w:tcPr>
+          <w:p>
+            <w:r>
+              <w:rPr>
+                <w:sz w:val="18"/>
+                <w:szCs w:val="18"/>
+              </w:rPr>
+              <w:t>False</w:t>
+            </w:r>
+          </w:p>
+        </w:tc>
+        <w:tc>
+          <w:tcPr>
+            <w:tcW w:w="5220" w:type="dxa"/>
+            <w:tcBorders>
+              <w:top w:val="single" w:sz="1" w:space="0" w:color="CCCCCC"/>
+              <w:left w:val="single" w:sz="1" w:space="0" w:color="CCCCCC"/>
+              <w:bottom w:val="single" w:sz="1" w:space="0" w:color="CCCCCC"/>
+              <w:right w:val="single" w:sz="1" w:space="0" w:color="CCCCCC"/>
+            </w:tcBorders>
+            <w:shd w:val="clear" w:color="auto" w:fill="F2F2F2"/>
+            <w:tcMar>
+              <w:top w:w="80" w:type="dxa"/>
+              <w:left w:w="120" w:type="dxa"/>
+              <w:bottom w:w="80" w:type="dxa"/>
+              <w:right w:w="120" w:type="dxa"/>
+            </w:tcMar>
+          </w:tcPr>
+          <w:p>
+            <w:r>
+              <w:rPr>
+                <w:sz w:val="18"/>
+                <w:szCs w:val="18"/>
+              </w:rPr>
+              <w:t xml:space="preserve">Enclosure sensor absent (distinct from </w:t>
+            </w:r>
+            <w:proofErr w:type="spellStart"/>
+            <w:r>
+              <w:rPr>
+                <w:sz w:val="18"/>
+                <w:szCs w:val="18"/>
+              </w:rPr>
+              <w:t>overtemp</w:t>
+            </w:r>
+            <w:proofErr w:type="spellEnd"/>
+            <w:r>
+              <w:rPr>
+                <w:sz w:val="18"/>
+                <w:szCs w:val="18"/>
+              </w:rPr>
+              <w:t>)</w:t>
+            </w:r>
+          </w:p>
+        </w:tc>
+      </w:tr>
+      <w:tr>
+        <w:tblPrEx>
+          <w:tblCellMar>
+            <w:top w:w="0" w:type="dxa"/>
+            <w:bottom w:w="0" w:type="dxa"/>
+          </w:tblCellMar>
+        </w:tblPrEx>
+        <w:tc>
+          <w:tcPr>
+            <w:tcW w:w="2700" w:type="dxa"/>
+            <w:tcBorders>
+              <w:top w:val="single" w:sz="1" w:space="0" w:color="CCCCCC"/>
+              <w:left w:val="single" w:sz="1" w:space="0" w:color="CCCCCC"/>
+              <w:bottom w:val="single" w:sz="1" w:space="0" w:color="CCCCCC"/>
+              <w:right w:val="single" w:sz="1" w:space="0" w:color="CCCCCC"/>
+            </w:tcBorders>
+            <w:shd w:val="clear" w:color="auto" w:fill="FFFFFF"/>
+            <w:tcMar>
+              <w:top w:w="80" w:type="dxa"/>
+              <w:left w:w="120" w:type="dxa"/>
+              <w:bottom w:w="80" w:type="dxa"/>
+              <w:right w:w="120" w:type="dxa"/>
+            </w:tcMar>
+          </w:tcPr>
+          <w:p>
+            <w:proofErr w:type="spellStart"/>
+            <w:r>
+              <w:rPr>
+                <w:rFonts w:ascii="Courier New" w:eastAsia="Courier New" w:hAnsi="Courier New" w:cs="Courier New"/>
+                <w:sz w:val="18"/>
+                <w:szCs w:val="18"/>
+              </w:rPr>
+              <w:t>critical_error</w:t>
+            </w:r>
+            <w:proofErr w:type="spellEnd"/>
+          </w:p>
+        </w:tc>
+        <w:tc>
+          <w:tcPr>
+            <w:tcW w:w="1440" w:type="dxa"/>
+            <w:tcBorders>
+              <w:top w:val="single" w:sz="1" w:space="0" w:color="CCCCCC"/>
+              <w:left w:val="single" w:sz="1" w:space="0" w:color="CCCCCC"/>
+              <w:bottom w:val="single" w:sz="1" w:space="0" w:color="CCCCCC"/>
+              <w:right w:val="single" w:sz="1" w:space="0" w:color="CCCCCC"/>
+            </w:tcBorders>
+            <w:shd w:val="clear" w:color="auto" w:fill="FFFFFF"/>
+            <w:tcMar>
+              <w:top w:w="80" w:type="dxa"/>
+              <w:left w:w="120" w:type="dxa"/>
+              <w:bottom w:w="80" w:type="dxa"/>
+              <w:right w:w="120" w:type="dxa"/>
+            </w:tcMar>
+          </w:tcPr>
+          <w:p>
+            <w:r>
+              <w:rPr>
+                <w:sz w:val="18"/>
+                <w:szCs w:val="18"/>
+              </w:rPr>
+              <w:t>False</w:t>
+            </w:r>
+          </w:p>
+        </w:tc>
+        <w:tc>
+          <w:tcPr>
+            <w:tcW w:w="5220" w:type="dxa"/>
+            <w:tcBorders>
+              <w:top w:val="single" w:sz="1" w:space="0" w:color="CCCCCC"/>
+              <w:left w:val="single" w:sz="1" w:space="0" w:color="CCCCCC"/>
+              <w:bottom w:val="single" w:sz="1" w:space="0" w:color="CCCCCC"/>
+              <w:right w:val="single" w:sz="1" w:space="0" w:color="CCCCCC"/>
+            </w:tcBorders>
+            <w:shd w:val="clear" w:color="auto" w:fill="FFFFFF"/>
+            <w:tcMar>
+              <w:top w:w="80" w:type="dxa"/>
+              <w:left w:w="120" w:type="dxa"/>
+              <w:bottom w:w="80" w:type="dxa"/>
+              <w:right w:w="120" w:type="dxa"/>
+            </w:tcMar>
+          </w:tcPr>
+          <w:p>
+            <w:r>
+              <w:rPr>
+                <w:sz w:val="18"/>
+                <w:szCs w:val="18"/>
+              </w:rPr>
+              <w:t>Unrecoverable software error → LED critical pattern</w:t>
+            </w:r>
+          </w:p>
+        </w:tc>
+      </w:tr>
+      <w:tr>
+        <w:tblPrEx>
+          <w:tblCellMar>
+            <w:top w:w="0" w:type="dxa"/>
+            <w:bottom w:w="0" w:type="dxa"/>
+          </w:tblCellMar>
+        </w:tblPrEx>
+        <w:tc>
+          <w:tcPr>
+            <w:tcW w:w="2700" w:type="dxa"/>
+            <w:tcBorders>
+              <w:top w:val="single" w:sz="1" w:space="0" w:color="CCCCCC"/>
+              <w:left w:val="single" w:sz="1" w:space="0" w:color="CCCCCC"/>
+              <w:bottom w:val="single" w:sz="1" w:space="0" w:color="CCCCCC"/>
+              <w:right w:val="single" w:sz="1" w:space="0" w:color="CCCCCC"/>
+            </w:tcBorders>
+            <w:shd w:val="clear" w:color="auto" w:fill="F2F2F2"/>
+            <w:tcMar>
+              <w:top w:w="80" w:type="dxa"/>
+              <w:left w:w="120" w:type="dxa"/>
+              <w:bottom w:w="80" w:type="dxa"/>
+              <w:right w:w="120" w:type="dxa"/>
+            </w:tcMar>
+          </w:tcPr>
+          <w:p>
+            <w:proofErr w:type="spellStart"/>
+            <w:r>
+              <w:rPr>
+                <w:rFonts w:ascii="Courier New" w:eastAsia="Courier New" w:hAnsi="Courier New" w:cs="Courier New"/>
+                <w:sz w:val="18"/>
+                <w:szCs w:val="18"/>
+              </w:rPr>
               <w:t>ota_pending</w:t>
             </w:r>
             <w:proofErr w:type="spellEnd"/>
@@ -11363,6 +11864,98 @@
                 <w:szCs w:val="18"/>
               </w:rPr>
               <w:t>Set True by MQTT to trigger OTA check</w:t>
+            </w:r>
+          </w:p>
+        </w:tc>
+      </w:tr>
+      <w:tr>
+        <w:tblPrEx>
+          <w:tblCellMar>
+            <w:top w:w="0" w:type="dxa"/>
+            <w:bottom w:w="0" w:type="dxa"/>
+          </w:tblCellMar>
+        </w:tblPrEx>
+        <w:tc>
+          <w:tcPr>
+            <w:tcW w:w="2700" w:type="dxa"/>
+            <w:tcBorders>
+              <w:top w:val="single" w:sz="1" w:space="0" w:color="CCCCCC"/>
+              <w:left w:val="single" w:sz="1" w:space="0" w:color="CCCCCC"/>
+              <w:bottom w:val="single" w:sz="1" w:space="0" w:color="CCCCCC"/>
+              <w:right w:val="single" w:sz="1" w:space="0" w:color="CCCCCC"/>
+            </w:tcBorders>
+            <w:shd w:val="clear" w:color="auto" w:fill="F2F2F2"/>
+            <w:tcMar>
+              <w:top w:w="80" w:type="dxa"/>
+              <w:left w:w="120" w:type="dxa"/>
+              <w:bottom w:w="80" w:type="dxa"/>
+              <w:right w:w="120" w:type="dxa"/>
+            </w:tcMar>
+          </w:tcPr>
+          <w:p>
+            <w:proofErr w:type="spellStart"/>
+            <w:r>
+              <w:rPr>
+                <w:rFonts w:ascii="Courier New" w:eastAsia="Courier New" w:hAnsi="Courier New" w:cs="Courier New"/>
+                <w:sz w:val="18"/>
+                <w:szCs w:val="18"/>
+              </w:rPr>
+              <w:t>fw_version</w:t>
+            </w:r>
+            <w:proofErr w:type="spellEnd"/>
+          </w:p>
+        </w:tc>
+        <w:tc>
+          <w:tcPr>
+            <w:tcW w:w="1440" w:type="dxa"/>
+            <w:tcBorders>
+              <w:top w:val="single" w:sz="1" w:space="0" w:color="CCCCCC"/>
+              <w:left w:val="single" w:sz="1" w:space="0" w:color="CCCCCC"/>
+              <w:bottom w:val="single" w:sz="1" w:space="0" w:color="CCCCCC"/>
+              <w:right w:val="single" w:sz="1" w:space="0" w:color="CCCCCC"/>
+            </w:tcBorders>
+            <w:shd w:val="clear" w:color="auto" w:fill="F2F2F2"/>
+            <w:tcMar>
+              <w:top w:w="80" w:type="dxa"/>
+              <w:left w:w="120" w:type="dxa"/>
+              <w:bottom w:w="80" w:type="dxa"/>
+              <w:right w:w="120" w:type="dxa"/>
+            </w:tcMar>
+          </w:tcPr>
+          <w:p>
+            <w:r>
+              <w:rPr>
+                <w:sz w:val="18"/>
+                <w:szCs w:val="18"/>
+              </w:rPr>
+              <w:t>"unknown"</w:t>
+            </w:r>
+          </w:p>
+        </w:tc>
+        <w:tc>
+          <w:tcPr>
+            <w:tcW w:w="5220" w:type="dxa"/>
+            <w:tcBorders>
+              <w:top w:val="single" w:sz="1" w:space="0" w:color="CCCCCC"/>
+              <w:left w:val="single" w:sz="1" w:space="0" w:color="CCCCCC"/>
+              <w:bottom w:val="single" w:sz="1" w:space="0" w:color="CCCCCC"/>
+              <w:right w:val="single" w:sz="1" w:space="0" w:color="CCCCCC"/>
+            </w:tcBorders>
+            <w:shd w:val="clear" w:color="auto" w:fill="F2F2F2"/>
+            <w:tcMar>
+              <w:top w:w="80" w:type="dxa"/>
+              <w:left w:w="120" w:type="dxa"/>
+              <w:bottom w:w="80" w:type="dxa"/>
+              <w:right w:w="120" w:type="dxa"/>
+            </w:tcMar>
+          </w:tcPr>
+          <w:p>
+            <w:r>
+              <w:rPr>
+                <w:sz w:val="18"/>
+                <w:szCs w:val="18"/>
+              </w:rPr>
+              <w:t>Bundle version string from manifest.json, populated at boot; published in debug feed</w:t>
             </w:r>
           </w:p>
         </w:tc>
@@ -20330,7 +20923,7 @@
                 <w:sz w:val="20"/>
                 <w:szCs w:val="20"/>
               </w:rPr>
-              <w:t>Pump relay wired to GPIO 5, verified with a test run</w:t>
+              <w:t>Pump relay wired to GPIO 16, verified with a test run</w:t>
             </w:r>
           </w:p>
         </w:tc>
@@ -20388,7 +20981,7 @@
                 <w:sz w:val="20"/>
                 <w:szCs w:val="20"/>
               </w:rPr>
-              <w:t>Status LED wired to GPIO 6 and visible</w:t>
+              <w:t>Status LED uses Pico W onboard LED (PIN_LED = "LED") — verify heartbeat blink at boot</w:t>
             </w:r>
           </w:p>
         </w:tc>
@@ -20446,7 +21039,7 @@
                 <w:sz w:val="20"/>
                 <w:szCs w:val="20"/>
               </w:rPr>
-              <w:t>Manual boost button wired to GPIO 10 with pull-up confirmed</w:t>
+              <w:t>Manual boost button wired to GPIO 3 with pull-up confirmed</w:t>
             </w:r>
           </w:p>
         </w:tc>
@@ -20481,7 +21074,7 @@
           <w:sz w:val="18"/>
           <w:szCs w:val="18"/>
         </w:rPr>
-        <w:t xml:space="preserve">Solar Pool Heating </w:t>
+        <w:t>Solar Pool Heating Controller  |  v1.2.1  |  Generated by Claude Sonnet</w:t>
       </w:r>
       <w:proofErr w:type="gramStart"/>
       <w:r>
@@ -20490,7 +21083,6 @@
           <w:sz w:val="18"/>
           <w:szCs w:val="18"/>
         </w:rPr>
-        <w:t>Controller  |</w:t>
       </w:r>
       <w:proofErr w:type="gramEnd"/>
       <w:r>
@@ -20499,7 +21091,6 @@
           <w:sz w:val="18"/>
           <w:szCs w:val="18"/>
         </w:rPr>
-        <w:t xml:space="preserve">  </w:t>
       </w:r>
       <w:proofErr w:type="gramStart"/>
       <w:r>
@@ -20508,7 +21099,6 @@
           <w:sz w:val="18"/>
           <w:szCs w:val="18"/>
         </w:rPr>
-        <w:t>v2.1.0  |</w:t>
       </w:r>
       <w:proofErr w:type="gramEnd"/>
       <w:r>
@@ -20517,7 +21107,6 @@
           <w:sz w:val="18"/>
           <w:szCs w:val="18"/>
         </w:rPr>
-        <w:t xml:space="preserve">  </w:t>
       </w:r>
       <w:r>
         <w:rPr>
@@ -20527,7 +21116,6 @@
           <w:sz w:val="18"/>
           <w:szCs w:val="18"/>
         </w:rPr>
-        <w:t>Generated by Claude Sonnet</w:t>
       </w:r>
     </w:p>
     <w:sectPr>

</xml_diff>